<commit_message>
feat(rfqs): send RFQ requests by email with request history
Work-summary: Staff can email RFQ packs to suppliers and review what was sent.
Each send is recorded with recipients, documents, and delivery status.
Outbound email uses configurable templates and a production-ready provider path.
The RFQ detail screen adds a requests tab and batch detail for follow-up.
Contact selection on jobs is clearer when choosing who to send to.
Implementation notes and the RFQ Word template were updated to match the flow.

Estimated-hours: 7.5
Work-hours-logged: true
Work-stats: 51 files | +4504 -192 | Tier 2 standard / Tier 3 complex | Moderate orchestration
Lay-summary: Staff can email RFQ packs to suppliers and review what was sent, including generated documents and delivery status.
Co-authored-by: Cursor <cursoragent@cursor.com>
</commit_message>
<xml_diff>
--- a/data/templates/REQUEST FOR QUOTATION.docx
+++ b/data/templates/REQUEST FOR QUOTATION.docx
@@ -1,28 +1,34 @@
 
 <file path=word/document.xml><?xml version="1.0" encoding="utf-8"?>
-<w:document xmlns:wpc="http://schemas.microsoft.com/office/word/2010/wordprocessingCanvas" xmlns:cx="http://schemas.microsoft.com/office/drawing/2014/chartex" xmlns:cx1="http://schemas.microsoft.com/office/drawing/2015/9/8/chartex" xmlns:cx2="http://schemas.microsoft.com/office/drawing/2015/10/21/chartex" xmlns:cx3="http://schemas.microsoft.com/office/drawing/2016/5/9/chartex" xmlns:cx4="http://schemas.microsoft.com/office/drawing/2016/5/10/chartex" xmlns:cx5="http://schemas.microsoft.com/office/drawing/2016/5/11/chartex" xmlns:cx6="http://schemas.microsoft.com/office/drawing/2016/5/12/chartex" xmlns:cx7="http://schemas.microsoft.com/office/drawing/2016/5/13/chartex" xmlns:cx8="http://schemas.microsoft.com/office/drawing/2016/5/14/chartex" xmlns:mc="http://schemas.openxmlformats.org/markup-compatibility/2006" xmlns:m="http://schemas.openxmlformats.org/officeDocument/2006/math" xmlns:aink="http://schemas.microsoft.com/office/drawing/2016/ink" xmlns:am3d="http://schemas.microsoft.com/office/drawing/2017/model3d" xmlns:oel="http://schemas.microsoft.com/office/2019/extlst" xmlns:r="http://schemas.openxmlformats.org/officeDocument/2006/relationships" xmlns:wp14="http://schemas.microsoft.com/office/word/2010/wordprocessingDrawing" xmlns:wp="http://schemas.openxmlformats.org/drawingml/2006/wordprocessingDrawing" xmlns:wpg="http://schemas.microsoft.com/office/word/2010/wordprocessingGroup" xmlns:wpi="http://schemas.microsoft.com/office/word/2010/wordprocessingInk" xmlns:wps="http://schemas.microsoft.com/office/word/2010/wordprocessingShape" xmlns:o="urn:schemas-microsoft-com:office:office" xmlns:v="urn:schemas-microsoft-com:vml" xmlns:w10="urn:schemas-microsoft-com:office:word" xmlns:w="http://schemas.openxmlformats.org/wordprocessingml/2006/main" xmlns:w14="http://schemas.microsoft.com/office/word/2010/wordml" xmlns:w15="http://schemas.microsoft.com/office/word/2012/wordml" xmlns:w16cei="http://schemas.microsoft.com/office/word/2026/wordml/cei" xmlns:w16cex="http://schemas.microsoft.com/office/word/2018/wordml/cex" xmlns:w16cid="http://schemas.microsoft.com/office/word/2016/wordml/cid" xmlns:w16="http://schemas.microsoft.com/office/word/2018/wordml" xmlns:w16sdtdh="http://schemas.microsoft.com/office/word/2020/wordml/sdtdatahash" xmlns:w16sdtfl="http://schemas.microsoft.com/office/word/2024/wordml/sdtformatlock" xmlns:w16se="http://schemas.microsoft.com/office/word/2015/wordml/symex" xmlns:w16du="http://schemas.microsoft.com/office/word/2023/wordml/word16du" xmlns:wne="http://schemas.microsoft.com/office/word/2006/wordml" mc:Ignorable="w14 w15 w16se w16cid w16 w16cex w16sdtdh w16sdtfl w16du wp14">
+<w:document xmlns:wpc="http://schemas.microsoft.com/office/word/2010/wordprocessingCanvas" xmlns:cx="http://schemas.microsoft.com/office/drawing/2014/chartex" xmlns:cx1="http://schemas.microsoft.com/office/drawing/2015/9/8/chartex" xmlns:cx2="http://schemas.microsoft.com/office/drawing/2015/10/21/chartex" xmlns:cx3="http://schemas.microsoft.com/office/drawing/2016/5/9/chartex" xmlns:cx4="http://schemas.microsoft.com/office/drawing/2016/5/10/chartex" xmlns:cx5="http://schemas.microsoft.com/office/drawing/2016/5/11/chartex" xmlns:cx6="http://schemas.microsoft.com/office/drawing/2016/5/12/chartex" xmlns:cx7="http://schemas.microsoft.com/office/drawing/2016/5/13/chartex" xmlns:cx8="http://schemas.microsoft.com/office/drawing/2016/5/14/chartex" xmlns:mc="http://schemas.openxmlformats.org/markup-compatibility/2006" xmlns:aink="http://schemas.microsoft.com/office/drawing/2016/ink" xmlns:am3d="http://schemas.microsoft.com/office/drawing/2017/model3d" xmlns:o="urn:schemas-microsoft-com:office:office" xmlns:oel="http://schemas.microsoft.com/office/2019/extlst" xmlns:r="http://schemas.openxmlformats.org/officeDocument/2006/relationships" xmlns:m="http://schemas.openxmlformats.org/officeDocument/2006/math" xmlns:v="urn:schemas-microsoft-com:vml" xmlns:wp14="http://schemas.microsoft.com/office/word/2010/wordprocessingDrawing" xmlns:wp="http://schemas.openxmlformats.org/drawingml/2006/wordprocessingDrawing" xmlns:w10="urn:schemas-microsoft-com:office:word" xmlns:w="http://schemas.openxmlformats.org/wordprocessingml/2006/main" xmlns:w14="http://schemas.microsoft.com/office/word/2010/wordml" xmlns:w15="http://schemas.microsoft.com/office/word/2012/wordml" xmlns:w16cei="http://schemas.microsoft.com/office/word/2026/wordml/cei" xmlns:w16cex="http://schemas.microsoft.com/office/word/2018/wordml/cex" xmlns:w16cid="http://schemas.microsoft.com/office/word/2016/wordml/cid" xmlns:w16="http://schemas.microsoft.com/office/word/2018/wordml" xmlns:w16du="http://schemas.microsoft.com/office/word/2023/wordml/word16du" xmlns:w16sdtdh="http://schemas.microsoft.com/office/word/2020/wordml/sdtdatahash" xmlns:w16sdtfl="http://schemas.microsoft.com/office/word/2024/wordml/sdtformatlock" xmlns:w16se="http://schemas.microsoft.com/office/word/2015/wordml/symex" xmlns:wpg="http://schemas.microsoft.com/office/word/2010/wordprocessingGroup" xmlns:wpi="http://schemas.microsoft.com/office/word/2010/wordprocessingInk" xmlns:wne="http://schemas.microsoft.com/office/word/2006/wordml" xmlns:wps="http://schemas.microsoft.com/office/word/2010/wordprocessingShape" mc:Ignorable="w14 w15 w16se w16cid w16 w16cex w16sdtdh w16sdtfl w16du wp14">
   <w:body>
     <w:p>
       <w:pPr>
         <w:pStyle w:val="Title"/>
       </w:pPr>
       <w:r>
-        <w:t>REQUEST FOR QUOTATION (RFQ)</w:t>
+        <w:t>Request for Quotation</w:t>
       </w:r>
     </w:p>
     <w:p>
       <w:pPr>
         <w:pStyle w:val="Subtitle"/>
         <w:rPr>
-          <w:kern w:val="0"/>
           <w:sz w:val="24"/>
           <w:szCs w:val="24"/>
-          <w:lang w:eastAsia="en-GB"/>
-          <w14:ligatures w14:val="none"/>
+          <w:lang w:eastAsia="en-AU"/>
         </w:rPr>
       </w:pPr>
       <w:r>
-        <w:t>[Project / Goods / Services Title]</w:t>
+        <w:t>{company} | RFQ No. {</w:t>
+      </w:r>
+      <w:proofErr w:type="spellStart"/>
+      <w:r>
+        <w:t>rfq_number</w:t>
+      </w:r>
+      <w:proofErr w:type="spellEnd"/>
+      <w:r>
+        <w:t>}</w:t>
       </w:r>
     </w:p>
     <w:tbl>
@@ -32,8 +38,10 @@
         <w:tblLook w:val="04A0" w:firstRow="1" w:lastRow="0" w:firstColumn="1" w:lastColumn="0" w:noHBand="0" w:noVBand="1"/>
       </w:tblPr>
       <w:tblGrid>
-        <w:gridCol w:w="3651"/>
-        <w:gridCol w:w="5365"/>
+        <w:gridCol w:w="2458"/>
+        <w:gridCol w:w="2489"/>
+        <w:gridCol w:w="2219"/>
+        <w:gridCol w:w="1850"/>
       </w:tblGrid>
       <w:tr>
         <w:trPr>
@@ -49,13 +57,11 @@
             <w:pPr>
               <w:spacing w:after="160"/>
               <w:rPr>
-                <w:kern w:val="0"/>
-                <w:lang w:eastAsia="en-GB"/>
-                <w14:ligatures w14:val="none"/>
+                <w:lang w:eastAsia="en-AU"/>
               </w:rPr>
             </w:pPr>
             <w:r>
-              <w:t>RFQ number</w:t>
+              <w:t>RFQ Name</w:t>
             </w:r>
           </w:p>
         </w:tc>
@@ -70,7 +76,37 @@
               <w:cnfStyle w:val="100000000000" w:firstRow="1" w:lastRow="0" w:firstColumn="0" w:lastColumn="0" w:oddVBand="0" w:evenVBand="0" w:oddHBand="0" w:evenHBand="0" w:firstRowFirstColumn="0" w:firstRowLastColumn="0" w:lastRowFirstColumn="0" w:lastRowLastColumn="0"/>
             </w:pPr>
             <w:r>
-              <w:t>[RFQ-XXXX]</w:t>
+              <w:t>{name}</w:t>
+            </w:r>
+          </w:p>
+        </w:tc>
+        <w:tc>
+          <w:tcPr>
+            <w:tcW w:w="0" w:type="auto"/>
+            <w:hideMark/>
+          </w:tcPr>
+          <w:p>
+            <w:pPr>
+              <w:spacing w:after="160"/>
+              <w:cnfStyle w:val="100000000000" w:firstRow="1" w:lastRow="0" w:firstColumn="0" w:lastColumn="0" w:oddVBand="0" w:evenVBand="0" w:oddHBand="0" w:evenHBand="0" w:firstRowFirstColumn="0" w:firstRowLastColumn="0" w:lastRowFirstColumn="0" w:lastRowLastColumn="0"/>
+            </w:pPr>
+            <w:r>
+              <w:t>Date Issued</w:t>
+            </w:r>
+          </w:p>
+        </w:tc>
+        <w:tc>
+          <w:tcPr>
+            <w:tcW w:w="0" w:type="auto"/>
+            <w:hideMark/>
+          </w:tcPr>
+          <w:p>
+            <w:pPr>
+              <w:spacing w:after="160"/>
+              <w:cnfStyle w:val="100000000000" w:firstRow="1" w:lastRow="0" w:firstColumn="0" w:lastColumn="0" w:oddVBand="0" w:evenVBand="0" w:oddHBand="0" w:evenHBand="0" w:firstRowFirstColumn="0" w:firstRowLastColumn="0" w:lastRowFirstColumn="0" w:lastRowLastColumn="0"/>
+            </w:pPr>
+            <w:r>
+              <w:t>{date}</w:t>
             </w:r>
           </w:p>
         </w:tc>
@@ -90,7 +126,7 @@
               <w:spacing w:after="160"/>
             </w:pPr>
             <w:r>
-              <w:t>Issue date</w:t>
+              <w:t>Sent Date</w:t>
             </w:r>
           </w:p>
         </w:tc>
@@ -105,7 +141,57 @@
               <w:cnfStyle w:val="000000100000" w:firstRow="0" w:lastRow="0" w:firstColumn="0" w:lastColumn="0" w:oddVBand="0" w:evenVBand="0" w:oddHBand="1" w:evenHBand="0" w:firstRowFirstColumn="0" w:firstRowLastColumn="0" w:lastRowFirstColumn="0" w:lastRowLastColumn="0"/>
             </w:pPr>
             <w:r>
-              <w:t>[DD Month YYYY]</w:t>
+              <w:t>{</w:t>
+            </w:r>
+            <w:proofErr w:type="spellStart"/>
+            <w:r>
+              <w:t>sent_date</w:t>
+            </w:r>
+            <w:proofErr w:type="spellEnd"/>
+            <w:r>
+              <w:t>}</w:t>
+            </w:r>
+          </w:p>
+        </w:tc>
+        <w:tc>
+          <w:tcPr>
+            <w:tcW w:w="0" w:type="auto"/>
+            <w:hideMark/>
+          </w:tcPr>
+          <w:p>
+            <w:pPr>
+              <w:spacing w:after="160"/>
+              <w:cnfStyle w:val="000000100000" w:firstRow="0" w:lastRow="0" w:firstColumn="0" w:lastColumn="0" w:oddVBand="0" w:evenVBand="0" w:oddHBand="1" w:evenHBand="0" w:firstRowFirstColumn="0" w:firstRowLastColumn="0" w:lastRowFirstColumn="0" w:lastRowLastColumn="0"/>
+            </w:pPr>
+            <w:r>
+              <w:rPr>
+                <w:b/>
+                <w:bCs/>
+              </w:rPr>
+              <w:t>Due Date</w:t>
+            </w:r>
+          </w:p>
+        </w:tc>
+        <w:tc>
+          <w:tcPr>
+            <w:tcW w:w="0" w:type="auto"/>
+            <w:hideMark/>
+          </w:tcPr>
+          <w:p>
+            <w:pPr>
+              <w:spacing w:after="160"/>
+              <w:cnfStyle w:val="000000100000" w:firstRow="0" w:lastRow="0" w:firstColumn="0" w:lastColumn="0" w:oddVBand="0" w:evenVBand="0" w:oddHBand="1" w:evenHBand="0" w:firstRowFirstColumn="0" w:firstRowLastColumn="0" w:lastRowFirstColumn="0" w:lastRowLastColumn="0"/>
+            </w:pPr>
+            <w:r>
+              <w:t>{</w:t>
+            </w:r>
+            <w:proofErr w:type="spellStart"/>
+            <w:r>
+              <w:t>due_date</w:t>
+            </w:r>
+            <w:proofErr w:type="spellEnd"/>
+            <w:r>
+              <w:t>}</w:t>
             </w:r>
           </w:p>
         </w:tc>
@@ -122,7 +208,7 @@
               <w:spacing w:after="160"/>
             </w:pPr>
             <w:r>
-              <w:t>Closing date and time</w:t>
+              <w:t>Received Date</w:t>
             </w:r>
           </w:p>
         </w:tc>
@@ -137,59 +223,15 @@
               <w:cnfStyle w:val="000000000000" w:firstRow="0" w:lastRow="0" w:firstColumn="0" w:lastColumn="0" w:oddVBand="0" w:evenVBand="0" w:oddHBand="0" w:evenHBand="0" w:firstRowFirstColumn="0" w:firstRowLastColumn="0" w:lastRowFirstColumn="0" w:lastRowLastColumn="0"/>
             </w:pPr>
             <w:r>
-              <w:t>[DD Month YYYY, HH:MM, time zone]</w:t>
-            </w:r>
-          </w:p>
-        </w:tc>
-      </w:tr>
-      <w:tr>
-        <w:trPr>
-          <w:cnfStyle w:val="000000100000" w:firstRow="0" w:lastRow="0" w:firstColumn="0" w:lastColumn="0" w:oddVBand="0" w:evenVBand="0" w:oddHBand="1" w:evenHBand="0" w:firstRowFirstColumn="0" w:firstRowLastColumn="0" w:lastRowFirstColumn="0" w:lastRowLastColumn="0"/>
-        </w:trPr>
-        <w:tc>
-          <w:tcPr>
-            <w:cnfStyle w:val="001000000000" w:firstRow="0" w:lastRow="0" w:firstColumn="1" w:lastColumn="0" w:oddVBand="0" w:evenVBand="0" w:oddHBand="0" w:evenHBand="0" w:firstRowFirstColumn="0" w:firstRowLastColumn="0" w:lastRowFirstColumn="0" w:lastRowLastColumn="0"/>
-            <w:tcW w:w="0" w:type="auto"/>
-            <w:hideMark/>
-          </w:tcPr>
-          <w:p>
-            <w:pPr>
-              <w:spacing w:after="160"/>
-            </w:pPr>
-            <w:r>
-              <w:t>Quote validity required</w:t>
-            </w:r>
-          </w:p>
-        </w:tc>
-        <w:tc>
-          <w:tcPr>
-            <w:tcW w:w="0" w:type="auto"/>
-            <w:hideMark/>
-          </w:tcPr>
-          <w:p>
-            <w:pPr>
-              <w:spacing w:after="160"/>
-              <w:cnfStyle w:val="000000100000" w:firstRow="0" w:lastRow="0" w:firstColumn="0" w:lastColumn="0" w:oddVBand="0" w:evenVBand="0" w:oddHBand="1" w:evenHBand="0" w:firstRowFirstColumn="0" w:firstRowLastColumn="0" w:lastRowFirstColumn="0" w:lastRowLastColumn="0"/>
-            </w:pPr>
-            <w:r>
-              <w:t>[e.g. 60 days]</w:t>
-            </w:r>
-          </w:p>
-        </w:tc>
-      </w:tr>
-      <w:tr>
-        <w:tc>
-          <w:tcPr>
-            <w:cnfStyle w:val="001000000000" w:firstRow="0" w:lastRow="0" w:firstColumn="1" w:lastColumn="0" w:oddVBand="0" w:evenVBand="0" w:oddHBand="0" w:evenHBand="0" w:firstRowFirstColumn="0" w:firstRowLastColumn="0" w:lastRowFirstColumn="0" w:lastRowLastColumn="0"/>
-            <w:tcW w:w="0" w:type="auto"/>
-            <w:hideMark/>
-          </w:tcPr>
-          <w:p>
-            <w:pPr>
-              <w:spacing w:after="160"/>
-            </w:pPr>
-            <w:r>
-              <w:t>Buyer</w:t>
+              <w:t>{</w:t>
+            </w:r>
+            <w:proofErr w:type="spellStart"/>
+            <w:r>
+              <w:t>received_date</w:t>
+            </w:r>
+            <w:proofErr w:type="spellEnd"/>
+            <w:r>
+              <w:t>}</w:t>
             </w:r>
           </w:p>
         </w:tc>
@@ -204,42 +246,34 @@
               <w:cnfStyle w:val="000000000000" w:firstRow="0" w:lastRow="0" w:firstColumn="0" w:lastColumn="0" w:oddVBand="0" w:evenVBand="0" w:oddHBand="0" w:evenHBand="0" w:firstRowFirstColumn="0" w:firstRowLastColumn="0" w:lastRowFirstColumn="0" w:lastRowLastColumn="0"/>
             </w:pPr>
             <w:r>
-              <w:t>[Organisation name]</w:t>
-            </w:r>
-          </w:p>
-        </w:tc>
-      </w:tr>
-      <w:tr>
-        <w:trPr>
-          <w:cnfStyle w:val="000000100000" w:firstRow="0" w:lastRow="0" w:firstColumn="0" w:lastColumn="0" w:oddVBand="0" w:evenVBand="0" w:oddHBand="1" w:evenHBand="0" w:firstRowFirstColumn="0" w:firstRowLastColumn="0" w:lastRowFirstColumn="0" w:lastRowLastColumn="0"/>
-        </w:trPr>
-        <w:tc>
-          <w:tcPr>
-            <w:cnfStyle w:val="001000000000" w:firstRow="0" w:lastRow="0" w:firstColumn="1" w:lastColumn="0" w:oddVBand="0" w:evenVBand="0" w:oddHBand="0" w:evenHBand="0" w:firstRowFirstColumn="0" w:firstRowLastColumn="0" w:lastRowFirstColumn="0" w:lastRowLastColumn="0"/>
-            <w:tcW w:w="0" w:type="auto"/>
-            <w:hideMark/>
-          </w:tcPr>
-          <w:p>
-            <w:pPr>
-              <w:spacing w:after="160"/>
-            </w:pPr>
-            <w:r>
-              <w:t>RFQ contact</w:t>
-            </w:r>
-          </w:p>
-        </w:tc>
-        <w:tc>
-          <w:tcPr>
-            <w:tcW w:w="0" w:type="auto"/>
-            <w:hideMark/>
-          </w:tcPr>
-          <w:p>
-            <w:pPr>
-              <w:spacing w:after="160"/>
-              <w:cnfStyle w:val="000000100000" w:firstRow="0" w:lastRow="0" w:firstColumn="0" w:lastColumn="0" w:oddVBand="0" w:evenVBand="0" w:oddHBand="1" w:evenHBand="0" w:firstRowFirstColumn="0" w:firstRowLastColumn="0" w:lastRowFirstColumn="0" w:lastRowLastColumn="0"/>
-            </w:pPr>
-            <w:r>
-              <w:t>[Name, role, email, phone]</w:t>
+              <w:rPr>
+                <w:b/>
+                <w:bCs/>
+              </w:rPr>
+              <w:t>Prepared For</w:t>
+            </w:r>
+          </w:p>
+        </w:tc>
+        <w:tc>
+          <w:tcPr>
+            <w:tcW w:w="0" w:type="auto"/>
+            <w:hideMark/>
+          </w:tcPr>
+          <w:p>
+            <w:pPr>
+              <w:spacing w:after="160"/>
+              <w:cnfStyle w:val="000000000000" w:firstRow="0" w:lastRow="0" w:firstColumn="0" w:lastColumn="0" w:oddVBand="0" w:evenVBand="0" w:oddHBand="0" w:evenHBand="0" w:firstRowFirstColumn="0" w:firstRowLastColumn="0" w:lastRowFirstColumn="0" w:lastRowLastColumn="0"/>
+            </w:pPr>
+            <w:r>
+              <w:t>{</w:t>
+            </w:r>
+            <w:proofErr w:type="spellStart"/>
+            <w:r>
+              <w:t>for_name</w:t>
+            </w:r>
+            <w:proofErr w:type="spellEnd"/>
+            <w:r>
+              <w:t>}</w:t>
             </w:r>
           </w:p>
         </w:tc>
@@ -248,9 +282,7 @@
     <w:p>
       <w:pPr>
         <w:rPr>
-          <w:kern w:val="0"/>
-          <w:lang w:eastAsia="en-GB"/>
-          <w14:ligatures w14:val="none"/>
+          <w:lang w:eastAsia="en-AU"/>
         </w:rPr>
       </w:pPr>
     </w:p>
@@ -259,49 +291,16 @@
         <w:pStyle w:val="Heading1"/>
         <w:rPr>
           <w:rFonts w:asciiTheme="minorHAnsi" w:hAnsiTheme="minorHAnsi" w:cstheme="minorBidi"/>
-          <w:kern w:val="36"/>
           <w:sz w:val="48"/>
           <w:szCs w:val="48"/>
-          <w:lang w:eastAsia="en-GB"/>
-          <w14:ligatures w14:val="none"/>
+          <w:lang w:eastAsia="en-AU"/>
         </w:rPr>
       </w:pPr>
       <w:r>
         <w:rPr>
           <w:rFonts w:asciiTheme="minorHAnsi" w:hAnsiTheme="minorHAnsi" w:cstheme="minorBidi"/>
         </w:rPr>
-        <w:t>1. Invitation to Quote</w:t>
-      </w:r>
-    </w:p>
-    <w:p>
-      <w:pPr>
-        <w:rPr>
-          <w:kern w:val="0"/>
-          <w:lang w:eastAsia="en-GB"/>
-          <w14:ligatures w14:val="none"/>
-        </w:rPr>
-      </w:pPr>
-      <w:r>
-        <w:t>[Organisation name] invites suitably qualified suppliers to submit a quotation for the goods and/or services described in this RFQ. Suppliers should review all requirements and provide a complete response by the closing date and time.</w:t>
-      </w:r>
-    </w:p>
-    <w:p>
-      <w:pPr>
-        <w:pStyle w:val="Heading1"/>
-        <w:rPr>
-          <w:rFonts w:asciiTheme="minorHAnsi" w:hAnsiTheme="minorHAnsi" w:cstheme="minorBidi"/>
-          <w:kern w:val="36"/>
-          <w:sz w:val="48"/>
-          <w:szCs w:val="48"/>
-          <w:lang w:eastAsia="en-GB"/>
-          <w14:ligatures w14:val="none"/>
-        </w:rPr>
-      </w:pPr>
-      <w:r>
-        <w:rPr>
-          <w:rFonts w:asciiTheme="minorHAnsi" w:hAnsiTheme="minorHAnsi" w:cstheme="minorBidi"/>
-        </w:rPr>
-        <w:t>2. Buyer Information</w:t>
+        <w:t>Request Details</w:t>
       </w:r>
     </w:p>
     <w:tbl>
@@ -311,8 +310,8 @@
         <w:tblLook w:val="04A0" w:firstRow="1" w:lastRow="0" w:firstColumn="1" w:lastColumn="0" w:noHBand="0" w:noVBand="1"/>
       </w:tblPr>
       <w:tblGrid>
-        <w:gridCol w:w="2920"/>
-        <w:gridCol w:w="6096"/>
+        <w:gridCol w:w="2818"/>
+        <w:gridCol w:w="6198"/>
       </w:tblGrid>
       <w:tr>
         <w:trPr>
@@ -328,13 +327,11 @@
             <w:pPr>
               <w:spacing w:after="160"/>
               <w:rPr>
-                <w:kern w:val="0"/>
-                <w:lang w:eastAsia="en-GB"/>
-                <w14:ligatures w14:val="none"/>
+                <w:lang w:eastAsia="en-AU"/>
               </w:rPr>
             </w:pPr>
             <w:r>
-              <w:t>Organisation</w:t>
+              <w:t>To</w:t>
             </w:r>
           </w:p>
         </w:tc>
@@ -349,7 +346,35 @@
               <w:cnfStyle w:val="100000000000" w:firstRow="1" w:lastRow="0" w:firstColumn="0" w:lastColumn="0" w:oddVBand="0" w:evenVBand="0" w:oddHBand="0" w:evenHBand="0" w:firstRowFirstColumn="0" w:firstRowLastColumn="0" w:lastRowFirstColumn="0" w:lastRowLastColumn="0"/>
             </w:pPr>
             <w:r>
-              <w:t>[Legal entity name]</w:t>
+              <w:t>{to.name}</w:t>
+            </w:r>
+            <w:r>
+              <w:br/>
+              <w:t>{</w:t>
+            </w:r>
+            <w:proofErr w:type="spellStart"/>
+            <w:proofErr w:type="gramStart"/>
+            <w:r>
+              <w:t>to.email</w:t>
+            </w:r>
+            <w:proofErr w:type="spellEnd"/>
+            <w:proofErr w:type="gramEnd"/>
+            <w:r>
+              <w:t>}</w:t>
+            </w:r>
+            <w:r>
+              <w:br/>
+              <w:t>{</w:t>
+            </w:r>
+            <w:proofErr w:type="spellStart"/>
+            <w:proofErr w:type="gramStart"/>
+            <w:r>
+              <w:t>to.address</w:t>
+            </w:r>
+            <w:proofErr w:type="spellEnd"/>
+            <w:proofErr w:type="gramEnd"/>
+            <w:r>
+              <w:t>}</w:t>
             </w:r>
           </w:p>
         </w:tc>
@@ -369,7 +394,7 @@
               <w:spacing w:after="160"/>
             </w:pPr>
             <w:r>
-              <w:t>ABN / registration number</w:t>
+              <w:t>From</w:t>
             </w:r>
           </w:p>
         </w:tc>
@@ -384,74 +409,21 @@
               <w:cnfStyle w:val="000000100000" w:firstRow="0" w:lastRow="0" w:firstColumn="0" w:lastColumn="0" w:oddVBand="0" w:evenVBand="0" w:oddHBand="1" w:evenHBand="0" w:firstRowFirstColumn="0" w:firstRowLastColumn="0" w:lastRowFirstColumn="0" w:lastRowLastColumn="0"/>
             </w:pPr>
             <w:r>
-              <w:t>[Number]</w:t>
-            </w:r>
-          </w:p>
-        </w:tc>
-      </w:tr>
-      <w:tr>
-        <w:tc>
-          <w:tcPr>
-            <w:cnfStyle w:val="001000000000" w:firstRow="0" w:lastRow="0" w:firstColumn="1" w:lastColumn="0" w:oddVBand="0" w:evenVBand="0" w:oddHBand="0" w:evenHBand="0" w:firstRowFirstColumn="0" w:firstRowLastColumn="0" w:lastRowFirstColumn="0" w:lastRowLastColumn="0"/>
-            <w:tcW w:w="0" w:type="auto"/>
-            <w:hideMark/>
-          </w:tcPr>
-          <w:p>
-            <w:pPr>
-              <w:spacing w:after="160"/>
-            </w:pPr>
-            <w:r>
-              <w:t>Address</w:t>
-            </w:r>
-          </w:p>
-        </w:tc>
-        <w:tc>
-          <w:tcPr>
-            <w:tcW w:w="0" w:type="auto"/>
-            <w:hideMark/>
-          </w:tcPr>
-          <w:p>
-            <w:pPr>
-              <w:spacing w:after="160"/>
-              <w:cnfStyle w:val="000000000000" w:firstRow="0" w:lastRow="0" w:firstColumn="0" w:lastColumn="0" w:oddVBand="0" w:evenVBand="0" w:oddHBand="0" w:evenHBand="0" w:firstRowFirstColumn="0" w:firstRowLastColumn="0" w:lastRowFirstColumn="0" w:lastRowLastColumn="0"/>
-            </w:pPr>
-            <w:r>
-              <w:t>[Street, suburb/city, state, postcode, country]</w:t>
-            </w:r>
-          </w:p>
-        </w:tc>
-      </w:tr>
-      <w:tr>
-        <w:trPr>
-          <w:cnfStyle w:val="000000100000" w:firstRow="0" w:lastRow="0" w:firstColumn="0" w:lastColumn="0" w:oddVBand="0" w:evenVBand="0" w:oddHBand="1" w:evenHBand="0" w:firstRowFirstColumn="0" w:firstRowLastColumn="0" w:lastRowFirstColumn="0" w:lastRowLastColumn="0"/>
-        </w:trPr>
-        <w:tc>
-          <w:tcPr>
-            <w:cnfStyle w:val="001000000000" w:firstRow="0" w:lastRow="0" w:firstColumn="1" w:lastColumn="0" w:oddVBand="0" w:evenVBand="0" w:oddHBand="0" w:evenHBand="0" w:firstRowFirstColumn="0" w:firstRowLastColumn="0" w:lastRowFirstColumn="0" w:lastRowLastColumn="0"/>
-            <w:tcW w:w="0" w:type="auto"/>
-            <w:hideMark/>
-          </w:tcPr>
-          <w:p>
-            <w:pPr>
-              <w:spacing w:after="160"/>
-            </w:pPr>
-            <w:r>
-              <w:t>Business overview</w:t>
-            </w:r>
-          </w:p>
-        </w:tc>
-        <w:tc>
-          <w:tcPr>
-            <w:tcW w:w="0" w:type="auto"/>
-            <w:hideMark/>
-          </w:tcPr>
-          <w:p>
-            <w:pPr>
-              <w:spacing w:after="160"/>
-              <w:cnfStyle w:val="000000100000" w:firstRow="0" w:lastRow="0" w:firstColumn="0" w:lastColumn="0" w:oddVBand="0" w:evenVBand="0" w:oddHBand="1" w:evenHBand="0" w:firstRowFirstColumn="0" w:firstRowLastColumn="0" w:lastRowFirstColumn="0" w:lastRowLastColumn="0"/>
-            </w:pPr>
-            <w:r>
-              <w:t>[Brief description of the organisation and purchasing context]</w:t>
+              <w:t>{from.name}</w:t>
+            </w:r>
+            <w:r>
+              <w:br/>
+              <w:t>{</w:t>
+            </w:r>
+            <w:proofErr w:type="spellStart"/>
+            <w:proofErr w:type="gramStart"/>
+            <w:r>
+              <w:t>from.address</w:t>
+            </w:r>
+            <w:proofErr w:type="spellEnd"/>
+            <w:proofErr w:type="gramEnd"/>
+            <w:r>
+              <w:t>}</w:t>
             </w:r>
           </w:p>
         </w:tc>
@@ -460,37 +432,24 @@
     <w:p>
       <w:pPr>
         <w:rPr>
-          <w:kern w:val="0"/>
-          <w:lang w:eastAsia="en-GB"/>
-          <w14:ligatures w14:val="none"/>
+          <w:lang w:eastAsia="en-AU"/>
         </w:rPr>
       </w:pPr>
     </w:p>
     <w:p>
       <w:pPr>
-        <w:pStyle w:val="Heading1"/>
         <w:rPr>
-          <w:rFonts w:asciiTheme="minorHAnsi" w:hAnsiTheme="minorHAnsi" w:cstheme="minorBidi"/>
-          <w:kern w:val="36"/>
-          <w:sz w:val="48"/>
-          <w:szCs w:val="48"/>
-          <w:lang w:eastAsia="en-GB"/>
-          <w14:ligatures w14:val="none"/>
+          <w:lang w:eastAsia="en-AU"/>
         </w:rPr>
       </w:pPr>
       <w:r>
-        <w:rPr>
-          <w:rFonts w:asciiTheme="minorHAnsi" w:hAnsiTheme="minorHAnsi" w:cstheme="minorBidi"/>
-        </w:rPr>
-        <w:t>3. Requirement and Scope</w:t>
+        <w:t>Please provide a quotation for the goods and/or services listed below. Your quotation should include pricing, applicable taxes, delivery or completion timing, validity period, exclusions, assumptions, and any terms that may affect the final cost.</w:t>
       </w:r>
     </w:p>
     <w:p>
       <w:pPr>
         <w:rPr>
-          <w:kern w:val="0"/>
-          <w:lang w:eastAsia="en-GB"/>
-          <w14:ligatures w14:val="none"/>
+          <w:lang w:eastAsia="en-AU"/>
         </w:rPr>
       </w:pPr>
       <w:r>
@@ -498,18 +457,16 @@
           <w:b/>
           <w:bCs/>
         </w:rPr>
-        <w:t>Purpose:</w:t>
-      </w:r>
-      <w:r>
-        <w:t xml:space="preserve"> [Explain what is being purchased and the desired outcome.]</w:t>
+        <w:t>Additional notes:</w:t>
+      </w:r>
+      <w:r>
+        <w:t xml:space="preserve"> {note}</w:t>
       </w:r>
     </w:p>
     <w:p>
       <w:pPr>
         <w:rPr>
-          <w:kern w:val="0"/>
-          <w:lang w:eastAsia="en-GB"/>
-          <w14:ligatures w14:val="none"/>
+          <w:lang w:eastAsia="en-AU"/>
         </w:rPr>
       </w:pPr>
       <w:r>
@@ -517,29 +474,98 @@
           <w:b/>
           <w:bCs/>
         </w:rPr>
-        <w:t>Scope:</w:t>
-      </w:r>
-      <w:r>
-        <w:t xml:space="preserve"> [Describe included goods, services, deliverables, locations, and boundaries.]</w:t>
-      </w:r>
-    </w:p>
-    <w:p>
-      <w:pPr>
-        <w:rPr>
-          <w:kern w:val="0"/>
-          <w:lang w:eastAsia="en-GB"/>
-          <w14:ligatures w14:val="none"/>
-        </w:rPr>
-      </w:pPr>
+        <w:t>Pricing included:</w:t>
+      </w:r>
+      <w:r>
+        <w:t xml:space="preserve"> {</w:t>
+      </w:r>
+      <w:proofErr w:type="spellStart"/>
+      <w:r>
+        <w:t>include_</w:t>
+      </w:r>
+      <w:proofErr w:type="gramStart"/>
+      <w:r>
+        <w:t>pricing</w:t>
+      </w:r>
+      <w:proofErr w:type="spellEnd"/>
+      <w:r>
+        <w:t>}   </w:t>
+      </w:r>
+      <w:proofErr w:type="gramEnd"/>
+      <w:r>
+        <w:t xml:space="preserve"> </w:t>
+      </w:r>
       <w:r>
         <w:rPr>
           <w:b/>
           <w:bCs/>
         </w:rPr>
-        <w:t>Out of scope:</w:t>
-      </w:r>
-      <w:r>
-        <w:t xml:space="preserve"> [List exclusions, if any.]</w:t>
+        <w:t>Quantities included:</w:t>
+      </w:r>
+      <w:r>
+        <w:t xml:space="preserve"> {</w:t>
+      </w:r>
+      <w:proofErr w:type="spellStart"/>
+      <w:r>
+        <w:t>include_quantities</w:t>
+      </w:r>
+      <w:proofErr w:type="spellEnd"/>
+      <w:r>
+        <w:t>}</w:t>
+      </w:r>
+    </w:p>
+    <w:p>
+      <w:pPr>
+        <w:pStyle w:val="Heading1"/>
+        <w:rPr>
+          <w:rFonts w:asciiTheme="minorHAnsi" w:hAnsiTheme="minorHAnsi" w:cstheme="minorBidi"/>
+          <w:sz w:val="48"/>
+          <w:szCs w:val="48"/>
+          <w:lang w:eastAsia="en-AU"/>
+        </w:rPr>
+      </w:pPr>
+      <w:r>
+        <w:rPr>
+          <w:rFonts w:asciiTheme="minorHAnsi" w:hAnsiTheme="minorHAnsi" w:cstheme="minorBidi"/>
+        </w:rPr>
+        <w:t>Line Items for Quotation</w:t>
+      </w:r>
+    </w:p>
+    <w:p>
+      <w:pPr>
+        <w:rPr>
+          <w:lang w:eastAsia="en-AU"/>
+        </w:rPr>
+      </w:pPr>
+      <w:r>
+        <w:t>{#groups}</w:t>
+      </w:r>
+    </w:p>
+    <w:p>
+      <w:pPr>
+        <w:pStyle w:val="Heading2"/>
+        <w:rPr>
+          <w:rFonts w:asciiTheme="minorHAnsi" w:hAnsiTheme="minorHAnsi" w:cstheme="minorBidi"/>
+          <w:sz w:val="36"/>
+          <w:szCs w:val="36"/>
+          <w:lang w:eastAsia="en-AU"/>
+        </w:rPr>
+      </w:pPr>
+      <w:r>
+        <w:rPr>
+          <w:rFonts w:asciiTheme="minorHAnsi" w:hAnsiTheme="minorHAnsi" w:cstheme="minorBidi"/>
+        </w:rPr>
+        <w:t>{name}</w:t>
+      </w:r>
+    </w:p>
+    <w:p>
+      <w:pPr>
+        <w:rPr>
+          <w:lang w:eastAsia="en-AU"/>
+        </w:rPr>
+      </w:pPr>
+      <w:r>
+        <w:t>{note}</w:t>
       </w:r>
     </w:p>
     <w:tbl>
@@ -549,11 +575,14 @@
         <w:tblLook w:val="04A0" w:firstRow="1" w:lastRow="0" w:firstColumn="1" w:lastColumn="0" w:noHBand="0" w:noVBand="1"/>
       </w:tblPr>
       <w:tblGrid>
-        <w:gridCol w:w="718"/>
-        <w:gridCol w:w="4044"/>
-        <w:gridCol w:w="1218"/>
-        <w:gridCol w:w="1436"/>
-        <w:gridCol w:w="1600"/>
+        <w:gridCol w:w="1648"/>
+        <w:gridCol w:w="1328"/>
+        <w:gridCol w:w="1090"/>
+        <w:gridCol w:w="1053"/>
+        <w:gridCol w:w="1149"/>
+        <w:gridCol w:w="597"/>
+        <w:gridCol w:w="739"/>
+        <w:gridCol w:w="1412"/>
       </w:tblGrid>
       <w:tr>
         <w:trPr>
@@ -569,9 +598,7 @@
             <w:pPr>
               <w:spacing w:after="160"/>
               <w:rPr>
-                <w:kern w:val="0"/>
-                <w:lang w:eastAsia="en-GB"/>
-                <w14:ligatures w14:val="none"/>
+                <w:lang w:eastAsia="en-AU"/>
               </w:rPr>
             </w:pPr>
             <w:r>
@@ -590,7 +617,7 @@
               <w:cnfStyle w:val="100000000000" w:firstRow="1" w:lastRow="0" w:firstColumn="0" w:lastColumn="0" w:oddVBand="0" w:evenVBand="0" w:oddHBand="0" w:evenHBand="0" w:firstRowFirstColumn="0" w:firstRowLastColumn="0" w:lastRowFirstColumn="0" w:lastRowLastColumn="0"/>
             </w:pPr>
             <w:r>
-              <w:t>Description / specification</w:t>
+              <w:t>Description</w:t>
             </w:r>
           </w:p>
         </w:tc>
@@ -605,6 +632,21 @@
               <w:cnfStyle w:val="100000000000" w:firstRow="1" w:lastRow="0" w:firstColumn="0" w:lastColumn="0" w:oddVBand="0" w:evenVBand="0" w:oddHBand="0" w:evenHBand="0" w:firstRowFirstColumn="0" w:firstRowLastColumn="0" w:lastRowFirstColumn="0" w:lastRowLastColumn="0"/>
             </w:pPr>
             <w:r>
+              <w:t>Category</w:t>
+            </w:r>
+          </w:p>
+        </w:tc>
+        <w:tc>
+          <w:tcPr>
+            <w:tcW w:w="0" w:type="auto"/>
+            <w:hideMark/>
+          </w:tcPr>
+          <w:p>
+            <w:pPr>
+              <w:spacing w:after="160"/>
+              <w:cnfStyle w:val="100000000000" w:firstRow="1" w:lastRow="0" w:firstColumn="0" w:lastColumn="0" w:oddVBand="0" w:evenVBand="0" w:oddHBand="0" w:evenHBand="0" w:firstRowFirstColumn="0" w:firstRowLastColumn="0" w:lastRowFirstColumn="0" w:lastRowLastColumn="0"/>
+            </w:pPr>
+            <w:r>
               <w:t>Quantity</w:t>
             </w:r>
           </w:p>
@@ -620,7 +662,7 @@
               <w:cnfStyle w:val="100000000000" w:firstRow="1" w:lastRow="0" w:firstColumn="0" w:lastColumn="0" w:oddVBand="0" w:evenVBand="0" w:oddHBand="0" w:evenHBand="0" w:firstRowFirstColumn="0" w:firstRowLastColumn="0" w:lastRowFirstColumn="0" w:lastRowLastColumn="0"/>
             </w:pPr>
             <w:r>
-              <w:t>Required date</w:t>
+              <w:t>Unit Cost</w:t>
             </w:r>
           </w:p>
         </w:tc>
@@ -635,7 +677,37 @@
               <w:cnfStyle w:val="100000000000" w:firstRow="1" w:lastRow="0" w:firstColumn="0" w:lastColumn="0" w:oddVBand="0" w:evenVBand="0" w:oddHBand="0" w:evenHBand="0" w:firstRowFirstColumn="0" w:firstRowLastColumn="0" w:lastRowFirstColumn="0" w:lastRowLastColumn="0"/>
             </w:pPr>
             <w:r>
-              <w:t>Delivery location</w:t>
+              <w:t>Tax</w:t>
+            </w:r>
+          </w:p>
+        </w:tc>
+        <w:tc>
+          <w:tcPr>
+            <w:tcW w:w="0" w:type="auto"/>
+            <w:hideMark/>
+          </w:tcPr>
+          <w:p>
+            <w:pPr>
+              <w:spacing w:after="160"/>
+              <w:cnfStyle w:val="100000000000" w:firstRow="1" w:lastRow="0" w:firstColumn="0" w:lastColumn="0" w:oddVBand="0" w:evenVBand="0" w:oddHBand="0" w:evenHBand="0" w:firstRowFirstColumn="0" w:firstRowLastColumn="0" w:lastRowFirstColumn="0" w:lastRowLastColumn="0"/>
+            </w:pPr>
+            <w:r>
+              <w:t>Total</w:t>
+            </w:r>
+          </w:p>
+        </w:tc>
+        <w:tc>
+          <w:tcPr>
+            <w:tcW w:w="0" w:type="auto"/>
+            <w:hideMark/>
+          </w:tcPr>
+          <w:p>
+            <w:pPr>
+              <w:spacing w:after="160"/>
+              <w:cnfStyle w:val="100000000000" w:firstRow="1" w:lastRow="0" w:firstColumn="0" w:lastColumn="0" w:oddVBand="0" w:evenVBand="0" w:oddHBand="0" w:evenHBand="0" w:firstRowFirstColumn="0" w:firstRowLastColumn="0" w:lastRowFirstColumn="0" w:lastRowLastColumn="0"/>
+            </w:pPr>
+            <w:r>
+              <w:t>Notes</w:t>
             </w:r>
           </w:p>
         </w:tc>
@@ -655,8 +727,15 @@
               <w:spacing w:after="160"/>
             </w:pPr>
             <w:r>
-              <w:lastRenderedPageBreak/>
-              <w:t>[1]</w:t>
+              <w:t>{#</w:t>
+            </w:r>
+            <w:proofErr w:type="gramStart"/>
+            <w:r>
+              <w:t>items}{</w:t>
+            </w:r>
+            <w:proofErr w:type="gramEnd"/>
+            <w:r>
+              <w:t>name}</w:t>
             </w:r>
           </w:p>
         </w:tc>
@@ -671,7 +750,7 @@
               <w:cnfStyle w:val="000000100000" w:firstRow="0" w:lastRow="0" w:firstColumn="0" w:lastColumn="0" w:oddVBand="0" w:evenVBand="0" w:oddHBand="1" w:evenHBand="0" w:firstRowFirstColumn="0" w:firstRowLastColumn="0" w:lastRowFirstColumn="0" w:lastRowLastColumn="0"/>
             </w:pPr>
             <w:r>
-              <w:t>[Detailed requirement, standard, model, service level, or deliverable]</w:t>
+              <w:t>{description}</w:t>
             </w:r>
           </w:p>
         </w:tc>
@@ -686,7 +765,7 @@
               <w:cnfStyle w:val="000000100000" w:firstRow="0" w:lastRow="0" w:firstColumn="0" w:lastColumn="0" w:oddVBand="0" w:evenVBand="0" w:oddHBand="1" w:evenHBand="0" w:firstRowFirstColumn="0" w:firstRowLastColumn="0" w:lastRowFirstColumn="0" w:lastRowLastColumn="0"/>
             </w:pPr>
             <w:r>
-              <w:t>[Qty / unit]</w:t>
+              <w:t>{category}</w:t>
             </w:r>
           </w:p>
         </w:tc>
@@ -701,7 +780,7 @@
               <w:cnfStyle w:val="000000100000" w:firstRow="0" w:lastRow="0" w:firstColumn="0" w:lastColumn="0" w:oddVBand="0" w:evenVBand="0" w:oddHBand="1" w:evenHBand="0" w:firstRowFirstColumn="0" w:firstRowLastColumn="0" w:lastRowFirstColumn="0" w:lastRowLastColumn="0"/>
             </w:pPr>
             <w:r>
-              <w:t>[Date]</w:t>
+              <w:t>{quantity}</w:t>
             </w:r>
           </w:p>
         </w:tc>
@@ -716,84 +795,60 @@
               <w:cnfStyle w:val="000000100000" w:firstRow="0" w:lastRow="0" w:firstColumn="0" w:lastColumn="0" w:oddVBand="0" w:evenVBand="0" w:oddHBand="1" w:evenHBand="0" w:firstRowFirstColumn="0" w:firstRowLastColumn="0" w:lastRowFirstColumn="0" w:lastRowLastColumn="0"/>
             </w:pPr>
             <w:r>
-              <w:t>[Location]</w:t>
-            </w:r>
-          </w:p>
-        </w:tc>
-      </w:tr>
-      <w:tr>
-        <w:tc>
-          <w:tcPr>
-            <w:cnfStyle w:val="001000000000" w:firstRow="0" w:lastRow="0" w:firstColumn="1" w:lastColumn="0" w:oddVBand="0" w:evenVBand="0" w:oddHBand="0" w:evenHBand="0" w:firstRowFirstColumn="0" w:firstRowLastColumn="0" w:lastRowFirstColumn="0" w:lastRowLastColumn="0"/>
-            <w:tcW w:w="0" w:type="auto"/>
-            <w:hideMark/>
-          </w:tcPr>
-          <w:p>
-            <w:pPr>
-              <w:spacing w:after="160"/>
-            </w:pPr>
-            <w:r>
-              <w:t>[2]</w:t>
-            </w:r>
-          </w:p>
-        </w:tc>
-        <w:tc>
-          <w:tcPr>
-            <w:tcW w:w="0" w:type="auto"/>
-            <w:hideMark/>
-          </w:tcPr>
-          <w:p>
-            <w:pPr>
-              <w:spacing w:after="160"/>
-              <w:cnfStyle w:val="000000000000" w:firstRow="0" w:lastRow="0" w:firstColumn="0" w:lastColumn="0" w:oddVBand="0" w:evenVBand="0" w:oddHBand="0" w:evenHBand="0" w:firstRowFirstColumn="0" w:firstRowLastColumn="0" w:lastRowFirstColumn="0" w:lastRowLastColumn="0"/>
-            </w:pPr>
-            <w:r>
-              <w:t>[Detailed requirement]</w:t>
-            </w:r>
-          </w:p>
-        </w:tc>
-        <w:tc>
-          <w:tcPr>
-            <w:tcW w:w="0" w:type="auto"/>
-            <w:hideMark/>
-          </w:tcPr>
-          <w:p>
-            <w:pPr>
-              <w:spacing w:after="160"/>
-              <w:cnfStyle w:val="000000000000" w:firstRow="0" w:lastRow="0" w:firstColumn="0" w:lastColumn="0" w:oddVBand="0" w:evenVBand="0" w:oddHBand="0" w:evenHBand="0" w:firstRowFirstColumn="0" w:firstRowLastColumn="0" w:lastRowFirstColumn="0" w:lastRowLastColumn="0"/>
-            </w:pPr>
-            <w:r>
-              <w:t>[Qty / unit]</w:t>
-            </w:r>
-          </w:p>
-        </w:tc>
-        <w:tc>
-          <w:tcPr>
-            <w:tcW w:w="0" w:type="auto"/>
-            <w:hideMark/>
-          </w:tcPr>
-          <w:p>
-            <w:pPr>
-              <w:spacing w:after="160"/>
-              <w:cnfStyle w:val="000000000000" w:firstRow="0" w:lastRow="0" w:firstColumn="0" w:lastColumn="0" w:oddVBand="0" w:evenVBand="0" w:oddHBand="0" w:evenHBand="0" w:firstRowFirstColumn="0" w:firstRowLastColumn="0" w:lastRowFirstColumn="0" w:lastRowLastColumn="0"/>
-            </w:pPr>
-            <w:r>
-              <w:t>[Date]</w:t>
-            </w:r>
-          </w:p>
-        </w:tc>
-        <w:tc>
-          <w:tcPr>
-            <w:tcW w:w="0" w:type="auto"/>
-            <w:hideMark/>
-          </w:tcPr>
-          <w:p>
-            <w:pPr>
-              <w:spacing w:after="160"/>
-              <w:cnfStyle w:val="000000000000" w:firstRow="0" w:lastRow="0" w:firstColumn="0" w:lastColumn="0" w:oddVBand="0" w:evenVBand="0" w:oddHBand="0" w:evenHBand="0" w:firstRowFirstColumn="0" w:firstRowLastColumn="0" w:lastRowFirstColumn="0" w:lastRowLastColumn="0"/>
-            </w:pPr>
-            <w:r>
-              <w:t>[Location]</w:t>
+              <w:t>{</w:t>
+            </w:r>
+            <w:proofErr w:type="spellStart"/>
+            <w:r>
+              <w:t>unit_cost</w:t>
+            </w:r>
+            <w:proofErr w:type="spellEnd"/>
+            <w:r>
+              <w:t>}</w:t>
+            </w:r>
+          </w:p>
+        </w:tc>
+        <w:tc>
+          <w:tcPr>
+            <w:tcW w:w="0" w:type="auto"/>
+            <w:hideMark/>
+          </w:tcPr>
+          <w:p>
+            <w:pPr>
+              <w:spacing w:after="160"/>
+              <w:cnfStyle w:val="000000100000" w:firstRow="0" w:lastRow="0" w:firstColumn="0" w:lastColumn="0" w:oddVBand="0" w:evenVBand="0" w:oddHBand="1" w:evenHBand="0" w:firstRowFirstColumn="0" w:firstRowLastColumn="0" w:lastRowFirstColumn="0" w:lastRowLastColumn="0"/>
+            </w:pPr>
+            <w:r>
+              <w:t>{tax}</w:t>
+            </w:r>
+          </w:p>
+        </w:tc>
+        <w:tc>
+          <w:tcPr>
+            <w:tcW w:w="0" w:type="auto"/>
+            <w:hideMark/>
+          </w:tcPr>
+          <w:p>
+            <w:pPr>
+              <w:spacing w:after="160"/>
+              <w:cnfStyle w:val="000000100000" w:firstRow="0" w:lastRow="0" w:firstColumn="0" w:lastColumn="0" w:oddVBand="0" w:evenVBand="0" w:oddHBand="1" w:evenHBand="0" w:firstRowFirstColumn="0" w:firstRowLastColumn="0" w:lastRowFirstColumn="0" w:lastRowLastColumn="0"/>
+            </w:pPr>
+            <w:r>
+              <w:t>{total}</w:t>
+            </w:r>
+          </w:p>
+        </w:tc>
+        <w:tc>
+          <w:tcPr>
+            <w:tcW w:w="0" w:type="auto"/>
+            <w:hideMark/>
+          </w:tcPr>
+          <w:p>
+            <w:pPr>
+              <w:spacing w:after="160"/>
+              <w:cnfStyle w:val="000000100000" w:firstRow="0" w:lastRow="0" w:firstColumn="0" w:lastColumn="0" w:oddVBand="0" w:evenVBand="0" w:oddHBand="1" w:evenHBand="0" w:firstRowFirstColumn="0" w:firstRowLastColumn="0" w:lastRowFirstColumn="0" w:lastRowLastColumn="0"/>
+            </w:pPr>
+            <w:r>
+              <w:t>{note}{/items}</w:t>
             </w:r>
           </w:p>
         </w:tc>
@@ -802,148 +857,25 @@
     <w:p>
       <w:pPr>
         <w:rPr>
-          <w:kern w:val="0"/>
-          <w:lang w:eastAsia="en-GB"/>
-          <w14:ligatures w14:val="none"/>
+          <w:lang w:eastAsia="en-AU"/>
         </w:rPr>
       </w:pPr>
     </w:p>
     <w:p>
       <w:pPr>
-        <w:pStyle w:val="Heading1"/>
+        <w:pStyle w:val="Heading3"/>
         <w:rPr>
-          <w:rFonts w:asciiTheme="minorHAnsi" w:hAnsiTheme="minorHAnsi" w:cstheme="minorBidi"/>
-          <w:kern w:val="36"/>
-          <w:sz w:val="48"/>
-          <w:szCs w:val="48"/>
-          <w:lang w:eastAsia="en-GB"/>
-          <w14:ligatures w14:val="none"/>
+          <w:rFonts w:cstheme="minorBidi"/>
+          <w:sz w:val="27"/>
+          <w:szCs w:val="27"/>
+          <w:lang w:eastAsia="en-AU"/>
         </w:rPr>
       </w:pPr>
       <w:r>
         <w:rPr>
-          <w:rFonts w:asciiTheme="minorHAnsi" w:hAnsiTheme="minorHAnsi" w:cstheme="minorBidi"/>
+          <w:rFonts w:cstheme="minorBidi"/>
         </w:rPr>
-        <w:t>4. Technical and Service Requirements</w:t>
-      </w:r>
-    </w:p>
-    <w:p>
-      <w:pPr>
-        <w:pStyle w:val="ListParagraph"/>
-        <w:numPr>
-          <w:ilvl w:val="0"/>
-          <w:numId w:val="1"/>
-        </w:numPr>
-        <w:rPr>
-          <w:sz w:val="20"/>
-          <w:szCs w:val="20"/>
-        </w:rPr>
-      </w:pPr>
-      <w:r>
-        <w:rPr>
-          <w:sz w:val="20"/>
-          <w:szCs w:val="20"/>
-        </w:rPr>
-        <w:t>[Mandatory technical, functional, quality, or performance requirements]</w:t>
-      </w:r>
-    </w:p>
-    <w:p>
-      <w:pPr>
-        <w:pStyle w:val="ListParagraph"/>
-        <w:numPr>
-          <w:ilvl w:val="0"/>
-          <w:numId w:val="1"/>
-        </w:numPr>
-        <w:rPr>
-          <w:sz w:val="20"/>
-          <w:szCs w:val="20"/>
-        </w:rPr>
-      </w:pPr>
-      <w:r>
-        <w:rPr>
-          <w:sz w:val="20"/>
-          <w:szCs w:val="20"/>
-        </w:rPr>
-        <w:t>[Applicable standards, licences, certifications, or regulatory requirements]</w:t>
-      </w:r>
-    </w:p>
-    <w:p>
-      <w:pPr>
-        <w:pStyle w:val="ListParagraph"/>
-        <w:numPr>
-          <w:ilvl w:val="0"/>
-          <w:numId w:val="1"/>
-        </w:numPr>
-        <w:rPr>
-          <w:sz w:val="20"/>
-          <w:szCs w:val="20"/>
-        </w:rPr>
-      </w:pPr>
-      <w:r>
-        <w:rPr>
-          <w:sz w:val="20"/>
-          <w:szCs w:val="20"/>
-        </w:rPr>
-        <w:t>[Implementation, installation, integration, training, or support requirements]</w:t>
-      </w:r>
-    </w:p>
-    <w:p>
-      <w:pPr>
-        <w:pStyle w:val="ListParagraph"/>
-        <w:numPr>
-          <w:ilvl w:val="0"/>
-          <w:numId w:val="1"/>
-        </w:numPr>
-        <w:rPr>
-          <w:sz w:val="20"/>
-          <w:szCs w:val="20"/>
-        </w:rPr>
-      </w:pPr>
-      <w:r>
-        <w:rPr>
-          <w:sz w:val="20"/>
-          <w:szCs w:val="20"/>
-        </w:rPr>
-        <w:t>[Warranty, maintenance, service levels, and response times]</w:t>
-      </w:r>
-    </w:p>
-    <w:p>
-      <w:pPr>
-        <w:pStyle w:val="ListParagraph"/>
-        <w:numPr>
-          <w:ilvl w:val="0"/>
-          <w:numId w:val="1"/>
-        </w:numPr>
-        <w:rPr>
-          <w:sz w:val="20"/>
-          <w:szCs w:val="20"/>
-        </w:rPr>
-      </w:pPr>
-      <w:r>
-        <w:rPr>
-          <w:sz w:val="20"/>
-          <w:szCs w:val="20"/>
-        </w:rPr>
-        <w:t>[Security, privacy, sustainability, accessibility, or insurance requirements]</w:t>
-      </w:r>
-    </w:p>
-    <w:p>
-      <w:pPr>
-        <w:pStyle w:val="Heading1"/>
-        <w:rPr>
-          <w:rFonts w:asciiTheme="minorHAnsi" w:hAnsiTheme="minorHAnsi" w:cstheme="minorBidi"/>
-          <w:kern w:val="36"/>
-          <w:sz w:val="48"/>
-          <w:szCs w:val="48"/>
-          <w:lang w:eastAsia="en-GB"/>
-          <w14:ligatures w14:val="none"/>
-        </w:rPr>
-      </w:pPr>
-      <w:r>
-        <w:rPr>
-          <w:rFonts w:asciiTheme="minorHAnsi" w:hAnsiTheme="minorHAnsi" w:cstheme="minorBidi"/>
-        </w:rPr>
-        <w:t>5. Supplier Response</w:t>
+        <w:t>Combos</w:t>
       </w:r>
     </w:p>
     <w:tbl>
@@ -953,8 +885,11 @@
         <w:tblLook w:val="04A0" w:firstRow="1" w:lastRow="0" w:firstColumn="1" w:lastColumn="0" w:noHBand="0" w:noVBand="1"/>
       </w:tblPr>
       <w:tblGrid>
-        <w:gridCol w:w="3152"/>
-        <w:gridCol w:w="5864"/>
+        <w:gridCol w:w="2785"/>
+        <w:gridCol w:w="1972"/>
+        <w:gridCol w:w="1558"/>
+        <w:gridCol w:w="1573"/>
+        <w:gridCol w:w="1128"/>
       </w:tblGrid>
       <w:tr>
         <w:trPr>
@@ -970,13 +905,11 @@
             <w:pPr>
               <w:spacing w:after="160"/>
               <w:rPr>
-                <w:kern w:val="0"/>
-                <w:lang w:eastAsia="en-GB"/>
-                <w14:ligatures w14:val="none"/>
+                <w:lang w:eastAsia="en-AU"/>
               </w:rPr>
             </w:pPr>
             <w:r>
-              <w:t>Supplier legal name</w:t>
+              <w:t>Combo</w:t>
             </w:r>
           </w:p>
         </w:tc>
@@ -991,7 +924,52 @@
               <w:cnfStyle w:val="100000000000" w:firstRow="1" w:lastRow="0" w:firstColumn="0" w:lastColumn="0" w:oddVBand="0" w:evenVBand="0" w:oddHBand="0" w:evenHBand="0" w:firstRowFirstColumn="0" w:firstRowLastColumn="0" w:lastRowFirstColumn="0" w:lastRowLastColumn="0"/>
             </w:pPr>
             <w:r>
-              <w:t>[Enter response]</w:t>
+              <w:t>Description</w:t>
+            </w:r>
+          </w:p>
+        </w:tc>
+        <w:tc>
+          <w:tcPr>
+            <w:tcW w:w="0" w:type="auto"/>
+            <w:hideMark/>
+          </w:tcPr>
+          <w:p>
+            <w:pPr>
+              <w:spacing w:after="160"/>
+              <w:cnfStyle w:val="100000000000" w:firstRow="1" w:lastRow="0" w:firstColumn="0" w:lastColumn="0" w:oddVBand="0" w:evenVBand="0" w:oddHBand="0" w:evenHBand="0" w:firstRowFirstColumn="0" w:firstRowLastColumn="0" w:lastRowFirstColumn="0" w:lastRowLastColumn="0"/>
+            </w:pPr>
+            <w:r>
+              <w:t>Quantity</w:t>
+            </w:r>
+          </w:p>
+        </w:tc>
+        <w:tc>
+          <w:tcPr>
+            <w:tcW w:w="0" w:type="auto"/>
+            <w:hideMark/>
+          </w:tcPr>
+          <w:p>
+            <w:pPr>
+              <w:spacing w:after="160"/>
+              <w:cnfStyle w:val="100000000000" w:firstRow="1" w:lastRow="0" w:firstColumn="0" w:lastColumn="0" w:oddVBand="0" w:evenVBand="0" w:oddHBand="0" w:evenHBand="0" w:firstRowFirstColumn="0" w:firstRowLastColumn="0" w:lastRowFirstColumn="0" w:lastRowLastColumn="0"/>
+            </w:pPr>
+            <w:r>
+              <w:t>Subtotal</w:t>
+            </w:r>
+          </w:p>
+        </w:tc>
+        <w:tc>
+          <w:tcPr>
+            <w:tcW w:w="0" w:type="auto"/>
+            <w:hideMark/>
+          </w:tcPr>
+          <w:p>
+            <w:pPr>
+              <w:spacing w:after="160"/>
+              <w:cnfStyle w:val="100000000000" w:firstRow="1" w:lastRow="0" w:firstColumn="0" w:lastColumn="0" w:oddVBand="0" w:evenVBand="0" w:oddHBand="0" w:evenHBand="0" w:firstRowFirstColumn="0" w:firstRowLastColumn="0" w:lastRowFirstColumn="0" w:lastRowLastColumn="0"/>
+            </w:pPr>
+            <w:r>
+              <w:t>Notes</w:t>
             </w:r>
           </w:p>
         </w:tc>
@@ -1011,7 +989,15 @@
               <w:spacing w:after="160"/>
             </w:pPr>
             <w:r>
-              <w:t>ABN / registration number</w:t>
+              <w:t>{#</w:t>
+            </w:r>
+            <w:proofErr w:type="gramStart"/>
+            <w:r>
+              <w:t>combos}{</w:t>
+            </w:r>
+            <w:proofErr w:type="gramEnd"/>
+            <w:r>
+              <w:t>name}</w:t>
             </w:r>
           </w:p>
         </w:tc>
@@ -1026,59 +1012,7 @@
               <w:cnfStyle w:val="000000100000" w:firstRow="0" w:lastRow="0" w:firstColumn="0" w:lastColumn="0" w:oddVBand="0" w:evenVBand="0" w:oddHBand="1" w:evenHBand="0" w:firstRowFirstColumn="0" w:firstRowLastColumn="0" w:lastRowFirstColumn="0" w:lastRowLastColumn="0"/>
             </w:pPr>
             <w:r>
-              <w:t>[Enter response]</w:t>
-            </w:r>
-          </w:p>
-        </w:tc>
-      </w:tr>
-      <w:tr>
-        <w:tc>
-          <w:tcPr>
-            <w:cnfStyle w:val="001000000000" w:firstRow="0" w:lastRow="0" w:firstColumn="1" w:lastColumn="0" w:oddVBand="0" w:evenVBand="0" w:oddHBand="0" w:evenHBand="0" w:firstRowFirstColumn="0" w:firstRowLastColumn="0" w:lastRowFirstColumn="0" w:lastRowLastColumn="0"/>
-            <w:tcW w:w="0" w:type="auto"/>
-            <w:hideMark/>
-          </w:tcPr>
-          <w:p>
-            <w:pPr>
-              <w:spacing w:after="160"/>
-            </w:pPr>
-            <w:r>
-              <w:t>Address</w:t>
-            </w:r>
-          </w:p>
-        </w:tc>
-        <w:tc>
-          <w:tcPr>
-            <w:tcW w:w="0" w:type="auto"/>
-            <w:hideMark/>
-          </w:tcPr>
-          <w:p>
-            <w:pPr>
-              <w:spacing w:after="160"/>
-              <w:cnfStyle w:val="000000000000" w:firstRow="0" w:lastRow="0" w:firstColumn="0" w:lastColumn="0" w:oddVBand="0" w:evenVBand="0" w:oddHBand="0" w:evenHBand="0" w:firstRowFirstColumn="0" w:firstRowLastColumn="0" w:lastRowFirstColumn="0" w:lastRowLastColumn="0"/>
-            </w:pPr>
-            <w:r>
-              <w:t>[Enter response]</w:t>
-            </w:r>
-          </w:p>
-        </w:tc>
-      </w:tr>
-      <w:tr>
-        <w:trPr>
-          <w:cnfStyle w:val="000000100000" w:firstRow="0" w:lastRow="0" w:firstColumn="0" w:lastColumn="0" w:oddVBand="0" w:evenVBand="0" w:oddHBand="1" w:evenHBand="0" w:firstRowFirstColumn="0" w:firstRowLastColumn="0" w:lastRowFirstColumn="0" w:lastRowLastColumn="0"/>
-        </w:trPr>
-        <w:tc>
-          <w:tcPr>
-            <w:cnfStyle w:val="001000000000" w:firstRow="0" w:lastRow="0" w:firstColumn="1" w:lastColumn="0" w:oddVBand="0" w:evenVBand="0" w:oddHBand="0" w:evenHBand="0" w:firstRowFirstColumn="0" w:firstRowLastColumn="0" w:lastRowFirstColumn="0" w:lastRowLastColumn="0"/>
-            <w:tcW w:w="0" w:type="auto"/>
-            <w:hideMark/>
-          </w:tcPr>
-          <w:p>
-            <w:pPr>
-              <w:spacing w:after="160"/>
-            </w:pPr>
-            <w:r>
-              <w:t>Primary contact</w:t>
+              <w:t>{description}</w:t>
             </w:r>
           </w:p>
         </w:tc>
@@ -1093,59 +1027,7 @@
               <w:cnfStyle w:val="000000100000" w:firstRow="0" w:lastRow="0" w:firstColumn="0" w:lastColumn="0" w:oddVBand="0" w:evenVBand="0" w:oddHBand="1" w:evenHBand="0" w:firstRowFirstColumn="0" w:firstRowLastColumn="0" w:lastRowFirstColumn="0" w:lastRowLastColumn="0"/>
             </w:pPr>
             <w:r>
-              <w:t>[Name, role, email, phone]</w:t>
-            </w:r>
-          </w:p>
-        </w:tc>
-      </w:tr>
-      <w:tr>
-        <w:tc>
-          <w:tcPr>
-            <w:cnfStyle w:val="001000000000" w:firstRow="0" w:lastRow="0" w:firstColumn="1" w:lastColumn="0" w:oddVBand="0" w:evenVBand="0" w:oddHBand="0" w:evenHBand="0" w:firstRowFirstColumn="0" w:firstRowLastColumn="0" w:lastRowFirstColumn="0" w:lastRowLastColumn="0"/>
-            <w:tcW w:w="0" w:type="auto"/>
-            <w:hideMark/>
-          </w:tcPr>
-          <w:p>
-            <w:pPr>
-              <w:spacing w:after="160"/>
-            </w:pPr>
-            <w:r>
-              <w:t>Relevant experience</w:t>
-            </w:r>
-          </w:p>
-        </w:tc>
-        <w:tc>
-          <w:tcPr>
-            <w:tcW w:w="0" w:type="auto"/>
-            <w:hideMark/>
-          </w:tcPr>
-          <w:p>
-            <w:pPr>
-              <w:spacing w:after="160"/>
-              <w:cnfStyle w:val="000000000000" w:firstRow="0" w:lastRow="0" w:firstColumn="0" w:lastColumn="0" w:oddVBand="0" w:evenVBand="0" w:oddHBand="0" w:evenHBand="0" w:firstRowFirstColumn="0" w:firstRowLastColumn="0" w:lastRowFirstColumn="0" w:lastRowLastColumn="0"/>
-            </w:pPr>
-            <w:r>
-              <w:t>[Summary and references]</w:t>
-            </w:r>
-          </w:p>
-        </w:tc>
-      </w:tr>
-      <w:tr>
-        <w:trPr>
-          <w:cnfStyle w:val="000000100000" w:firstRow="0" w:lastRow="0" w:firstColumn="0" w:lastColumn="0" w:oddVBand="0" w:evenVBand="0" w:oddHBand="1" w:evenHBand="0" w:firstRowFirstColumn="0" w:firstRowLastColumn="0" w:lastRowFirstColumn="0" w:lastRowLastColumn="0"/>
-        </w:trPr>
-        <w:tc>
-          <w:tcPr>
-            <w:cnfStyle w:val="001000000000" w:firstRow="0" w:lastRow="0" w:firstColumn="1" w:lastColumn="0" w:oddVBand="0" w:evenVBand="0" w:oddHBand="0" w:evenHBand="0" w:firstRowFirstColumn="0" w:firstRowLastColumn="0" w:lastRowFirstColumn="0" w:lastRowLastColumn="0"/>
-            <w:tcW w:w="0" w:type="auto"/>
-            <w:hideMark/>
-          </w:tcPr>
-          <w:p>
-            <w:pPr>
-              <w:spacing w:after="160"/>
-            </w:pPr>
-            <w:r>
-              <w:t>Proposed approach</w:t>
+              <w:t>{quantity}</w:t>
             </w:r>
           </w:p>
         </w:tc>
@@ -1160,39 +1042,22 @@
               <w:cnfStyle w:val="000000100000" w:firstRow="0" w:lastRow="0" w:firstColumn="0" w:lastColumn="0" w:oddVBand="0" w:evenVBand="0" w:oddHBand="1" w:evenHBand="0" w:firstRowFirstColumn="0" w:firstRowLastColumn="0" w:lastRowFirstColumn="0" w:lastRowLastColumn="0"/>
             </w:pPr>
             <w:r>
-              <w:t>[Method, delivery plan, personnel, and assumptions]</w:t>
-            </w:r>
-          </w:p>
-        </w:tc>
-      </w:tr>
-      <w:tr>
-        <w:tc>
-          <w:tcPr>
-            <w:cnfStyle w:val="001000000000" w:firstRow="0" w:lastRow="0" w:firstColumn="1" w:lastColumn="0" w:oddVBand="0" w:evenVBand="0" w:oddHBand="0" w:evenHBand="0" w:firstRowFirstColumn="0" w:firstRowLastColumn="0" w:lastRowFirstColumn="0" w:lastRowLastColumn="0"/>
-            <w:tcW w:w="0" w:type="auto"/>
-            <w:hideMark/>
-          </w:tcPr>
-          <w:p>
-            <w:pPr>
-              <w:spacing w:after="160"/>
-            </w:pPr>
-            <w:r>
-              <w:t>Subcontractors</w:t>
-            </w:r>
-          </w:p>
-        </w:tc>
-        <w:tc>
-          <w:tcPr>
-            <w:tcW w:w="0" w:type="auto"/>
-            <w:hideMark/>
-          </w:tcPr>
-          <w:p>
-            <w:pPr>
-              <w:spacing w:after="160"/>
-              <w:cnfStyle w:val="000000000000" w:firstRow="0" w:lastRow="0" w:firstColumn="0" w:lastColumn="0" w:oddVBand="0" w:evenVBand="0" w:oddHBand="0" w:evenHBand="0" w:firstRowFirstColumn="0" w:firstRowLastColumn="0" w:lastRowFirstColumn="0" w:lastRowLastColumn="0"/>
-            </w:pPr>
-            <w:r>
-              <w:t>[Names, roles, or “None”]</w:t>
+              <w:t>{subtotal}</w:t>
+            </w:r>
+          </w:p>
+        </w:tc>
+        <w:tc>
+          <w:tcPr>
+            <w:tcW w:w="0" w:type="auto"/>
+            <w:hideMark/>
+          </w:tcPr>
+          <w:p>
+            <w:pPr>
+              <w:spacing w:after="160"/>
+              <w:cnfStyle w:val="000000100000" w:firstRow="0" w:lastRow="0" w:firstColumn="0" w:lastColumn="0" w:oddVBand="0" w:evenVBand="0" w:oddHBand="1" w:evenHBand="0" w:firstRowFirstColumn="0" w:firstRowLastColumn="0" w:lastRowFirstColumn="0" w:lastRowLastColumn="0"/>
+            </w:pPr>
+            <w:r>
+              <w:t>{note}</w:t>
             </w:r>
           </w:p>
         </w:tc>
@@ -1201,42 +1066,9 @@
     <w:p>
       <w:pPr>
         <w:rPr>
-          <w:kern w:val="0"/>
-          <w:lang w:eastAsia="en-GB"/>
-          <w14:ligatures w14:val="none"/>
+          <w:lang w:eastAsia="en-AU"/>
         </w:rPr>
       </w:pPr>
-    </w:p>
-    <w:p>
-      <w:pPr>
-        <w:pStyle w:val="Heading1"/>
-        <w:rPr>
-          <w:rFonts w:asciiTheme="minorHAnsi" w:hAnsiTheme="minorHAnsi" w:cstheme="minorBidi"/>
-          <w:kern w:val="36"/>
-          <w:sz w:val="48"/>
-          <w:szCs w:val="48"/>
-          <w:lang w:eastAsia="en-GB"/>
-          <w14:ligatures w14:val="none"/>
-        </w:rPr>
-      </w:pPr>
-      <w:r>
-        <w:rPr>
-          <w:rFonts w:asciiTheme="minorHAnsi" w:hAnsiTheme="minorHAnsi" w:cstheme="minorBidi"/>
-        </w:rPr>
-        <w:t>6. Pricing Schedule</w:t>
-      </w:r>
-    </w:p>
-    <w:p>
-      <w:pPr>
-        <w:rPr>
-          <w:kern w:val="0"/>
-          <w:lang w:eastAsia="en-GB"/>
-          <w14:ligatures w14:val="none"/>
-        </w:rPr>
-      </w:pPr>
-      <w:r>
-        <w:t>State all prices in [currency], identify whether tax is included or excluded, and disclose every fee, charge, assumption, and optional cost.</w:t>
-      </w:r>
     </w:p>
     <w:tbl>
       <w:tblPr>
@@ -1245,12 +1077,14 @@
         <w:tblLook w:val="04A0" w:firstRow="1" w:lastRow="0" w:firstColumn="1" w:lastColumn="0" w:noHBand="0" w:noVBand="1"/>
       </w:tblPr>
       <w:tblGrid>
-        <w:gridCol w:w="907"/>
-        <w:gridCol w:w="1972"/>
-        <w:gridCol w:w="1461"/>
-        <w:gridCol w:w="1617"/>
         <w:gridCol w:w="1490"/>
-        <w:gridCol w:w="1569"/>
+        <w:gridCol w:w="1207"/>
+        <w:gridCol w:w="995"/>
+        <w:gridCol w:w="962"/>
+        <w:gridCol w:w="1048"/>
+        <w:gridCol w:w="556"/>
+        <w:gridCol w:w="682"/>
+        <w:gridCol w:w="2076"/>
       </w:tblGrid>
       <w:tr>
         <w:trPr>
@@ -1266,13 +1100,12 @@
             <w:pPr>
               <w:spacing w:after="160"/>
               <w:rPr>
-                <w:kern w:val="0"/>
-                <w:lang w:eastAsia="en-GB"/>
-                <w14:ligatures w14:val="none"/>
+                <w:lang w:eastAsia="en-AU"/>
               </w:rPr>
             </w:pPr>
             <w:r>
-              <w:t>Item</w:t>
+              <w:lastRenderedPageBreak/>
+              <w:t>Combo Item</w:t>
             </w:r>
           </w:p>
         </w:tc>
@@ -1302,6 +1135,21 @@
               <w:cnfStyle w:val="100000000000" w:firstRow="1" w:lastRow="0" w:firstColumn="0" w:lastColumn="0" w:oddVBand="0" w:evenVBand="0" w:oddHBand="0" w:evenHBand="0" w:firstRowFirstColumn="0" w:firstRowLastColumn="0" w:lastRowFirstColumn="0" w:lastRowLastColumn="0"/>
             </w:pPr>
             <w:r>
+              <w:t>Category</w:t>
+            </w:r>
+          </w:p>
+        </w:tc>
+        <w:tc>
+          <w:tcPr>
+            <w:tcW w:w="0" w:type="auto"/>
+            <w:hideMark/>
+          </w:tcPr>
+          <w:p>
+            <w:pPr>
+              <w:spacing w:after="160"/>
+              <w:cnfStyle w:val="100000000000" w:firstRow="1" w:lastRow="0" w:firstColumn="0" w:lastColumn="0" w:oddVBand="0" w:evenVBand="0" w:oddHBand="0" w:evenHBand="0" w:firstRowFirstColumn="0" w:firstRowLastColumn="0" w:lastRowFirstColumn="0" w:lastRowLastColumn="0"/>
+            </w:pPr>
+            <w:r>
               <w:t>Quantity</w:t>
             </w:r>
           </w:p>
@@ -1317,7 +1165,7 @@
               <w:cnfStyle w:val="100000000000" w:firstRow="1" w:lastRow="0" w:firstColumn="0" w:lastColumn="0" w:oddVBand="0" w:evenVBand="0" w:oddHBand="0" w:evenHBand="0" w:firstRowFirstColumn="0" w:firstRowLastColumn="0" w:lastRowFirstColumn="0" w:lastRowLastColumn="0"/>
             </w:pPr>
             <w:r>
-              <w:t>Unit price</w:t>
+              <w:t>Unit Cost</w:t>
             </w:r>
           </w:p>
         </w:tc>
@@ -1347,7 +1195,22 @@
               <w:cnfStyle w:val="100000000000" w:firstRow="1" w:lastRow="0" w:firstColumn="0" w:lastColumn="0" w:oddVBand="0" w:evenVBand="0" w:oddHBand="0" w:evenHBand="0" w:firstRowFirstColumn="0" w:firstRowLastColumn="0" w:lastRowFirstColumn="0" w:lastRowLastColumn="0"/>
             </w:pPr>
             <w:r>
-              <w:t>Line total</w:t>
+              <w:t>Total</w:t>
+            </w:r>
+          </w:p>
+        </w:tc>
+        <w:tc>
+          <w:tcPr>
+            <w:tcW w:w="0" w:type="auto"/>
+            <w:hideMark/>
+          </w:tcPr>
+          <w:p>
+            <w:pPr>
+              <w:spacing w:after="160"/>
+              <w:cnfStyle w:val="100000000000" w:firstRow="1" w:lastRow="0" w:firstColumn="0" w:lastColumn="0" w:oddVBand="0" w:evenVBand="0" w:oddHBand="0" w:evenHBand="0" w:firstRowFirstColumn="0" w:firstRowLastColumn="0" w:lastRowFirstColumn="0" w:lastRowLastColumn="0"/>
+            </w:pPr>
+            <w:r>
+              <w:t>Notes</w:t>
             </w:r>
           </w:p>
         </w:tc>
@@ -1367,7 +1230,15 @@
               <w:spacing w:after="160"/>
             </w:pPr>
             <w:r>
-              <w:t>[1]</w:t>
+              <w:t>{#</w:t>
+            </w:r>
+            <w:proofErr w:type="gramStart"/>
+            <w:r>
+              <w:t>items}{</w:t>
+            </w:r>
+            <w:proofErr w:type="gramEnd"/>
+            <w:r>
+              <w:t>name}</w:t>
             </w:r>
           </w:p>
         </w:tc>
@@ -1382,7 +1253,7 @@
               <w:cnfStyle w:val="000000100000" w:firstRow="0" w:lastRow="0" w:firstColumn="0" w:lastColumn="0" w:oddVBand="0" w:evenVBand="0" w:oddHBand="1" w:evenHBand="0" w:firstRowFirstColumn="0" w:firstRowLastColumn="0" w:lastRowFirstColumn="0" w:lastRowLastColumn="0"/>
             </w:pPr>
             <w:r>
-              <w:t>[Description]</w:t>
+              <w:t>{description}</w:t>
             </w:r>
           </w:p>
         </w:tc>
@@ -1397,7 +1268,7 @@
               <w:cnfStyle w:val="000000100000" w:firstRow="0" w:lastRow="0" w:firstColumn="0" w:lastColumn="0" w:oddVBand="0" w:evenVBand="0" w:oddHBand="1" w:evenHBand="0" w:firstRowFirstColumn="0" w:firstRowLastColumn="0" w:lastRowFirstColumn="0" w:lastRowLastColumn="0"/>
             </w:pPr>
             <w:r>
-              <w:t>[Qty]</w:t>
+              <w:t>{category}</w:t>
             </w:r>
           </w:p>
         </w:tc>
@@ -1412,7 +1283,7 @@
               <w:cnfStyle w:val="000000100000" w:firstRow="0" w:lastRow="0" w:firstColumn="0" w:lastColumn="0" w:oddVBand="0" w:evenVBand="0" w:oddHBand="1" w:evenHBand="0" w:firstRowFirstColumn="0" w:firstRowLastColumn="0" w:lastRowFirstColumn="0" w:lastRowLastColumn="0"/>
             </w:pPr>
             <w:r>
-              <w:t>[Amount]</w:t>
+              <w:t>{quantity}</w:t>
             </w:r>
           </w:p>
         </w:tc>
@@ -1427,7 +1298,15 @@
               <w:cnfStyle w:val="000000100000" w:firstRow="0" w:lastRow="0" w:firstColumn="0" w:lastColumn="0" w:oddVBand="0" w:evenVBand="0" w:oddHBand="1" w:evenHBand="0" w:firstRowFirstColumn="0" w:firstRowLastColumn="0" w:lastRowFirstColumn="0" w:lastRowLastColumn="0"/>
             </w:pPr>
             <w:r>
-              <w:t>[Amount]</w:t>
+              <w:t>{</w:t>
+            </w:r>
+            <w:proofErr w:type="spellStart"/>
+            <w:r>
+              <w:t>unit_cost</w:t>
+            </w:r>
+            <w:proofErr w:type="spellEnd"/>
+            <w:r>
+              <w:t>}</w:t>
             </w:r>
           </w:p>
         </w:tc>
@@ -1442,120 +1321,7 @@
               <w:cnfStyle w:val="000000100000" w:firstRow="0" w:lastRow="0" w:firstColumn="0" w:lastColumn="0" w:oddVBand="0" w:evenVBand="0" w:oddHBand="1" w:evenHBand="0" w:firstRowFirstColumn="0" w:firstRowLastColumn="0" w:lastRowFirstColumn="0" w:lastRowLastColumn="0"/>
             </w:pPr>
             <w:r>
-              <w:t>[Amount]</w:t>
-            </w:r>
-          </w:p>
-        </w:tc>
-      </w:tr>
-      <w:tr>
-        <w:tc>
-          <w:tcPr>
-            <w:cnfStyle w:val="001000000000" w:firstRow="0" w:lastRow="0" w:firstColumn="1" w:lastColumn="0" w:oddVBand="0" w:evenVBand="0" w:oddHBand="0" w:evenHBand="0" w:firstRowFirstColumn="0" w:firstRowLastColumn="0" w:lastRowFirstColumn="0" w:lastRowLastColumn="0"/>
-            <w:tcW w:w="0" w:type="auto"/>
-            <w:hideMark/>
-          </w:tcPr>
-          <w:p>
-            <w:pPr>
-              <w:spacing w:after="160"/>
-            </w:pPr>
-            <w:r>
-              <w:t>[2]</w:t>
-            </w:r>
-          </w:p>
-        </w:tc>
-        <w:tc>
-          <w:tcPr>
-            <w:tcW w:w="0" w:type="auto"/>
-            <w:hideMark/>
-          </w:tcPr>
-          <w:p>
-            <w:pPr>
-              <w:spacing w:after="160"/>
-              <w:cnfStyle w:val="000000000000" w:firstRow="0" w:lastRow="0" w:firstColumn="0" w:lastColumn="0" w:oddVBand="0" w:evenVBand="0" w:oddHBand="0" w:evenHBand="0" w:firstRowFirstColumn="0" w:firstRowLastColumn="0" w:lastRowFirstColumn="0" w:lastRowLastColumn="0"/>
-            </w:pPr>
-            <w:r>
-              <w:t>[Description]</w:t>
-            </w:r>
-          </w:p>
-        </w:tc>
-        <w:tc>
-          <w:tcPr>
-            <w:tcW w:w="0" w:type="auto"/>
-            <w:hideMark/>
-          </w:tcPr>
-          <w:p>
-            <w:pPr>
-              <w:spacing w:after="160"/>
-              <w:cnfStyle w:val="000000000000" w:firstRow="0" w:lastRow="0" w:firstColumn="0" w:lastColumn="0" w:oddVBand="0" w:evenVBand="0" w:oddHBand="0" w:evenHBand="0" w:firstRowFirstColumn="0" w:firstRowLastColumn="0" w:lastRowFirstColumn="0" w:lastRowLastColumn="0"/>
-            </w:pPr>
-            <w:r>
-              <w:t>[Qty]</w:t>
-            </w:r>
-          </w:p>
-        </w:tc>
-        <w:tc>
-          <w:tcPr>
-            <w:tcW w:w="0" w:type="auto"/>
-            <w:hideMark/>
-          </w:tcPr>
-          <w:p>
-            <w:pPr>
-              <w:spacing w:after="160"/>
-              <w:cnfStyle w:val="000000000000" w:firstRow="0" w:lastRow="0" w:firstColumn="0" w:lastColumn="0" w:oddVBand="0" w:evenVBand="0" w:oddHBand="0" w:evenHBand="0" w:firstRowFirstColumn="0" w:firstRowLastColumn="0" w:lastRowFirstColumn="0" w:lastRowLastColumn="0"/>
-            </w:pPr>
-            <w:r>
-              <w:t>[Amount]</w:t>
-            </w:r>
-          </w:p>
-        </w:tc>
-        <w:tc>
-          <w:tcPr>
-            <w:tcW w:w="0" w:type="auto"/>
-            <w:hideMark/>
-          </w:tcPr>
-          <w:p>
-            <w:pPr>
-              <w:spacing w:after="160"/>
-              <w:cnfStyle w:val="000000000000" w:firstRow="0" w:lastRow="0" w:firstColumn="0" w:lastColumn="0" w:oddVBand="0" w:evenVBand="0" w:oddHBand="0" w:evenHBand="0" w:firstRowFirstColumn="0" w:firstRowLastColumn="0" w:lastRowFirstColumn="0" w:lastRowLastColumn="0"/>
-            </w:pPr>
-            <w:r>
-              <w:t>[Amount]</w:t>
-            </w:r>
-          </w:p>
-        </w:tc>
-        <w:tc>
-          <w:tcPr>
-            <w:tcW w:w="0" w:type="auto"/>
-            <w:hideMark/>
-          </w:tcPr>
-          <w:p>
-            <w:pPr>
-              <w:spacing w:after="160"/>
-              <w:cnfStyle w:val="000000000000" w:firstRow="0" w:lastRow="0" w:firstColumn="0" w:lastColumn="0" w:oddVBand="0" w:evenVBand="0" w:oddHBand="0" w:evenHBand="0" w:firstRowFirstColumn="0" w:firstRowLastColumn="0" w:lastRowFirstColumn="0" w:lastRowLastColumn="0"/>
-            </w:pPr>
-            <w:r>
-              <w:t>[Amount]</w:t>
-            </w:r>
-          </w:p>
-        </w:tc>
-      </w:tr>
-      <w:tr>
-        <w:trPr>
-          <w:cnfStyle w:val="000000100000" w:firstRow="0" w:lastRow="0" w:firstColumn="0" w:lastColumn="0" w:oddVBand="0" w:evenVBand="0" w:oddHBand="1" w:evenHBand="0" w:firstRowFirstColumn="0" w:firstRowLastColumn="0" w:lastRowFirstColumn="0" w:lastRowLastColumn="0"/>
-        </w:trPr>
-        <w:tc>
-          <w:tcPr>
-            <w:cnfStyle w:val="001000000000" w:firstRow="0" w:lastRow="0" w:firstColumn="1" w:lastColumn="0" w:oddVBand="0" w:evenVBand="0" w:oddHBand="0" w:evenHBand="0" w:firstRowFirstColumn="0" w:firstRowLastColumn="0" w:lastRowFirstColumn="0" w:lastRowLastColumn="0"/>
-            <w:tcW w:w="0" w:type="auto"/>
-            <w:gridSpan w:val="5"/>
-            <w:hideMark/>
-          </w:tcPr>
-          <w:p>
-            <w:pPr>
-              <w:spacing w:after="160"/>
-            </w:pPr>
-            <w:r>
-              <w:t>Subtotal</w:t>
+              <w:t>{tax}</w:t>
             </w:r>
           </w:p>
         </w:tc>
@@ -1570,61 +1336,7 @@
               <w:cnfStyle w:val="000000100000" w:firstRow="0" w:lastRow="0" w:firstColumn="0" w:lastColumn="0" w:oddVBand="0" w:evenVBand="0" w:oddHBand="1" w:evenHBand="0" w:firstRowFirstColumn="0" w:firstRowLastColumn="0" w:lastRowFirstColumn="0" w:lastRowLastColumn="0"/>
             </w:pPr>
             <w:r>
-              <w:t>[Amount]</w:t>
-            </w:r>
-          </w:p>
-        </w:tc>
-      </w:tr>
-      <w:tr>
-        <w:tc>
-          <w:tcPr>
-            <w:cnfStyle w:val="001000000000" w:firstRow="0" w:lastRow="0" w:firstColumn="1" w:lastColumn="0" w:oddVBand="0" w:evenVBand="0" w:oddHBand="0" w:evenHBand="0" w:firstRowFirstColumn="0" w:firstRowLastColumn="0" w:lastRowFirstColumn="0" w:lastRowLastColumn="0"/>
-            <w:tcW w:w="0" w:type="auto"/>
-            <w:gridSpan w:val="5"/>
-            <w:hideMark/>
-          </w:tcPr>
-          <w:p>
-            <w:pPr>
-              <w:spacing w:after="160"/>
-            </w:pPr>
-            <w:r>
-              <w:t>Total tax</w:t>
-            </w:r>
-          </w:p>
-        </w:tc>
-        <w:tc>
-          <w:tcPr>
-            <w:tcW w:w="0" w:type="auto"/>
-            <w:hideMark/>
-          </w:tcPr>
-          <w:p>
-            <w:pPr>
-              <w:spacing w:after="160"/>
-              <w:cnfStyle w:val="000000000000" w:firstRow="0" w:lastRow="0" w:firstColumn="0" w:lastColumn="0" w:oddVBand="0" w:evenVBand="0" w:oddHBand="0" w:evenHBand="0" w:firstRowFirstColumn="0" w:firstRowLastColumn="0" w:lastRowFirstColumn="0" w:lastRowLastColumn="0"/>
-            </w:pPr>
-            <w:r>
-              <w:t>[Amount]</w:t>
-            </w:r>
-          </w:p>
-        </w:tc>
-      </w:tr>
-      <w:tr>
-        <w:trPr>
-          <w:cnfStyle w:val="000000100000" w:firstRow="0" w:lastRow="0" w:firstColumn="0" w:lastColumn="0" w:oddVBand="0" w:evenVBand="0" w:oddHBand="1" w:evenHBand="0" w:firstRowFirstColumn="0" w:firstRowLastColumn="0" w:lastRowFirstColumn="0" w:lastRowLastColumn="0"/>
-        </w:trPr>
-        <w:tc>
-          <w:tcPr>
-            <w:cnfStyle w:val="001000000000" w:firstRow="0" w:lastRow="0" w:firstColumn="1" w:lastColumn="0" w:oddVBand="0" w:evenVBand="0" w:oddHBand="0" w:evenHBand="0" w:firstRowFirstColumn="0" w:firstRowLastColumn="0" w:lastRowFirstColumn="0" w:lastRowLastColumn="0"/>
-            <w:tcW w:w="0" w:type="auto"/>
-            <w:gridSpan w:val="5"/>
-            <w:hideMark/>
-          </w:tcPr>
-          <w:p>
-            <w:pPr>
-              <w:spacing w:after="160"/>
-            </w:pPr>
-            <w:r>
-              <w:t>Total quoted price</w:t>
+              <w:t>{total}</w:t>
             </w:r>
           </w:p>
         </w:tc>
@@ -1639,11 +1351,15 @@
               <w:cnfStyle w:val="000000100000" w:firstRow="0" w:lastRow="0" w:firstColumn="0" w:lastColumn="0" w:oddVBand="0" w:evenVBand="0" w:oddHBand="1" w:evenHBand="0" w:firstRowFirstColumn="0" w:firstRowLastColumn="0" w:lastRowFirstColumn="0" w:lastRowLastColumn="0"/>
             </w:pPr>
             <w:r>
-              <w:rPr>
-                <w:b/>
-                <w:bCs/>
-              </w:rPr>
-              <w:t>[Amount]</w:t>
+              <w:t>{note}{/</w:t>
+            </w:r>
+            <w:proofErr w:type="gramStart"/>
+            <w:r>
+              <w:t>items}{</w:t>
+            </w:r>
+            <w:proofErr w:type="gramEnd"/>
+            <w:r>
+              <w:t>/combos}</w:t>
             </w:r>
           </w:p>
         </w:tc>
@@ -1652,11 +1368,66 @@
     <w:p>
       <w:pPr>
         <w:rPr>
-          <w:kern w:val="0"/>
-          <w:lang w:eastAsia="en-GB"/>
-          <w14:ligatures w14:val="none"/>
+          <w:lang w:eastAsia="en-AU"/>
         </w:rPr>
       </w:pPr>
+    </w:p>
+    <w:p>
+      <w:pPr>
+        <w:pStyle w:val="Heading3"/>
+        <w:rPr>
+          <w:rFonts w:cstheme="minorBidi"/>
+          <w:sz w:val="27"/>
+          <w:szCs w:val="27"/>
+          <w:lang w:eastAsia="en-AU"/>
+        </w:rPr>
+      </w:pPr>
+      <w:r>
+        <w:rPr>
+          <w:rFonts w:cstheme="minorBidi"/>
+        </w:rPr>
+        <w:t>Scopes</w:t>
+      </w:r>
+    </w:p>
+    <w:p>
+      <w:pPr>
+        <w:rPr>
+          <w:lang w:eastAsia="en-AU"/>
+        </w:rPr>
+      </w:pPr>
+      <w:r>
+        <w:t>{#</w:t>
+      </w:r>
+      <w:proofErr w:type="gramStart"/>
+      <w:r>
+        <w:t>scopes}</w:t>
+      </w:r>
+      <w:r>
+        <w:rPr>
+          <w:b/>
+          <w:bCs/>
+        </w:rPr>
+        <w:t>{</w:t>
+      </w:r>
+      <w:proofErr w:type="gramEnd"/>
+      <w:r>
+        <w:rPr>
+          <w:b/>
+          <w:bCs/>
+        </w:rPr>
+        <w:t>name}</w:t>
+      </w:r>
+      <w:r>
+        <w:t xml:space="preserve"> — {description}</w:t>
+      </w:r>
+      <w:r>
+        <w:br/>
+        <w:t>Quantity: {quantity} | Subtotal: {subtotal}</w:t>
+      </w:r>
+      <w:r>
+        <w:br/>
+        <w:t>{note}</w:t>
+      </w:r>
     </w:p>
     <w:tbl>
       <w:tblPr>
@@ -1665,8 +1436,14 @@
         <w:tblLook w:val="04A0" w:firstRow="1" w:lastRow="0" w:firstColumn="1" w:lastColumn="0" w:noHBand="0" w:noVBand="1"/>
       </w:tblPr>
       <w:tblGrid>
-        <w:gridCol w:w="5017"/>
-        <w:gridCol w:w="3999"/>
+        <w:gridCol w:w="1648"/>
+        <w:gridCol w:w="1328"/>
+        <w:gridCol w:w="1090"/>
+        <w:gridCol w:w="1053"/>
+        <w:gridCol w:w="1149"/>
+        <w:gridCol w:w="597"/>
+        <w:gridCol w:w="739"/>
+        <w:gridCol w:w="1412"/>
       </w:tblGrid>
       <w:tr>
         <w:trPr>
@@ -1682,14 +1459,11 @@
             <w:pPr>
               <w:spacing w:after="160"/>
               <w:rPr>
-                <w:kern w:val="0"/>
-                <w:lang w:eastAsia="en-GB"/>
-                <w14:ligatures w14:val="none"/>
+                <w:lang w:eastAsia="en-AU"/>
               </w:rPr>
             </w:pPr>
             <w:r>
-              <w:lastRenderedPageBreak/>
-              <w:t>Pricing detail</w:t>
+              <w:t>Scope Item</w:t>
             </w:r>
           </w:p>
         </w:tc>
@@ -1704,7 +1478,97 @@
               <w:cnfStyle w:val="100000000000" w:firstRow="1" w:lastRow="0" w:firstColumn="0" w:lastColumn="0" w:oddVBand="0" w:evenVBand="0" w:oddHBand="0" w:evenHBand="0" w:firstRowFirstColumn="0" w:firstRowLastColumn="0" w:lastRowFirstColumn="0" w:lastRowLastColumn="0"/>
             </w:pPr>
             <w:r>
-              <w:t>Supplier response</w:t>
+              <w:t>Description</w:t>
+            </w:r>
+          </w:p>
+        </w:tc>
+        <w:tc>
+          <w:tcPr>
+            <w:tcW w:w="0" w:type="auto"/>
+            <w:hideMark/>
+          </w:tcPr>
+          <w:p>
+            <w:pPr>
+              <w:spacing w:after="160"/>
+              <w:cnfStyle w:val="100000000000" w:firstRow="1" w:lastRow="0" w:firstColumn="0" w:lastColumn="0" w:oddVBand="0" w:evenVBand="0" w:oddHBand="0" w:evenHBand="0" w:firstRowFirstColumn="0" w:firstRowLastColumn="0" w:lastRowFirstColumn="0" w:lastRowLastColumn="0"/>
+            </w:pPr>
+            <w:r>
+              <w:t>Category</w:t>
+            </w:r>
+          </w:p>
+        </w:tc>
+        <w:tc>
+          <w:tcPr>
+            <w:tcW w:w="0" w:type="auto"/>
+            <w:hideMark/>
+          </w:tcPr>
+          <w:p>
+            <w:pPr>
+              <w:spacing w:after="160"/>
+              <w:cnfStyle w:val="100000000000" w:firstRow="1" w:lastRow="0" w:firstColumn="0" w:lastColumn="0" w:oddVBand="0" w:evenVBand="0" w:oddHBand="0" w:evenHBand="0" w:firstRowFirstColumn="0" w:firstRowLastColumn="0" w:lastRowFirstColumn="0" w:lastRowLastColumn="0"/>
+            </w:pPr>
+            <w:r>
+              <w:t>Quantity</w:t>
+            </w:r>
+          </w:p>
+        </w:tc>
+        <w:tc>
+          <w:tcPr>
+            <w:tcW w:w="0" w:type="auto"/>
+            <w:hideMark/>
+          </w:tcPr>
+          <w:p>
+            <w:pPr>
+              <w:spacing w:after="160"/>
+              <w:cnfStyle w:val="100000000000" w:firstRow="1" w:lastRow="0" w:firstColumn="0" w:lastColumn="0" w:oddVBand="0" w:evenVBand="0" w:oddHBand="0" w:evenHBand="0" w:firstRowFirstColumn="0" w:firstRowLastColumn="0" w:lastRowFirstColumn="0" w:lastRowLastColumn="0"/>
+            </w:pPr>
+            <w:r>
+              <w:t>Unit Cost</w:t>
+            </w:r>
+          </w:p>
+        </w:tc>
+        <w:tc>
+          <w:tcPr>
+            <w:tcW w:w="0" w:type="auto"/>
+            <w:hideMark/>
+          </w:tcPr>
+          <w:p>
+            <w:pPr>
+              <w:spacing w:after="160"/>
+              <w:cnfStyle w:val="100000000000" w:firstRow="1" w:lastRow="0" w:firstColumn="0" w:lastColumn="0" w:oddVBand="0" w:evenVBand="0" w:oddHBand="0" w:evenHBand="0" w:firstRowFirstColumn="0" w:firstRowLastColumn="0" w:lastRowFirstColumn="0" w:lastRowLastColumn="0"/>
+            </w:pPr>
+            <w:r>
+              <w:t>Tax</w:t>
+            </w:r>
+          </w:p>
+        </w:tc>
+        <w:tc>
+          <w:tcPr>
+            <w:tcW w:w="0" w:type="auto"/>
+            <w:hideMark/>
+          </w:tcPr>
+          <w:p>
+            <w:pPr>
+              <w:spacing w:after="160"/>
+              <w:cnfStyle w:val="100000000000" w:firstRow="1" w:lastRow="0" w:firstColumn="0" w:lastColumn="0" w:oddVBand="0" w:evenVBand="0" w:oddHBand="0" w:evenHBand="0" w:firstRowFirstColumn="0" w:firstRowLastColumn="0" w:lastRowFirstColumn="0" w:lastRowLastColumn="0"/>
+            </w:pPr>
+            <w:r>
+              <w:t>Total</w:t>
+            </w:r>
+          </w:p>
+        </w:tc>
+        <w:tc>
+          <w:tcPr>
+            <w:tcW w:w="0" w:type="auto"/>
+            <w:hideMark/>
+          </w:tcPr>
+          <w:p>
+            <w:pPr>
+              <w:spacing w:after="160"/>
+              <w:cnfStyle w:val="100000000000" w:firstRow="1" w:lastRow="0" w:firstColumn="0" w:lastColumn="0" w:oddVBand="0" w:evenVBand="0" w:oddHBand="0" w:evenHBand="0" w:firstRowFirstColumn="0" w:firstRowLastColumn="0" w:lastRowFirstColumn="0" w:lastRowLastColumn="0"/>
+            </w:pPr>
+            <w:r>
+              <w:t>Notes</w:t>
             </w:r>
           </w:p>
         </w:tc>
@@ -1724,7 +1588,15 @@
               <w:spacing w:after="160"/>
             </w:pPr>
             <w:r>
-              <w:t>Optional items / alternatives</w:t>
+              <w:t>{#</w:t>
+            </w:r>
+            <w:proofErr w:type="gramStart"/>
+            <w:r>
+              <w:t>items}{</w:t>
+            </w:r>
+            <w:proofErr w:type="gramEnd"/>
+            <w:r>
+              <w:t>name}</w:t>
             </w:r>
           </w:p>
         </w:tc>
@@ -1739,59 +1611,7 @@
               <w:cnfStyle w:val="000000100000" w:firstRow="0" w:lastRow="0" w:firstColumn="0" w:lastColumn="0" w:oddVBand="0" w:evenVBand="0" w:oddHBand="1" w:evenHBand="0" w:firstRowFirstColumn="0" w:firstRowLastColumn="0" w:lastRowFirstColumn="0" w:lastRowLastColumn="0"/>
             </w:pPr>
             <w:r>
-              <w:t>[Description and price]</w:t>
-            </w:r>
-          </w:p>
-        </w:tc>
-      </w:tr>
-      <w:tr>
-        <w:tc>
-          <w:tcPr>
-            <w:cnfStyle w:val="001000000000" w:firstRow="0" w:lastRow="0" w:firstColumn="1" w:lastColumn="0" w:oddVBand="0" w:evenVBand="0" w:oddHBand="0" w:evenHBand="0" w:firstRowFirstColumn="0" w:firstRowLastColumn="0" w:lastRowFirstColumn="0" w:lastRowLastColumn="0"/>
-            <w:tcW w:w="0" w:type="auto"/>
-            <w:hideMark/>
-          </w:tcPr>
-          <w:p>
-            <w:pPr>
-              <w:spacing w:after="160"/>
-            </w:pPr>
-            <w:r>
-              <w:t>Discounts / volume tiers</w:t>
-            </w:r>
-          </w:p>
-        </w:tc>
-        <w:tc>
-          <w:tcPr>
-            <w:tcW w:w="0" w:type="auto"/>
-            <w:hideMark/>
-          </w:tcPr>
-          <w:p>
-            <w:pPr>
-              <w:spacing w:after="160"/>
-              <w:cnfStyle w:val="000000000000" w:firstRow="0" w:lastRow="0" w:firstColumn="0" w:lastColumn="0" w:oddVBand="0" w:evenVBand="0" w:oddHBand="0" w:evenHBand="0" w:firstRowFirstColumn="0" w:firstRowLastColumn="0" w:lastRowFirstColumn="0" w:lastRowLastColumn="0"/>
-            </w:pPr>
-            <w:r>
-              <w:t>[Details]</w:t>
-            </w:r>
-          </w:p>
-        </w:tc>
-      </w:tr>
-      <w:tr>
-        <w:trPr>
-          <w:cnfStyle w:val="000000100000" w:firstRow="0" w:lastRow="0" w:firstColumn="0" w:lastColumn="0" w:oddVBand="0" w:evenVBand="0" w:oddHBand="1" w:evenHBand="0" w:firstRowFirstColumn="0" w:firstRowLastColumn="0" w:lastRowFirstColumn="0" w:lastRowLastColumn="0"/>
-        </w:trPr>
-        <w:tc>
-          <w:tcPr>
-            <w:cnfStyle w:val="001000000000" w:firstRow="0" w:lastRow="0" w:firstColumn="1" w:lastColumn="0" w:oddVBand="0" w:evenVBand="0" w:oddHBand="0" w:evenHBand="0" w:firstRowFirstColumn="0" w:firstRowLastColumn="0" w:lastRowFirstColumn="0" w:lastRowLastColumn="0"/>
-            <w:tcW w:w="0" w:type="auto"/>
-            <w:hideMark/>
-          </w:tcPr>
-          <w:p>
-            <w:pPr>
-              <w:spacing w:after="160"/>
-            </w:pPr>
-            <w:r>
-              <w:t>Recurring charges</w:t>
+              <w:t>{description}</w:t>
             </w:r>
           </w:p>
         </w:tc>
@@ -1806,59 +1626,7 @@
               <w:cnfStyle w:val="000000100000" w:firstRow="0" w:lastRow="0" w:firstColumn="0" w:lastColumn="0" w:oddVBand="0" w:evenVBand="0" w:oddHBand="1" w:evenHBand="0" w:firstRowFirstColumn="0" w:firstRowLastColumn="0" w:lastRowFirstColumn="0" w:lastRowLastColumn="0"/>
             </w:pPr>
             <w:r>
-              <w:t>[Frequency, rate, indexation]</w:t>
-            </w:r>
-          </w:p>
-        </w:tc>
-      </w:tr>
-      <w:tr>
-        <w:tc>
-          <w:tcPr>
-            <w:cnfStyle w:val="001000000000" w:firstRow="0" w:lastRow="0" w:firstColumn="1" w:lastColumn="0" w:oddVBand="0" w:evenVBand="0" w:oddHBand="0" w:evenHBand="0" w:firstRowFirstColumn="0" w:firstRowLastColumn="0" w:lastRowFirstColumn="0" w:lastRowLastColumn="0"/>
-            <w:tcW w:w="0" w:type="auto"/>
-            <w:hideMark/>
-          </w:tcPr>
-          <w:p>
-            <w:pPr>
-              <w:spacing w:after="160"/>
-            </w:pPr>
-            <w:r>
-              <w:t>Travel, freight, duties, or expenses</w:t>
-            </w:r>
-          </w:p>
-        </w:tc>
-        <w:tc>
-          <w:tcPr>
-            <w:tcW w:w="0" w:type="auto"/>
-            <w:hideMark/>
-          </w:tcPr>
-          <w:p>
-            <w:pPr>
-              <w:spacing w:after="160"/>
-              <w:cnfStyle w:val="000000000000" w:firstRow="0" w:lastRow="0" w:firstColumn="0" w:lastColumn="0" w:oddVBand="0" w:evenVBand="0" w:oddHBand="0" w:evenHBand="0" w:firstRowFirstColumn="0" w:firstRowLastColumn="0" w:lastRowFirstColumn="0" w:lastRowLastColumn="0"/>
-            </w:pPr>
-            <w:r>
-              <w:t>[Details]</w:t>
-            </w:r>
-          </w:p>
-        </w:tc>
-      </w:tr>
-      <w:tr>
-        <w:trPr>
-          <w:cnfStyle w:val="000000100000" w:firstRow="0" w:lastRow="0" w:firstColumn="0" w:lastColumn="0" w:oddVBand="0" w:evenVBand="0" w:oddHBand="1" w:evenHBand="0" w:firstRowFirstColumn="0" w:firstRowLastColumn="0" w:lastRowFirstColumn="0" w:lastRowLastColumn="0"/>
-        </w:trPr>
-        <w:tc>
-          <w:tcPr>
-            <w:cnfStyle w:val="001000000000" w:firstRow="0" w:lastRow="0" w:firstColumn="1" w:lastColumn="0" w:oddVBand="0" w:evenVBand="0" w:oddHBand="0" w:evenHBand="0" w:firstRowFirstColumn="0" w:firstRowLastColumn="0" w:lastRowFirstColumn="0" w:lastRowLastColumn="0"/>
-            <w:tcW w:w="0" w:type="auto"/>
-            <w:hideMark/>
-          </w:tcPr>
-          <w:p>
-            <w:pPr>
-              <w:spacing w:after="160"/>
-            </w:pPr>
-            <w:r>
-              <w:t>Payment terms</w:t>
+              <w:t>{category}</w:t>
             </w:r>
           </w:p>
         </w:tc>
@@ -1873,39 +1641,75 @@
               <w:cnfStyle w:val="000000100000" w:firstRow="0" w:lastRow="0" w:firstColumn="0" w:lastColumn="0" w:oddVBand="0" w:evenVBand="0" w:oddHBand="1" w:evenHBand="0" w:firstRowFirstColumn="0" w:firstRowLastColumn="0" w:lastRowFirstColumn="0" w:lastRowLastColumn="0"/>
             </w:pPr>
             <w:r>
-              <w:t>[Details]</w:t>
-            </w:r>
-          </w:p>
-        </w:tc>
-      </w:tr>
-      <w:tr>
-        <w:tc>
-          <w:tcPr>
-            <w:cnfStyle w:val="001000000000" w:firstRow="0" w:lastRow="0" w:firstColumn="1" w:lastColumn="0" w:oddVBand="0" w:evenVBand="0" w:oddHBand="0" w:evenHBand="0" w:firstRowFirstColumn="0" w:firstRowLastColumn="0" w:lastRowFirstColumn="0" w:lastRowLastColumn="0"/>
-            <w:tcW w:w="0" w:type="auto"/>
-            <w:hideMark/>
-          </w:tcPr>
-          <w:p>
-            <w:pPr>
-              <w:spacing w:after="160"/>
-            </w:pPr>
-            <w:r>
-              <w:t>Quote validity</w:t>
-            </w:r>
-          </w:p>
-        </w:tc>
-        <w:tc>
-          <w:tcPr>
-            <w:tcW w:w="0" w:type="auto"/>
-            <w:hideMark/>
-          </w:tcPr>
-          <w:p>
-            <w:pPr>
-              <w:spacing w:after="160"/>
-              <w:cnfStyle w:val="000000000000" w:firstRow="0" w:lastRow="0" w:firstColumn="0" w:lastColumn="0" w:oddVBand="0" w:evenVBand="0" w:oddHBand="0" w:evenHBand="0" w:firstRowFirstColumn="0" w:firstRowLastColumn="0" w:lastRowFirstColumn="0" w:lastRowLastColumn="0"/>
-            </w:pPr>
-            <w:r>
-              <w:t>[Date / number of days]</w:t>
+              <w:t>{quantity}</w:t>
+            </w:r>
+          </w:p>
+        </w:tc>
+        <w:tc>
+          <w:tcPr>
+            <w:tcW w:w="0" w:type="auto"/>
+            <w:hideMark/>
+          </w:tcPr>
+          <w:p>
+            <w:pPr>
+              <w:spacing w:after="160"/>
+              <w:cnfStyle w:val="000000100000" w:firstRow="0" w:lastRow="0" w:firstColumn="0" w:lastColumn="0" w:oddVBand="0" w:evenVBand="0" w:oddHBand="1" w:evenHBand="0" w:firstRowFirstColumn="0" w:firstRowLastColumn="0" w:lastRowFirstColumn="0" w:lastRowLastColumn="0"/>
+            </w:pPr>
+            <w:r>
+              <w:t>{</w:t>
+            </w:r>
+            <w:proofErr w:type="spellStart"/>
+            <w:r>
+              <w:t>unit_cost</w:t>
+            </w:r>
+            <w:proofErr w:type="spellEnd"/>
+            <w:r>
+              <w:t>}</w:t>
+            </w:r>
+          </w:p>
+        </w:tc>
+        <w:tc>
+          <w:tcPr>
+            <w:tcW w:w="0" w:type="auto"/>
+            <w:hideMark/>
+          </w:tcPr>
+          <w:p>
+            <w:pPr>
+              <w:spacing w:after="160"/>
+              <w:cnfStyle w:val="000000100000" w:firstRow="0" w:lastRow="0" w:firstColumn="0" w:lastColumn="0" w:oddVBand="0" w:evenVBand="0" w:oddHBand="1" w:evenHBand="0" w:firstRowFirstColumn="0" w:firstRowLastColumn="0" w:lastRowFirstColumn="0" w:lastRowLastColumn="0"/>
+            </w:pPr>
+            <w:r>
+              <w:t>{tax}</w:t>
+            </w:r>
+          </w:p>
+        </w:tc>
+        <w:tc>
+          <w:tcPr>
+            <w:tcW w:w="0" w:type="auto"/>
+            <w:hideMark/>
+          </w:tcPr>
+          <w:p>
+            <w:pPr>
+              <w:spacing w:after="160"/>
+              <w:cnfStyle w:val="000000100000" w:firstRow="0" w:lastRow="0" w:firstColumn="0" w:lastColumn="0" w:oddVBand="0" w:evenVBand="0" w:oddHBand="1" w:evenHBand="0" w:firstRowFirstColumn="0" w:firstRowLastColumn="0" w:lastRowFirstColumn="0" w:lastRowLastColumn="0"/>
+            </w:pPr>
+            <w:r>
+              <w:t>{total}</w:t>
+            </w:r>
+          </w:p>
+        </w:tc>
+        <w:tc>
+          <w:tcPr>
+            <w:tcW w:w="0" w:type="auto"/>
+            <w:hideMark/>
+          </w:tcPr>
+          <w:p>
+            <w:pPr>
+              <w:spacing w:after="160"/>
+              <w:cnfStyle w:val="000000100000" w:firstRow="0" w:lastRow="0" w:firstColumn="0" w:lastColumn="0" w:oddVBand="0" w:evenVBand="0" w:oddHBand="1" w:evenHBand="0" w:firstRowFirstColumn="0" w:firstRowLastColumn="0" w:lastRowFirstColumn="0" w:lastRowLastColumn="0"/>
+            </w:pPr>
+            <w:r>
+              <w:t>{note}{/items}</w:t>
             </w:r>
           </w:p>
         </w:tc>
@@ -1914,30 +1718,9 @@
     <w:p>
       <w:pPr>
         <w:rPr>
-          <w:kern w:val="0"/>
-          <w:lang w:eastAsia="en-GB"/>
-          <w14:ligatures w14:val="none"/>
+          <w:lang w:eastAsia="en-AU"/>
         </w:rPr>
       </w:pPr>
-    </w:p>
-    <w:p>
-      <w:pPr>
-        <w:pStyle w:val="Heading1"/>
-        <w:rPr>
-          <w:rFonts w:asciiTheme="minorHAnsi" w:hAnsiTheme="minorHAnsi" w:cstheme="minorBidi"/>
-          <w:kern w:val="36"/>
-          <w:sz w:val="48"/>
-          <w:szCs w:val="48"/>
-          <w:lang w:eastAsia="en-GB"/>
-          <w14:ligatures w14:val="none"/>
-        </w:rPr>
-      </w:pPr>
-      <w:r>
-        <w:rPr>
-          <w:rFonts w:asciiTheme="minorHAnsi" w:hAnsiTheme="minorHAnsi" w:cstheme="minorBidi"/>
-        </w:rPr>
-        <w:t>7. Delivery and Implementation</w:t>
-      </w:r>
     </w:p>
     <w:tbl>
       <w:tblPr>
@@ -1946,9 +1729,11 @@
         <w:tblLook w:val="04A0" w:firstRow="1" w:lastRow="0" w:firstColumn="1" w:lastColumn="0" w:noHBand="0" w:noVBand="1"/>
       </w:tblPr>
       <w:tblGrid>
-        <w:gridCol w:w="3737"/>
-        <w:gridCol w:w="2152"/>
-        <w:gridCol w:w="3127"/>
+        <w:gridCol w:w="2785"/>
+        <w:gridCol w:w="1972"/>
+        <w:gridCol w:w="1558"/>
+        <w:gridCol w:w="1573"/>
+        <w:gridCol w:w="1128"/>
       </w:tblGrid>
       <w:tr>
         <w:trPr>
@@ -1964,13 +1749,11 @@
             <w:pPr>
               <w:spacing w:after="160"/>
               <w:rPr>
-                <w:kern w:val="0"/>
-                <w:lang w:eastAsia="en-GB"/>
-                <w14:ligatures w14:val="none"/>
+                <w:lang w:eastAsia="en-AU"/>
               </w:rPr>
             </w:pPr>
             <w:r>
-              <w:t>Milestone / deliverable</w:t>
+              <w:t>Scope Combo</w:t>
             </w:r>
           </w:p>
         </w:tc>
@@ -1985,7 +1768,7 @@
               <w:cnfStyle w:val="100000000000" w:firstRow="1" w:lastRow="0" w:firstColumn="0" w:lastColumn="0" w:oddVBand="0" w:evenVBand="0" w:oddHBand="0" w:evenHBand="0" w:firstRowFirstColumn="0" w:firstRowLastColumn="0" w:lastRowFirstColumn="0" w:lastRowLastColumn="0"/>
             </w:pPr>
             <w:r>
-              <w:t>Proposed date</w:t>
+              <w:t>Description</w:t>
             </w:r>
           </w:p>
         </w:tc>
@@ -2000,7 +1783,37 @@
               <w:cnfStyle w:val="100000000000" w:firstRow="1" w:lastRow="0" w:firstColumn="0" w:lastColumn="0" w:oddVBand="0" w:evenVBand="0" w:oddHBand="0" w:evenHBand="0" w:firstRowFirstColumn="0" w:firstRowLastColumn="0" w:lastRowFirstColumn="0" w:lastRowLastColumn="0"/>
             </w:pPr>
             <w:r>
-              <w:t>Dependencies / notes</w:t>
+              <w:t>Quantity</w:t>
+            </w:r>
+          </w:p>
+        </w:tc>
+        <w:tc>
+          <w:tcPr>
+            <w:tcW w:w="0" w:type="auto"/>
+            <w:hideMark/>
+          </w:tcPr>
+          <w:p>
+            <w:pPr>
+              <w:spacing w:after="160"/>
+              <w:cnfStyle w:val="100000000000" w:firstRow="1" w:lastRow="0" w:firstColumn="0" w:lastColumn="0" w:oddVBand="0" w:evenVBand="0" w:oddHBand="0" w:evenHBand="0" w:firstRowFirstColumn="0" w:firstRowLastColumn="0" w:lastRowFirstColumn="0" w:lastRowLastColumn="0"/>
+            </w:pPr>
+            <w:r>
+              <w:t>Subtotal</w:t>
+            </w:r>
+          </w:p>
+        </w:tc>
+        <w:tc>
+          <w:tcPr>
+            <w:tcW w:w="0" w:type="auto"/>
+            <w:hideMark/>
+          </w:tcPr>
+          <w:p>
+            <w:pPr>
+              <w:spacing w:after="160"/>
+              <w:cnfStyle w:val="100000000000" w:firstRow="1" w:lastRow="0" w:firstColumn="0" w:lastColumn="0" w:oddVBand="0" w:evenVBand="0" w:oddHBand="0" w:evenHBand="0" w:firstRowFirstColumn="0" w:firstRowLastColumn="0" w:lastRowFirstColumn="0" w:lastRowLastColumn="0"/>
+            </w:pPr>
+            <w:r>
+              <w:t>Notes</w:t>
             </w:r>
           </w:p>
         </w:tc>
@@ -2020,7 +1833,15 @@
               <w:spacing w:after="160"/>
             </w:pPr>
             <w:r>
-              <w:t>[Milestone 1]</w:t>
+              <w:t>{#</w:t>
+            </w:r>
+            <w:proofErr w:type="gramStart"/>
+            <w:r>
+              <w:t>combos}{</w:t>
+            </w:r>
+            <w:proofErr w:type="gramEnd"/>
+            <w:r>
+              <w:t>name}</w:t>
             </w:r>
           </w:p>
         </w:tc>
@@ -2035,7 +1856,7 @@
               <w:cnfStyle w:val="000000100000" w:firstRow="0" w:lastRow="0" w:firstColumn="0" w:lastColumn="0" w:oddVBand="0" w:evenVBand="0" w:oddHBand="1" w:evenHBand="0" w:firstRowFirstColumn="0" w:firstRowLastColumn="0" w:lastRowFirstColumn="0" w:lastRowLastColumn="0"/>
             </w:pPr>
             <w:r>
-              <w:t>[Date]</w:t>
+              <w:t>{description}</w:t>
             </w:r>
           </w:p>
         </w:tc>
@@ -2050,79 +1871,7 @@
               <w:cnfStyle w:val="000000100000" w:firstRow="0" w:lastRow="0" w:firstColumn="0" w:lastColumn="0" w:oddVBand="0" w:evenVBand="0" w:oddHBand="1" w:evenHBand="0" w:firstRowFirstColumn="0" w:firstRowLastColumn="0" w:lastRowFirstColumn="0" w:lastRowLastColumn="0"/>
             </w:pPr>
             <w:r>
-              <w:t>[Details]</w:t>
-            </w:r>
-          </w:p>
-        </w:tc>
-      </w:tr>
-      <w:tr>
-        <w:tc>
-          <w:tcPr>
-            <w:cnfStyle w:val="001000000000" w:firstRow="0" w:lastRow="0" w:firstColumn="1" w:lastColumn="0" w:oddVBand="0" w:evenVBand="0" w:oddHBand="0" w:evenHBand="0" w:firstRowFirstColumn="0" w:firstRowLastColumn="0" w:lastRowFirstColumn="0" w:lastRowLastColumn="0"/>
-            <w:tcW w:w="0" w:type="auto"/>
-            <w:hideMark/>
-          </w:tcPr>
-          <w:p>
-            <w:pPr>
-              <w:spacing w:after="160"/>
-            </w:pPr>
-            <w:r>
-              <w:t>[Milestone 2]</w:t>
-            </w:r>
-          </w:p>
-        </w:tc>
-        <w:tc>
-          <w:tcPr>
-            <w:tcW w:w="0" w:type="auto"/>
-            <w:hideMark/>
-          </w:tcPr>
-          <w:p>
-            <w:pPr>
-              <w:spacing w:after="160"/>
-              <w:cnfStyle w:val="000000000000" w:firstRow="0" w:lastRow="0" w:firstColumn="0" w:lastColumn="0" w:oddVBand="0" w:evenVBand="0" w:oddHBand="0" w:evenHBand="0" w:firstRowFirstColumn="0" w:firstRowLastColumn="0" w:lastRowFirstColumn="0" w:lastRowLastColumn="0"/>
-            </w:pPr>
-            <w:r>
-              <w:t>[Date]</w:t>
-            </w:r>
-          </w:p>
-        </w:tc>
-        <w:tc>
-          <w:tcPr>
-            <w:tcW w:w="0" w:type="auto"/>
-            <w:hideMark/>
-          </w:tcPr>
-          <w:p>
-            <w:pPr>
-              <w:spacing w:after="160"/>
-              <w:cnfStyle w:val="000000000000" w:firstRow="0" w:lastRow="0" w:firstColumn="0" w:lastColumn="0" w:oddVBand="0" w:evenVBand="0" w:oddHBand="0" w:evenHBand="0" w:firstRowFirstColumn="0" w:firstRowLastColumn="0" w:lastRowFirstColumn="0" w:lastRowLastColumn="0"/>
-            </w:pPr>
-            <w:r>
-              <w:t>[Details]</w:t>
-            </w:r>
-          </w:p>
-        </w:tc>
-      </w:tr>
-      <w:tr>
-        <w:trPr>
-          <w:cnfStyle w:val="000000100000" w:firstRow="0" w:lastRow="0" w:firstColumn="0" w:lastColumn="0" w:oddVBand="0" w:evenVBand="0" w:oddHBand="1" w:evenHBand="0" w:firstRowFirstColumn="0" w:firstRowLastColumn="0" w:lastRowFirstColumn="0" w:lastRowLastColumn="0"/>
-        </w:trPr>
-        <w:tc>
-          <w:tcPr>
-            <w:cnfStyle w:val="001000000000" w:firstRow="0" w:lastRow="0" w:firstColumn="1" w:lastColumn="0" w:oddVBand="0" w:evenVBand="0" w:oddHBand="0" w:evenHBand="0" w:firstRowFirstColumn="0" w:firstRowLastColumn="0" w:lastRowFirstColumn="0" w:lastRowLastColumn="0"/>
-            <w:tcW w:w="0" w:type="auto"/>
-            <w:hideMark/>
-          </w:tcPr>
-          <w:p>
-            <w:pPr>
-              <w:spacing w:after="160"/>
-            </w:pPr>
-            <w:proofErr w:type="gramStart"/>
-            <w:r>
-              <w:t>Final completion</w:t>
-            </w:r>
-            <w:proofErr w:type="gramEnd"/>
-            <w:r>
-              <w:t xml:space="preserve"> / delivery</w:t>
+              <w:t>{quantity}</w:t>
             </w:r>
           </w:p>
         </w:tc>
@@ -2137,7 +1886,7 @@
               <w:cnfStyle w:val="000000100000" w:firstRow="0" w:lastRow="0" w:firstColumn="0" w:lastColumn="0" w:oddVBand="0" w:evenVBand="0" w:oddHBand="1" w:evenHBand="0" w:firstRowFirstColumn="0" w:firstRowLastColumn="0" w:lastRowFirstColumn="0" w:lastRowLastColumn="0"/>
             </w:pPr>
             <w:r>
-              <w:t>[Date]</w:t>
+              <w:t>{subtotal}</w:t>
             </w:r>
           </w:p>
         </w:tc>
@@ -2152,7 +1901,7 @@
               <w:cnfStyle w:val="000000100000" w:firstRow="0" w:lastRow="0" w:firstColumn="0" w:lastColumn="0" w:oddVBand="0" w:evenVBand="0" w:oddHBand="1" w:evenHBand="0" w:firstRowFirstColumn="0" w:firstRowLastColumn="0" w:lastRowFirstColumn="0" w:lastRowLastColumn="0"/>
             </w:pPr>
             <w:r>
-              <w:t>[Details]</w:t>
+              <w:t>{note}</w:t>
             </w:r>
           </w:p>
         </w:tc>
@@ -2161,209 +1910,9 @@
     <w:p>
       <w:pPr>
         <w:rPr>
-          <w:kern w:val="0"/>
-          <w:lang w:eastAsia="en-GB"/>
-          <w14:ligatures w14:val="none"/>
+          <w:lang w:eastAsia="en-AU"/>
         </w:rPr>
       </w:pPr>
-    </w:p>
-    <w:p>
-      <w:pPr>
-        <w:pStyle w:val="Heading1"/>
-        <w:rPr>
-          <w:rFonts w:asciiTheme="minorHAnsi" w:hAnsiTheme="minorHAnsi" w:cstheme="minorBidi"/>
-          <w:kern w:val="36"/>
-          <w:sz w:val="48"/>
-          <w:szCs w:val="48"/>
-          <w:lang w:eastAsia="en-GB"/>
-          <w14:ligatures w14:val="none"/>
-        </w:rPr>
-      </w:pPr>
-      <w:r>
-        <w:rPr>
-          <w:rFonts w:asciiTheme="minorHAnsi" w:hAnsiTheme="minorHAnsi" w:cstheme="minorBidi"/>
-        </w:rPr>
-        <w:t>8. Commercial Terms</w:t>
-      </w:r>
-    </w:p>
-    <w:p>
-      <w:pPr>
-        <w:pStyle w:val="ListParagraph"/>
-        <w:numPr>
-          <w:ilvl w:val="0"/>
-          <w:numId w:val="2"/>
-        </w:numPr>
-        <w:rPr>
-          <w:sz w:val="20"/>
-          <w:szCs w:val="20"/>
-        </w:rPr>
-      </w:pPr>
-      <w:r>
-        <w:rPr>
-          <w:sz w:val="20"/>
-          <w:szCs w:val="20"/>
-        </w:rPr>
-        <w:t>Anticipated contract term: [Term and extension options]</w:t>
-      </w:r>
-    </w:p>
-    <w:p>
-      <w:pPr>
-        <w:pStyle w:val="ListParagraph"/>
-        <w:numPr>
-          <w:ilvl w:val="0"/>
-          <w:numId w:val="2"/>
-        </w:numPr>
-        <w:rPr>
-          <w:sz w:val="20"/>
-          <w:szCs w:val="20"/>
-        </w:rPr>
-      </w:pPr>
-      <w:r>
-        <w:rPr>
-          <w:sz w:val="20"/>
-          <w:szCs w:val="20"/>
-        </w:rPr>
-        <w:t>Payment terms: [e.g. 30 days from a correctly rendered invoice]</w:t>
-      </w:r>
-    </w:p>
-    <w:p>
-      <w:pPr>
-        <w:pStyle w:val="ListParagraph"/>
-        <w:numPr>
-          <w:ilvl w:val="0"/>
-          <w:numId w:val="2"/>
-        </w:numPr>
-        <w:rPr>
-          <w:sz w:val="20"/>
-          <w:szCs w:val="20"/>
-        </w:rPr>
-      </w:pPr>
-      <w:r>
-        <w:rPr>
-          <w:sz w:val="20"/>
-          <w:szCs w:val="20"/>
-        </w:rPr>
-        <w:t>Price basis and indexation: [Fixed / adjustment mechanism]</w:t>
-      </w:r>
-    </w:p>
-    <w:p>
-      <w:pPr>
-        <w:pStyle w:val="ListParagraph"/>
-        <w:numPr>
-          <w:ilvl w:val="0"/>
-          <w:numId w:val="2"/>
-        </w:numPr>
-        <w:rPr>
-          <w:sz w:val="20"/>
-          <w:szCs w:val="20"/>
-        </w:rPr>
-      </w:pPr>
-      <w:r>
-        <w:rPr>
-          <w:sz w:val="20"/>
-          <w:szCs w:val="20"/>
-        </w:rPr>
-        <w:t>Insurance requirements: [Types and minimum levels]</w:t>
-      </w:r>
-    </w:p>
-    <w:p>
-      <w:pPr>
-        <w:pStyle w:val="ListParagraph"/>
-        <w:numPr>
-          <w:ilvl w:val="0"/>
-          <w:numId w:val="2"/>
-        </w:numPr>
-        <w:rPr>
-          <w:sz w:val="20"/>
-          <w:szCs w:val="20"/>
-        </w:rPr>
-      </w:pPr>
-      <w:r>
-        <w:rPr>
-          <w:sz w:val="20"/>
-          <w:szCs w:val="20"/>
-        </w:rPr>
-        <w:t>Confidentiality and data handling: [Requirements]</w:t>
-      </w:r>
-    </w:p>
-    <w:p>
-      <w:pPr>
-        <w:pStyle w:val="ListParagraph"/>
-        <w:numPr>
-          <w:ilvl w:val="0"/>
-          <w:numId w:val="2"/>
-        </w:numPr>
-        <w:rPr>
-          <w:sz w:val="20"/>
-          <w:szCs w:val="20"/>
-        </w:rPr>
-      </w:pPr>
-      <w:r>
-        <w:rPr>
-          <w:sz w:val="20"/>
-          <w:szCs w:val="20"/>
-        </w:rPr>
-        <w:t>Buyer terms and conditions: [Attach or describe applicable terms]</w:t>
-      </w:r>
-    </w:p>
-    <w:p>
-      <w:pPr>
-        <w:pStyle w:val="ListParagraph"/>
-        <w:numPr>
-          <w:ilvl w:val="0"/>
-          <w:numId w:val="2"/>
-        </w:numPr>
-        <w:rPr>
-          <w:sz w:val="20"/>
-          <w:szCs w:val="20"/>
-        </w:rPr>
-      </w:pPr>
-      <w:r>
-        <w:rPr>
-          <w:sz w:val="20"/>
-          <w:szCs w:val="20"/>
-        </w:rPr>
-        <w:t>Conflicts of interest: [Disclosure requirements]</w:t>
-      </w:r>
-    </w:p>
-    <w:p>
-      <w:pPr>
-        <w:pStyle w:val="ListParagraph"/>
-        <w:numPr>
-          <w:ilvl w:val="0"/>
-          <w:numId w:val="2"/>
-        </w:numPr>
-        <w:rPr>
-          <w:sz w:val="20"/>
-          <w:szCs w:val="20"/>
-        </w:rPr>
-      </w:pPr>
-      <w:r>
-        <w:rPr>
-          <w:sz w:val="20"/>
-          <w:szCs w:val="20"/>
-        </w:rPr>
-        <w:t>Supplier departures: [List every proposed exception or state “None”]</w:t>
-      </w:r>
-    </w:p>
-    <w:p>
-      <w:pPr>
-        <w:pStyle w:val="Heading1"/>
-        <w:rPr>
-          <w:rFonts w:asciiTheme="minorHAnsi" w:hAnsiTheme="minorHAnsi" w:cstheme="minorBidi"/>
-          <w:kern w:val="36"/>
-          <w:sz w:val="48"/>
-          <w:szCs w:val="48"/>
-          <w:lang w:eastAsia="en-GB"/>
-          <w14:ligatures w14:val="none"/>
-        </w:rPr>
-      </w:pPr>
-      <w:r>
-        <w:rPr>
-          <w:rFonts w:asciiTheme="minorHAnsi" w:hAnsiTheme="minorHAnsi" w:cstheme="minorBidi"/>
-        </w:rPr>
-        <w:t>9. RFQ Process and Submission Instructions</w:t>
-      </w:r>
     </w:p>
     <w:tbl>
       <w:tblPr>
@@ -2372,8 +1921,14 @@
         <w:tblLook w:val="04A0" w:firstRow="1" w:lastRow="0" w:firstColumn="1" w:lastColumn="0" w:noHBand="0" w:noVBand="1"/>
       </w:tblPr>
       <w:tblGrid>
-        <w:gridCol w:w="3360"/>
-        <w:gridCol w:w="5656"/>
+        <w:gridCol w:w="1490"/>
+        <w:gridCol w:w="1207"/>
+        <w:gridCol w:w="995"/>
+        <w:gridCol w:w="962"/>
+        <w:gridCol w:w="1048"/>
+        <w:gridCol w:w="556"/>
+        <w:gridCol w:w="682"/>
+        <w:gridCol w:w="2076"/>
       </w:tblGrid>
       <w:tr>
         <w:trPr>
@@ -2389,13 +1944,11 @@
             <w:pPr>
               <w:spacing w:after="160"/>
               <w:rPr>
-                <w:kern w:val="0"/>
-                <w:lang w:eastAsia="en-GB"/>
-                <w14:ligatures w14:val="none"/>
+                <w:lang w:eastAsia="en-AU"/>
               </w:rPr>
             </w:pPr>
             <w:r>
-              <w:t>Activity</w:t>
+              <w:t>Scope Combo Item</w:t>
             </w:r>
           </w:p>
         </w:tc>
@@ -2410,7 +1963,97 @@
               <w:cnfStyle w:val="100000000000" w:firstRow="1" w:lastRow="0" w:firstColumn="0" w:lastColumn="0" w:oddVBand="0" w:evenVBand="0" w:oddHBand="0" w:evenHBand="0" w:firstRowFirstColumn="0" w:firstRowLastColumn="0" w:lastRowFirstColumn="0" w:lastRowLastColumn="0"/>
             </w:pPr>
             <w:r>
-              <w:t>Date / instruction</w:t>
+              <w:t>Description</w:t>
+            </w:r>
+          </w:p>
+        </w:tc>
+        <w:tc>
+          <w:tcPr>
+            <w:tcW w:w="0" w:type="auto"/>
+            <w:hideMark/>
+          </w:tcPr>
+          <w:p>
+            <w:pPr>
+              <w:spacing w:after="160"/>
+              <w:cnfStyle w:val="100000000000" w:firstRow="1" w:lastRow="0" w:firstColumn="0" w:lastColumn="0" w:oddVBand="0" w:evenVBand="0" w:oddHBand="0" w:evenHBand="0" w:firstRowFirstColumn="0" w:firstRowLastColumn="0" w:lastRowFirstColumn="0" w:lastRowLastColumn="0"/>
+            </w:pPr>
+            <w:r>
+              <w:t>Category</w:t>
+            </w:r>
+          </w:p>
+        </w:tc>
+        <w:tc>
+          <w:tcPr>
+            <w:tcW w:w="0" w:type="auto"/>
+            <w:hideMark/>
+          </w:tcPr>
+          <w:p>
+            <w:pPr>
+              <w:spacing w:after="160"/>
+              <w:cnfStyle w:val="100000000000" w:firstRow="1" w:lastRow="0" w:firstColumn="0" w:lastColumn="0" w:oddVBand="0" w:evenVBand="0" w:oddHBand="0" w:evenHBand="0" w:firstRowFirstColumn="0" w:firstRowLastColumn="0" w:lastRowFirstColumn="0" w:lastRowLastColumn="0"/>
+            </w:pPr>
+            <w:r>
+              <w:t>Quantity</w:t>
+            </w:r>
+          </w:p>
+        </w:tc>
+        <w:tc>
+          <w:tcPr>
+            <w:tcW w:w="0" w:type="auto"/>
+            <w:hideMark/>
+          </w:tcPr>
+          <w:p>
+            <w:pPr>
+              <w:spacing w:after="160"/>
+              <w:cnfStyle w:val="100000000000" w:firstRow="1" w:lastRow="0" w:firstColumn="0" w:lastColumn="0" w:oddVBand="0" w:evenVBand="0" w:oddHBand="0" w:evenHBand="0" w:firstRowFirstColumn="0" w:firstRowLastColumn="0" w:lastRowFirstColumn="0" w:lastRowLastColumn="0"/>
+            </w:pPr>
+            <w:r>
+              <w:t>Unit Cost</w:t>
+            </w:r>
+          </w:p>
+        </w:tc>
+        <w:tc>
+          <w:tcPr>
+            <w:tcW w:w="0" w:type="auto"/>
+            <w:hideMark/>
+          </w:tcPr>
+          <w:p>
+            <w:pPr>
+              <w:spacing w:after="160"/>
+              <w:cnfStyle w:val="100000000000" w:firstRow="1" w:lastRow="0" w:firstColumn="0" w:lastColumn="0" w:oddVBand="0" w:evenVBand="0" w:oddHBand="0" w:evenHBand="0" w:firstRowFirstColumn="0" w:firstRowLastColumn="0" w:lastRowFirstColumn="0" w:lastRowLastColumn="0"/>
+            </w:pPr>
+            <w:r>
+              <w:t>Tax</w:t>
+            </w:r>
+          </w:p>
+        </w:tc>
+        <w:tc>
+          <w:tcPr>
+            <w:tcW w:w="0" w:type="auto"/>
+            <w:hideMark/>
+          </w:tcPr>
+          <w:p>
+            <w:pPr>
+              <w:spacing w:after="160"/>
+              <w:cnfStyle w:val="100000000000" w:firstRow="1" w:lastRow="0" w:firstColumn="0" w:lastColumn="0" w:oddVBand="0" w:evenVBand="0" w:oddHBand="0" w:evenHBand="0" w:firstRowFirstColumn="0" w:firstRowLastColumn="0" w:lastRowFirstColumn="0" w:lastRowLastColumn="0"/>
+            </w:pPr>
+            <w:r>
+              <w:t>Total</w:t>
+            </w:r>
+          </w:p>
+        </w:tc>
+        <w:tc>
+          <w:tcPr>
+            <w:tcW w:w="0" w:type="auto"/>
+            <w:hideMark/>
+          </w:tcPr>
+          <w:p>
+            <w:pPr>
+              <w:spacing w:after="160"/>
+              <w:cnfStyle w:val="100000000000" w:firstRow="1" w:lastRow="0" w:firstColumn="0" w:lastColumn="0" w:oddVBand="0" w:evenVBand="0" w:oddHBand="0" w:evenHBand="0" w:firstRowFirstColumn="0" w:firstRowLastColumn="0" w:lastRowFirstColumn="0" w:lastRowLastColumn="0"/>
+            </w:pPr>
+            <w:r>
+              <w:t>Notes</w:t>
             </w:r>
           </w:p>
         </w:tc>
@@ -2430,7 +2073,15 @@
               <w:spacing w:after="160"/>
             </w:pPr>
             <w:r>
-              <w:t>Questions due</w:t>
+              <w:t>{#</w:t>
+            </w:r>
+            <w:proofErr w:type="gramStart"/>
+            <w:r>
+              <w:t>items}{</w:t>
+            </w:r>
+            <w:proofErr w:type="gramEnd"/>
+            <w:r>
+              <w:t>name}</w:t>
             </w:r>
           </w:p>
         </w:tc>
@@ -2445,59 +2096,7 @@
               <w:cnfStyle w:val="000000100000" w:firstRow="0" w:lastRow="0" w:firstColumn="0" w:lastColumn="0" w:oddVBand="0" w:evenVBand="0" w:oddHBand="1" w:evenHBand="0" w:firstRowFirstColumn="0" w:firstRowLastColumn="0" w:lastRowFirstColumn="0" w:lastRowLastColumn="0"/>
             </w:pPr>
             <w:r>
-              <w:t>[Date, time, time zone, and contact method]</w:t>
-            </w:r>
-          </w:p>
-        </w:tc>
-      </w:tr>
-      <w:tr>
-        <w:tc>
-          <w:tcPr>
-            <w:cnfStyle w:val="001000000000" w:firstRow="0" w:lastRow="0" w:firstColumn="1" w:lastColumn="0" w:oddVBand="0" w:evenVBand="0" w:oddHBand="0" w:evenHBand="0" w:firstRowFirstColumn="0" w:firstRowLastColumn="0" w:lastRowFirstColumn="0" w:lastRowLastColumn="0"/>
-            <w:tcW w:w="0" w:type="auto"/>
-            <w:hideMark/>
-          </w:tcPr>
-          <w:p>
-            <w:pPr>
-              <w:spacing w:after="160"/>
-            </w:pPr>
-            <w:r>
-              <w:t>Responses to questions</w:t>
-            </w:r>
-          </w:p>
-        </w:tc>
-        <w:tc>
-          <w:tcPr>
-            <w:tcW w:w="0" w:type="auto"/>
-            <w:hideMark/>
-          </w:tcPr>
-          <w:p>
-            <w:pPr>
-              <w:spacing w:after="160"/>
-              <w:cnfStyle w:val="000000000000" w:firstRow="0" w:lastRow="0" w:firstColumn="0" w:lastColumn="0" w:oddVBand="0" w:evenVBand="0" w:oddHBand="0" w:evenHBand="0" w:firstRowFirstColumn="0" w:firstRowLastColumn="0" w:lastRowFirstColumn="0" w:lastRowLastColumn="0"/>
-            </w:pPr>
-            <w:r>
-              <w:t>[Date and method]</w:t>
-            </w:r>
-          </w:p>
-        </w:tc>
-      </w:tr>
-      <w:tr>
-        <w:trPr>
-          <w:cnfStyle w:val="000000100000" w:firstRow="0" w:lastRow="0" w:firstColumn="0" w:lastColumn="0" w:oddVBand="0" w:evenVBand="0" w:oddHBand="1" w:evenHBand="0" w:firstRowFirstColumn="0" w:firstRowLastColumn="0" w:lastRowFirstColumn="0" w:lastRowLastColumn="0"/>
-        </w:trPr>
-        <w:tc>
-          <w:tcPr>
-            <w:cnfStyle w:val="001000000000" w:firstRow="0" w:lastRow="0" w:firstColumn="1" w:lastColumn="0" w:oddVBand="0" w:evenVBand="0" w:oddHBand="0" w:evenHBand="0" w:firstRowFirstColumn="0" w:firstRowLastColumn="0" w:lastRowFirstColumn="0" w:lastRowLastColumn="0"/>
-            <w:tcW w:w="0" w:type="auto"/>
-            <w:hideMark/>
-          </w:tcPr>
-          <w:p>
-            <w:pPr>
-              <w:spacing w:after="160"/>
-            </w:pPr>
-            <w:r>
-              <w:t>Quotation due</w:t>
+              <w:t>{description}</w:t>
             </w:r>
           </w:p>
         </w:tc>
@@ -2512,60 +2111,7 @@
               <w:cnfStyle w:val="000000100000" w:firstRow="0" w:lastRow="0" w:firstColumn="0" w:lastColumn="0" w:oddVBand="0" w:evenVBand="0" w:oddHBand="1" w:evenHBand="0" w:firstRowFirstColumn="0" w:firstRowLastColumn="0" w:lastRowFirstColumn="0" w:lastRowLastColumn="0"/>
             </w:pPr>
             <w:r>
-              <w:t>[Date, time, and time zone]</w:t>
-            </w:r>
-          </w:p>
-        </w:tc>
-      </w:tr>
-      <w:tr>
-        <w:tc>
-          <w:tcPr>
-            <w:cnfStyle w:val="001000000000" w:firstRow="0" w:lastRow="0" w:firstColumn="1" w:lastColumn="0" w:oddVBand="0" w:evenVBand="0" w:oddHBand="0" w:evenHBand="0" w:firstRowFirstColumn="0" w:firstRowLastColumn="0" w:lastRowFirstColumn="0" w:lastRowLastColumn="0"/>
-            <w:tcW w:w="0" w:type="auto"/>
-            <w:hideMark/>
-          </w:tcPr>
-          <w:p>
-            <w:pPr>
-              <w:spacing w:after="160"/>
-            </w:pPr>
-            <w:r>
-              <w:t>Submission method</w:t>
-            </w:r>
-          </w:p>
-        </w:tc>
-        <w:tc>
-          <w:tcPr>
-            <w:tcW w:w="0" w:type="auto"/>
-            <w:hideMark/>
-          </w:tcPr>
-          <w:p>
-            <w:pPr>
-              <w:spacing w:after="160"/>
-              <w:cnfStyle w:val="000000000000" w:firstRow="0" w:lastRow="0" w:firstColumn="0" w:lastColumn="0" w:oddVBand="0" w:evenVBand="0" w:oddHBand="0" w:evenHBand="0" w:firstRowFirstColumn="0" w:firstRowLastColumn="0" w:lastRowFirstColumn="0" w:lastRowLastColumn="0"/>
-            </w:pPr>
-            <w:r>
-              <w:t>[Email / portal and file format]</w:t>
-            </w:r>
-          </w:p>
-        </w:tc>
-      </w:tr>
-      <w:tr>
-        <w:trPr>
-          <w:cnfStyle w:val="000000100000" w:firstRow="0" w:lastRow="0" w:firstColumn="0" w:lastColumn="0" w:oddVBand="0" w:evenVBand="0" w:oddHBand="1" w:evenHBand="0" w:firstRowFirstColumn="0" w:firstRowLastColumn="0" w:lastRowFirstColumn="0" w:lastRowLastColumn="0"/>
-        </w:trPr>
-        <w:tc>
-          <w:tcPr>
-            <w:cnfStyle w:val="001000000000" w:firstRow="0" w:lastRow="0" w:firstColumn="1" w:lastColumn="0" w:oddVBand="0" w:evenVBand="0" w:oddHBand="0" w:evenHBand="0" w:firstRowFirstColumn="0" w:firstRowLastColumn="0" w:lastRowFirstColumn="0" w:lastRowLastColumn="0"/>
-            <w:tcW w:w="0" w:type="auto"/>
-            <w:hideMark/>
-          </w:tcPr>
-          <w:p>
-            <w:pPr>
-              <w:spacing w:after="160"/>
-            </w:pPr>
-            <w:r>
-              <w:lastRenderedPageBreak/>
-              <w:t>Subject / reference</w:t>
+              <w:t>{category}</w:t>
             </w:r>
           </w:p>
         </w:tc>
@@ -2580,39 +2126,85 @@
               <w:cnfStyle w:val="000000100000" w:firstRow="0" w:lastRow="0" w:firstColumn="0" w:lastColumn="0" w:oddVBand="0" w:evenVBand="0" w:oddHBand="1" w:evenHBand="0" w:firstRowFirstColumn="0" w:firstRowLastColumn="0" w:lastRowFirstColumn="0" w:lastRowLastColumn="0"/>
             </w:pPr>
             <w:r>
-              <w:t>[Required subject line or portal reference]</w:t>
-            </w:r>
-          </w:p>
-        </w:tc>
-      </w:tr>
-      <w:tr>
-        <w:tc>
-          <w:tcPr>
-            <w:cnfStyle w:val="001000000000" w:firstRow="0" w:lastRow="0" w:firstColumn="1" w:lastColumn="0" w:oddVBand="0" w:evenVBand="0" w:oddHBand="0" w:evenHBand="0" w:firstRowFirstColumn="0" w:firstRowLastColumn="0" w:lastRowFirstColumn="0" w:lastRowLastColumn="0"/>
-            <w:tcW w:w="0" w:type="auto"/>
-            <w:hideMark/>
-          </w:tcPr>
-          <w:p>
-            <w:pPr>
-              <w:spacing w:after="160"/>
-            </w:pPr>
-            <w:r>
-              <w:t>Anticipated award</w:t>
-            </w:r>
-          </w:p>
-        </w:tc>
-        <w:tc>
-          <w:tcPr>
-            <w:tcW w:w="0" w:type="auto"/>
-            <w:hideMark/>
-          </w:tcPr>
-          <w:p>
-            <w:pPr>
-              <w:spacing w:after="160"/>
-              <w:cnfStyle w:val="000000000000" w:firstRow="0" w:lastRow="0" w:firstColumn="0" w:lastColumn="0" w:oddVBand="0" w:evenVBand="0" w:oddHBand="0" w:evenHBand="0" w:firstRowFirstColumn="0" w:firstRowLastColumn="0" w:lastRowFirstColumn="0" w:lastRowLastColumn="0"/>
-            </w:pPr>
-            <w:r>
-              <w:t>[Date]</w:t>
+              <w:t>{quantity}</w:t>
+            </w:r>
+          </w:p>
+        </w:tc>
+        <w:tc>
+          <w:tcPr>
+            <w:tcW w:w="0" w:type="auto"/>
+            <w:hideMark/>
+          </w:tcPr>
+          <w:p>
+            <w:pPr>
+              <w:spacing w:after="160"/>
+              <w:cnfStyle w:val="000000100000" w:firstRow="0" w:lastRow="0" w:firstColumn="0" w:lastColumn="0" w:oddVBand="0" w:evenVBand="0" w:oddHBand="1" w:evenHBand="0" w:firstRowFirstColumn="0" w:firstRowLastColumn="0" w:lastRowFirstColumn="0" w:lastRowLastColumn="0"/>
+            </w:pPr>
+            <w:r>
+              <w:t>{</w:t>
+            </w:r>
+            <w:proofErr w:type="spellStart"/>
+            <w:r>
+              <w:t>unit_cost</w:t>
+            </w:r>
+            <w:proofErr w:type="spellEnd"/>
+            <w:r>
+              <w:t>}</w:t>
+            </w:r>
+          </w:p>
+        </w:tc>
+        <w:tc>
+          <w:tcPr>
+            <w:tcW w:w="0" w:type="auto"/>
+            <w:hideMark/>
+          </w:tcPr>
+          <w:p>
+            <w:pPr>
+              <w:spacing w:after="160"/>
+              <w:cnfStyle w:val="000000100000" w:firstRow="0" w:lastRow="0" w:firstColumn="0" w:lastColumn="0" w:oddVBand="0" w:evenVBand="0" w:oddHBand="1" w:evenHBand="0" w:firstRowFirstColumn="0" w:firstRowLastColumn="0" w:lastRowFirstColumn="0" w:lastRowLastColumn="0"/>
+            </w:pPr>
+            <w:r>
+              <w:t>{tax}</w:t>
+            </w:r>
+          </w:p>
+        </w:tc>
+        <w:tc>
+          <w:tcPr>
+            <w:tcW w:w="0" w:type="auto"/>
+            <w:hideMark/>
+          </w:tcPr>
+          <w:p>
+            <w:pPr>
+              <w:spacing w:after="160"/>
+              <w:cnfStyle w:val="000000100000" w:firstRow="0" w:lastRow="0" w:firstColumn="0" w:lastColumn="0" w:oddVBand="0" w:evenVBand="0" w:oddHBand="1" w:evenHBand="0" w:firstRowFirstColumn="0" w:firstRowLastColumn="0" w:lastRowFirstColumn="0" w:lastRowLastColumn="0"/>
+            </w:pPr>
+            <w:r>
+              <w:t>{total}</w:t>
+            </w:r>
+          </w:p>
+        </w:tc>
+        <w:tc>
+          <w:tcPr>
+            <w:tcW w:w="0" w:type="auto"/>
+            <w:hideMark/>
+          </w:tcPr>
+          <w:p>
+            <w:pPr>
+              <w:cnfStyle w:val="000000100000" w:firstRow="0" w:lastRow="0" w:firstColumn="0" w:lastColumn="0" w:oddVBand="0" w:evenVBand="0" w:oddHBand="1" w:evenHBand="0" w:firstRowFirstColumn="0" w:firstRowLastColumn="0" w:lastRowFirstColumn="0" w:lastRowLastColumn="0"/>
+            </w:pPr>
+            <w:r>
+              <w:t>{note}{/</w:t>
+            </w:r>
+            <w:proofErr w:type="gramStart"/>
+            <w:r>
+              <w:t>items}{</w:t>
+            </w:r>
+            <w:proofErr w:type="gramEnd"/>
+            <w:r>
+              <w:t>/combos</w:t>
+            </w:r>
+            <w:r>
+              <w:t>}</w:t>
             </w:r>
           </w:p>
         </w:tc>
@@ -2621,22 +2213,35 @@
     <w:p>
       <w:pPr>
         <w:rPr>
-          <w:kern w:val="0"/>
-          <w:lang w:eastAsia="en-GB"/>
-          <w14:ligatures w14:val="none"/>
+          <w:lang w:eastAsia="en-AU"/>
         </w:rPr>
       </w:pPr>
+      <w:r>
+        <w:t>{/scopes}</w:t>
+      </w:r>
     </w:p>
     <w:p>
       <w:pPr>
         <w:rPr>
-          <w:kern w:val="0"/>
-          <w:lang w:eastAsia="en-GB"/>
-          <w14:ligatures w14:val="none"/>
+          <w:lang w:eastAsia="en-AU"/>
         </w:rPr>
       </w:pPr>
-      <w:r>
-        <w:t>Late, incomplete, or non-compliant quotations may be excluded. The buyer may seek clarification, negotiate, cancel or amend the RFQ, or accept all or part of a quotation, subject to applicable procurement rules and the stated conditions.</w:t>
+    </w:p>
+    <w:p>
+      <w:pPr>
+        <w:rPr>
+          <w:lang w:eastAsia="en-AU"/>
+        </w:rPr>
+      </w:pPr>
+      <w:r>
+        <w:rPr>
+          <w:b/>
+          <w:bCs/>
+        </w:rPr>
+        <w:t>Group subtotal:</w:t>
+      </w:r>
+      <w:r>
+        <w:t xml:space="preserve"> {subtotal}{/groups}</w:t>
       </w:r>
     </w:p>
     <w:p>
@@ -2644,18 +2249,16 @@
         <w:pStyle w:val="Heading1"/>
         <w:rPr>
           <w:rFonts w:asciiTheme="minorHAnsi" w:hAnsiTheme="minorHAnsi" w:cstheme="minorBidi"/>
-          <w:kern w:val="36"/>
           <w:sz w:val="48"/>
           <w:szCs w:val="48"/>
-          <w:lang w:eastAsia="en-GB"/>
-          <w14:ligatures w14:val="none"/>
+          <w:lang w:eastAsia="en-AU"/>
         </w:rPr>
       </w:pPr>
       <w:r>
         <w:rPr>
           <w:rFonts w:asciiTheme="minorHAnsi" w:hAnsiTheme="minorHAnsi" w:cstheme="minorBidi"/>
         </w:rPr>
-        <w:t>10. Evaluation Criteria</w:t>
+        <w:t>RFQ Totals</w:t>
       </w:r>
     </w:p>
     <w:tbl>
@@ -2665,8 +2268,8 @@
         <w:tblLook w:val="04A0" w:firstRow="1" w:lastRow="0" w:firstColumn="1" w:lastColumn="0" w:noHBand="0" w:noVBand="1"/>
       </w:tblPr>
       <w:tblGrid>
-        <w:gridCol w:w="6588"/>
-        <w:gridCol w:w="2428"/>
+        <w:gridCol w:w="4254"/>
+        <w:gridCol w:w="4762"/>
       </w:tblGrid>
       <w:tr>
         <w:trPr>
@@ -2682,13 +2285,11 @@
             <w:pPr>
               <w:spacing w:after="160"/>
               <w:rPr>
-                <w:kern w:val="0"/>
-                <w:lang w:eastAsia="en-GB"/>
-                <w14:ligatures w14:val="none"/>
+                <w:lang w:eastAsia="en-AU"/>
               </w:rPr>
             </w:pPr>
             <w:r>
-              <w:t>Criterion</w:t>
+              <w:t>Subtotal</w:t>
             </w:r>
           </w:p>
         </w:tc>
@@ -2703,7 +2304,7 @@
               <w:cnfStyle w:val="100000000000" w:firstRow="1" w:lastRow="0" w:firstColumn="0" w:lastColumn="0" w:oddVBand="0" w:evenVBand="0" w:oddHBand="0" w:evenHBand="0" w:firstRowFirstColumn="0" w:firstRowLastColumn="0" w:lastRowFirstColumn="0" w:lastRowLastColumn="0"/>
             </w:pPr>
             <w:r>
-              <w:t>Weighting</w:t>
+              <w:t>{subtotal}</w:t>
             </w:r>
           </w:p>
         </w:tc>
@@ -2723,7 +2324,7 @@
               <w:spacing w:after="160"/>
             </w:pPr>
             <w:r>
-              <w:t>Compliance with mandatory requirements</w:t>
+              <w:t>Tax</w:t>
             </w:r>
           </w:p>
         </w:tc>
@@ -2738,7 +2339,7 @@
               <w:cnfStyle w:val="000000100000" w:firstRow="0" w:lastRow="0" w:firstColumn="0" w:lastColumn="0" w:oddVBand="0" w:evenVBand="0" w:oddHBand="1" w:evenHBand="0" w:firstRowFirstColumn="0" w:firstRowLastColumn="0" w:lastRowFirstColumn="0" w:lastRowLastColumn="0"/>
             </w:pPr>
             <w:r>
-              <w:t>[Pass / fail or %]</w:t>
+              <w:t>{tax}</w:t>
             </w:r>
           </w:p>
         </w:tc>
@@ -2755,7 +2356,7 @@
               <w:spacing w:after="160"/>
             </w:pPr>
             <w:r>
-              <w:t>Total cost and value for money</w:t>
+              <w:t>Total</w:t>
             </w:r>
           </w:p>
         </w:tc>
@@ -2770,141 +2371,11 @@
               <w:cnfStyle w:val="000000000000" w:firstRow="0" w:lastRow="0" w:firstColumn="0" w:lastColumn="0" w:oddVBand="0" w:evenVBand="0" w:oddHBand="0" w:evenHBand="0" w:firstRowFirstColumn="0" w:firstRowLastColumn="0" w:lastRowFirstColumn="0" w:lastRowLastColumn="0"/>
             </w:pPr>
             <w:r>
-              <w:t>[%]</w:t>
-            </w:r>
-          </w:p>
-        </w:tc>
-      </w:tr>
-      <w:tr>
-        <w:trPr>
-          <w:cnfStyle w:val="000000100000" w:firstRow="0" w:lastRow="0" w:firstColumn="0" w:lastColumn="0" w:oddVBand="0" w:evenVBand="0" w:oddHBand="1" w:evenHBand="0" w:firstRowFirstColumn="0" w:firstRowLastColumn="0" w:lastRowFirstColumn="0" w:lastRowLastColumn="0"/>
-        </w:trPr>
-        <w:tc>
-          <w:tcPr>
-            <w:cnfStyle w:val="001000000000" w:firstRow="0" w:lastRow="0" w:firstColumn="1" w:lastColumn="0" w:oddVBand="0" w:evenVBand="0" w:oddHBand="0" w:evenHBand="0" w:firstRowFirstColumn="0" w:firstRowLastColumn="0" w:lastRowFirstColumn="0" w:lastRowLastColumn="0"/>
-            <w:tcW w:w="0" w:type="auto"/>
-            <w:hideMark/>
-          </w:tcPr>
-          <w:p>
-            <w:pPr>
-              <w:spacing w:after="160"/>
-            </w:pPr>
-            <w:r>
-              <w:t>Technical fit and quality</w:t>
-            </w:r>
-          </w:p>
-        </w:tc>
-        <w:tc>
-          <w:tcPr>
-            <w:tcW w:w="0" w:type="auto"/>
-            <w:hideMark/>
-          </w:tcPr>
-          <w:p>
-            <w:pPr>
-              <w:spacing w:after="160"/>
-              <w:cnfStyle w:val="000000100000" w:firstRow="0" w:lastRow="0" w:firstColumn="0" w:lastColumn="0" w:oddVBand="0" w:evenVBand="0" w:oddHBand="1" w:evenHBand="0" w:firstRowFirstColumn="0" w:firstRowLastColumn="0" w:lastRowFirstColumn="0" w:lastRowLastColumn="0"/>
-            </w:pPr>
-            <w:r>
-              <w:t>[%]</w:t>
-            </w:r>
-          </w:p>
-        </w:tc>
-      </w:tr>
-      <w:tr>
-        <w:tc>
-          <w:tcPr>
-            <w:cnfStyle w:val="001000000000" w:firstRow="0" w:lastRow="0" w:firstColumn="1" w:lastColumn="0" w:oddVBand="0" w:evenVBand="0" w:oddHBand="0" w:evenHBand="0" w:firstRowFirstColumn="0" w:firstRowLastColumn="0" w:lastRowFirstColumn="0" w:lastRowLastColumn="0"/>
-            <w:tcW w:w="0" w:type="auto"/>
-            <w:hideMark/>
-          </w:tcPr>
-          <w:p>
-            <w:pPr>
-              <w:spacing w:after="160"/>
-            </w:pPr>
-            <w:r>
-              <w:t>Delivery approach and timeframe</w:t>
-            </w:r>
-          </w:p>
-        </w:tc>
-        <w:tc>
-          <w:tcPr>
-            <w:tcW w:w="0" w:type="auto"/>
-            <w:hideMark/>
-          </w:tcPr>
-          <w:p>
-            <w:pPr>
-              <w:spacing w:after="160"/>
-              <w:cnfStyle w:val="000000000000" w:firstRow="0" w:lastRow="0" w:firstColumn="0" w:lastColumn="0" w:oddVBand="0" w:evenVBand="0" w:oddHBand="0" w:evenHBand="0" w:firstRowFirstColumn="0" w:firstRowLastColumn="0" w:lastRowFirstColumn="0" w:lastRowLastColumn="0"/>
-            </w:pPr>
-            <w:r>
-              <w:t>[%]</w:t>
-            </w:r>
-          </w:p>
-        </w:tc>
-      </w:tr>
-      <w:tr>
-        <w:trPr>
-          <w:cnfStyle w:val="000000100000" w:firstRow="0" w:lastRow="0" w:firstColumn="0" w:lastColumn="0" w:oddVBand="0" w:evenVBand="0" w:oddHBand="1" w:evenHBand="0" w:firstRowFirstColumn="0" w:firstRowLastColumn="0" w:lastRowFirstColumn="0" w:lastRowLastColumn="0"/>
-        </w:trPr>
-        <w:tc>
-          <w:tcPr>
-            <w:cnfStyle w:val="001000000000" w:firstRow="0" w:lastRow="0" w:firstColumn="1" w:lastColumn="0" w:oddVBand="0" w:evenVBand="0" w:oddHBand="0" w:evenHBand="0" w:firstRowFirstColumn="0" w:firstRowLastColumn="0" w:lastRowFirstColumn="0" w:lastRowLastColumn="0"/>
-            <w:tcW w:w="0" w:type="auto"/>
-            <w:hideMark/>
-          </w:tcPr>
-          <w:p>
-            <w:pPr>
-              <w:spacing w:after="160"/>
-            </w:pPr>
-            <w:r>
-              <w:t>Supplier capability, experience, and support</w:t>
-            </w:r>
-          </w:p>
-        </w:tc>
-        <w:tc>
-          <w:tcPr>
-            <w:tcW w:w="0" w:type="auto"/>
-            <w:hideMark/>
-          </w:tcPr>
-          <w:p>
-            <w:pPr>
-              <w:spacing w:after="160"/>
-              <w:cnfStyle w:val="000000100000" w:firstRow="0" w:lastRow="0" w:firstColumn="0" w:lastColumn="0" w:oddVBand="0" w:evenVBand="0" w:oddHBand="1" w:evenHBand="0" w:firstRowFirstColumn="0" w:firstRowLastColumn="0" w:lastRowFirstColumn="0" w:lastRowLastColumn="0"/>
-            </w:pPr>
-            <w:r>
-              <w:t>[%]</w:t>
-            </w:r>
-          </w:p>
-        </w:tc>
-      </w:tr>
-      <w:tr>
-        <w:tc>
-          <w:tcPr>
-            <w:cnfStyle w:val="001000000000" w:firstRow="0" w:lastRow="0" w:firstColumn="1" w:lastColumn="0" w:oddVBand="0" w:evenVBand="0" w:oddHBand="0" w:evenHBand="0" w:firstRowFirstColumn="0" w:firstRowLastColumn="0" w:lastRowFirstColumn="0" w:lastRowLastColumn="0"/>
-            <w:tcW w:w="0" w:type="auto"/>
-            <w:hideMark/>
-          </w:tcPr>
-          <w:p>
-            <w:pPr>
-              <w:spacing w:after="160"/>
-            </w:pPr>
-            <w:r>
-              <w:t>Commercial terms and risk</w:t>
-            </w:r>
-          </w:p>
-        </w:tc>
-        <w:tc>
-          <w:tcPr>
-            <w:tcW w:w="0" w:type="auto"/>
-            <w:hideMark/>
-          </w:tcPr>
-          <w:p>
-            <w:pPr>
-              <w:spacing w:after="160"/>
-              <w:cnfStyle w:val="000000000000" w:firstRow="0" w:lastRow="0" w:firstColumn="0" w:lastColumn="0" w:oddVBand="0" w:evenVBand="0" w:oddHBand="0" w:evenHBand="0" w:firstRowFirstColumn="0" w:firstRowLastColumn="0" w:lastRowFirstColumn="0" w:lastRowLastColumn="0"/>
-            </w:pPr>
-            <w:r>
-              <w:t>[%]</w:t>
+              <w:rPr>
+                <w:b/>
+                <w:bCs/>
+              </w:rPr>
+              <w:t>{total}</w:t>
             </w:r>
           </w:p>
         </w:tc>
@@ -2913,9 +2384,7 @@
     <w:p>
       <w:pPr>
         <w:rPr>
-          <w:kern w:val="0"/>
-          <w:lang w:eastAsia="en-GB"/>
-          <w14:ligatures w14:val="none"/>
+          <w:lang w:eastAsia="en-AU"/>
         </w:rPr>
       </w:pPr>
     </w:p>
@@ -2924,193 +2393,155 @@
         <w:pStyle w:val="Heading1"/>
         <w:rPr>
           <w:rFonts w:asciiTheme="minorHAnsi" w:hAnsiTheme="minorHAnsi" w:cstheme="minorBidi"/>
-          <w:kern w:val="36"/>
           <w:sz w:val="48"/>
           <w:szCs w:val="48"/>
-          <w:lang w:eastAsia="en-GB"/>
-          <w14:ligatures w14:val="none"/>
+          <w:lang w:eastAsia="en-AU"/>
         </w:rPr>
       </w:pPr>
       <w:r>
         <w:rPr>
           <w:rFonts w:asciiTheme="minorHAnsi" w:hAnsiTheme="minorHAnsi" w:cstheme="minorBidi"/>
         </w:rPr>
-        <w:t>11. Supplier Declaration</w:t>
+        <w:t>Vendor Response Requirements</w:t>
       </w:r>
     </w:p>
     <w:p>
       <w:pPr>
+        <w:pStyle w:val="ListParagraph"/>
+        <w:numPr>
+          <w:ilvl w:val="0"/>
+          <w:numId w:val="1"/>
+        </w:numPr>
+      </w:pPr>
+      <w:r>
+        <w:t>Confirm pricing for each requested line item, combo, and scope.</w:t>
+      </w:r>
+    </w:p>
+    <w:p>
+      <w:pPr>
+        <w:pStyle w:val="ListParagraph"/>
+        <w:numPr>
+          <w:ilvl w:val="0"/>
+          <w:numId w:val="1"/>
+        </w:numPr>
+      </w:pPr>
+      <w:r>
+        <w:t>Identify any assumptions, alternatives, exclusions, or minimum order requirements.</w:t>
+      </w:r>
+    </w:p>
+    <w:p>
+      <w:pPr>
+        <w:pStyle w:val="ListParagraph"/>
+        <w:numPr>
+          <w:ilvl w:val="0"/>
+          <w:numId w:val="1"/>
+        </w:numPr>
+      </w:pPr>
+      <w:r>
+        <w:t>State delivery or completion lead times and quotation validity period.</w:t>
+      </w:r>
+    </w:p>
+    <w:p>
+      <w:pPr>
+        <w:pStyle w:val="ListParagraph"/>
+        <w:numPr>
+          <w:ilvl w:val="0"/>
+          <w:numId w:val="1"/>
+        </w:numPr>
+      </w:pPr>
+      <w:r>
+        <w:t>Include applicable tax, freight, handling, duties, installation, or other charges.</w:t>
+      </w:r>
+    </w:p>
+    <w:p>
+      <w:pPr>
+        <w:pStyle w:val="ListParagraph"/>
+        <w:numPr>
+          <w:ilvl w:val="0"/>
+          <w:numId w:val="1"/>
+        </w:numPr>
+      </w:pPr>
+      <w:r>
+        <w:lastRenderedPageBreak/>
+        <w:t>Return the completed quotation by the due date shown above.</w:t>
+      </w:r>
+    </w:p>
+    <w:p>
+      <w:pPr>
+        <w:pStyle w:val="Heading1"/>
         <w:rPr>
-          <w:kern w:val="0"/>
-          <w:lang w:eastAsia="en-GB"/>
-          <w14:ligatures w14:val="none"/>
+          <w:rFonts w:asciiTheme="minorHAnsi" w:hAnsiTheme="minorHAnsi" w:cstheme="minorBidi"/>
+          <w:sz w:val="48"/>
+          <w:szCs w:val="48"/>
+          <w:lang w:eastAsia="en-AU"/>
         </w:rPr>
       </w:pPr>
       <w:r>
-        <w:t>By submitting this quotation, the supplier confirms that the information supplied is accurate, it has disclosed all assumptions, exclusions, conflicts, and proposed departures, and the quotation remains valid for the stated period.</w:t>
+        <w:rPr>
+          <w:rFonts w:asciiTheme="minorHAnsi" w:hAnsiTheme="minorHAnsi" w:cstheme="minorBidi"/>
+        </w:rPr>
+        <w:t>Terms and Conditions</w:t>
       </w:r>
     </w:p>
-    <w:tbl>
-      <w:tblPr>
-        <w:tblStyle w:val="GridTable4-Accent1"/>
-        <w:tblW w:w="5000" w:type="pct"/>
-        <w:tblLook w:val="04A0" w:firstRow="1" w:lastRow="0" w:firstColumn="1" w:lastColumn="0" w:noHBand="0" w:noVBand="1"/>
-      </w:tblPr>
-      <w:tblGrid>
-        <w:gridCol w:w="6265"/>
-        <w:gridCol w:w="2751"/>
-      </w:tblGrid>
-      <w:tr>
-        <w:trPr>
-          <w:cnfStyle w:val="100000000000" w:firstRow="1" w:lastRow="0" w:firstColumn="0" w:lastColumn="0" w:oddVBand="0" w:evenVBand="0" w:oddHBand="0" w:evenHBand="0" w:firstRowFirstColumn="0" w:firstRowLastColumn="0" w:lastRowFirstColumn="0" w:lastRowLastColumn="0"/>
-        </w:trPr>
-        <w:tc>
-          <w:tcPr>
-            <w:cnfStyle w:val="001000000000" w:firstRow="0" w:lastRow="0" w:firstColumn="1" w:lastColumn="0" w:oddVBand="0" w:evenVBand="0" w:oddHBand="0" w:evenHBand="0" w:firstRowFirstColumn="0" w:firstRowLastColumn="0" w:lastRowFirstColumn="0" w:lastRowLastColumn="0"/>
-            <w:tcW w:w="0" w:type="auto"/>
-            <w:hideMark/>
-          </w:tcPr>
-          <w:p>
-            <w:pPr>
-              <w:spacing w:after="160"/>
-              <w:rPr>
-                <w:kern w:val="0"/>
-                <w:lang w:eastAsia="en-GB"/>
-                <w14:ligatures w14:val="none"/>
-              </w:rPr>
-            </w:pPr>
-            <w:r>
-              <w:t>Authorised representative</w:t>
-            </w:r>
-          </w:p>
-        </w:tc>
-        <w:tc>
-          <w:tcPr>
-            <w:tcW w:w="0" w:type="auto"/>
-            <w:hideMark/>
-          </w:tcPr>
-          <w:p>
-            <w:pPr>
-              <w:spacing w:after="160"/>
-              <w:cnfStyle w:val="100000000000" w:firstRow="1" w:lastRow="0" w:firstColumn="0" w:lastColumn="0" w:oddVBand="0" w:evenVBand="0" w:oddHBand="0" w:evenHBand="0" w:firstRowFirstColumn="0" w:firstRowLastColumn="0" w:lastRowFirstColumn="0" w:lastRowLastColumn="0"/>
-            </w:pPr>
-            <w:r>
-              <w:t>[Name]</w:t>
-            </w:r>
-          </w:p>
-        </w:tc>
-      </w:tr>
-      <w:tr>
-        <w:trPr>
-          <w:cnfStyle w:val="000000100000" w:firstRow="0" w:lastRow="0" w:firstColumn="0" w:lastColumn="0" w:oddVBand="0" w:evenVBand="0" w:oddHBand="1" w:evenHBand="0" w:firstRowFirstColumn="0" w:firstRowLastColumn="0" w:lastRowFirstColumn="0" w:lastRowLastColumn="0"/>
-        </w:trPr>
-        <w:tc>
-          <w:tcPr>
-            <w:cnfStyle w:val="001000000000" w:firstRow="0" w:lastRow="0" w:firstColumn="1" w:lastColumn="0" w:oddVBand="0" w:evenVBand="0" w:oddHBand="0" w:evenHBand="0" w:firstRowFirstColumn="0" w:firstRowLastColumn="0" w:lastRowFirstColumn="0" w:lastRowLastColumn="0"/>
-            <w:tcW w:w="0" w:type="auto"/>
-            <w:hideMark/>
-          </w:tcPr>
-          <w:p>
-            <w:pPr>
-              <w:spacing w:after="160"/>
-            </w:pPr>
-            <w:r>
-              <w:t>Position</w:t>
-            </w:r>
-          </w:p>
-        </w:tc>
-        <w:tc>
-          <w:tcPr>
-            <w:tcW w:w="0" w:type="auto"/>
-            <w:hideMark/>
-          </w:tcPr>
-          <w:p>
-            <w:pPr>
-              <w:spacing w:after="160"/>
-              <w:cnfStyle w:val="000000100000" w:firstRow="0" w:lastRow="0" w:firstColumn="0" w:lastColumn="0" w:oddVBand="0" w:evenVBand="0" w:oddHBand="1" w:evenHBand="0" w:firstRowFirstColumn="0" w:firstRowLastColumn="0" w:lastRowFirstColumn="0" w:lastRowLastColumn="0"/>
-            </w:pPr>
-            <w:r>
-              <w:t>[Title]</w:t>
-            </w:r>
-          </w:p>
-        </w:tc>
-      </w:tr>
-      <w:tr>
-        <w:tc>
-          <w:tcPr>
-            <w:cnfStyle w:val="001000000000" w:firstRow="0" w:lastRow="0" w:firstColumn="1" w:lastColumn="0" w:oddVBand="0" w:evenVBand="0" w:oddHBand="0" w:evenHBand="0" w:firstRowFirstColumn="0" w:firstRowLastColumn="0" w:lastRowFirstColumn="0" w:lastRowLastColumn="0"/>
-            <w:tcW w:w="0" w:type="auto"/>
-            <w:hideMark/>
-          </w:tcPr>
-          <w:p>
-            <w:pPr>
-              <w:spacing w:after="160"/>
-            </w:pPr>
-            <w:r>
-              <w:t>Signature</w:t>
-            </w:r>
-          </w:p>
-        </w:tc>
-        <w:tc>
-          <w:tcPr>
-            <w:tcW w:w="0" w:type="auto"/>
-            <w:hideMark/>
-          </w:tcPr>
-          <w:p>
-            <w:pPr>
-              <w:spacing w:after="160"/>
-              <w:cnfStyle w:val="000000000000" w:firstRow="0" w:lastRow="0" w:firstColumn="0" w:lastColumn="0" w:oddVBand="0" w:evenVBand="0" w:oddHBand="0" w:evenHBand="0" w:firstRowFirstColumn="0" w:firstRowLastColumn="0" w:lastRowFirstColumn="0" w:lastRowLastColumn="0"/>
-            </w:pPr>
-            <w:r>
-              <w:t>[Signature]</w:t>
-            </w:r>
-          </w:p>
-        </w:tc>
-      </w:tr>
-      <w:tr>
-        <w:trPr>
-          <w:cnfStyle w:val="000000100000" w:firstRow="0" w:lastRow="0" w:firstColumn="0" w:lastColumn="0" w:oddVBand="0" w:evenVBand="0" w:oddHBand="1" w:evenHBand="0" w:firstRowFirstColumn="0" w:firstRowLastColumn="0" w:lastRowFirstColumn="0" w:lastRowLastColumn="0"/>
-        </w:trPr>
-        <w:tc>
-          <w:tcPr>
-            <w:cnfStyle w:val="001000000000" w:firstRow="0" w:lastRow="0" w:firstColumn="1" w:lastColumn="0" w:oddVBand="0" w:evenVBand="0" w:oddHBand="0" w:evenHBand="0" w:firstRowFirstColumn="0" w:firstRowLastColumn="0" w:lastRowFirstColumn="0" w:lastRowLastColumn="0"/>
-            <w:tcW w:w="0" w:type="auto"/>
-            <w:hideMark/>
-          </w:tcPr>
-          <w:p>
-            <w:pPr>
-              <w:spacing w:after="160"/>
-            </w:pPr>
-            <w:r>
-              <w:t>Date</w:t>
-            </w:r>
-          </w:p>
-        </w:tc>
-        <w:tc>
-          <w:tcPr>
-            <w:tcW w:w="0" w:type="auto"/>
-            <w:hideMark/>
-          </w:tcPr>
-          <w:p>
-            <w:pPr>
-              <w:spacing w:after="160"/>
-              <w:cnfStyle w:val="000000100000" w:firstRow="0" w:lastRow="0" w:firstColumn="0" w:lastColumn="0" w:oddVBand="0" w:evenVBand="0" w:oddHBand="1" w:evenHBand="0" w:firstRowFirstColumn="0" w:firstRowLastColumn="0" w:lastRowFirstColumn="0" w:lastRowLastColumn="0"/>
-            </w:pPr>
-            <w:r>
-              <w:t>[Date]</w:t>
-            </w:r>
-          </w:p>
-        </w:tc>
-      </w:tr>
-    </w:tbl>
     <w:p>
       <w:pPr>
-        <w:rPr>
-          <w:kern w:val="0"/>
-          <w:lang w:eastAsia="en-GB"/>
-          <w14:ligatures w14:val="none"/>
-        </w:rPr>
-      </w:pPr>
+        <w:pStyle w:val="ListParagraph"/>
+        <w:numPr>
+          <w:ilvl w:val="0"/>
+          <w:numId w:val="2"/>
+        </w:numPr>
+      </w:pPr>
+      <w:r>
+        <w:t>This RFQ is a request for pricing only and does not constitute an order or contract.</w:t>
+      </w:r>
+    </w:p>
+    <w:p>
+      <w:pPr>
+        <w:pStyle w:val="ListParagraph"/>
+        <w:numPr>
+          <w:ilvl w:val="0"/>
+          <w:numId w:val="2"/>
+        </w:numPr>
+      </w:pPr>
+      <w:r>
+        <w:t>{company} may accept, reject, clarify, or negotiate any quotation received.</w:t>
+      </w:r>
+    </w:p>
+    <w:p>
+      <w:pPr>
+        <w:pStyle w:val="ListParagraph"/>
+        <w:numPr>
+          <w:ilvl w:val="0"/>
+          <w:numId w:val="2"/>
+        </w:numPr>
+      </w:pPr>
+      <w:r>
+        <w:t>All prices should be stated exclusive and inclusive of applicable taxes where relevant.</w:t>
+      </w:r>
+    </w:p>
+    <w:p>
+      <w:pPr>
+        <w:pStyle w:val="ListParagraph"/>
+        <w:numPr>
+          <w:ilvl w:val="0"/>
+          <w:numId w:val="2"/>
+        </w:numPr>
+      </w:pPr>
+      <w:r>
+        <w:t>Vendors are responsible for ensuring their quotation is complete, accurate, and valid for the period stated in their response.</w:t>
+      </w:r>
+    </w:p>
+    <w:p>
+      <w:pPr>
+        <w:pStyle w:val="ListParagraph"/>
+        <w:numPr>
+          <w:ilvl w:val="0"/>
+          <w:numId w:val="2"/>
+        </w:numPr>
+      </w:pPr>
+      <w:r>
+        <w:t>Any changes to specifications, quantities, or availability must be clearly noted in the quotation.</w:t>
+      </w:r>
     </w:p>
     <w:p/>
     <w:sectPr>
@@ -3124,11 +2555,11 @@
 </file>
 
 <file path=word/numbering.xml><?xml version="1.0" encoding="utf-8"?>
-<w:numbering xmlns:wpc="http://schemas.microsoft.com/office/word/2010/wordprocessingCanvas" xmlns:cx="http://schemas.microsoft.com/office/drawing/2014/chartex" xmlns:cx1="http://schemas.microsoft.com/office/drawing/2015/9/8/chartex" xmlns:cx2="http://schemas.microsoft.com/office/drawing/2015/10/21/chartex" xmlns:cx3="http://schemas.microsoft.com/office/drawing/2016/5/9/chartex" xmlns:cx4="http://schemas.microsoft.com/office/drawing/2016/5/10/chartex" xmlns:cx5="http://schemas.microsoft.com/office/drawing/2016/5/11/chartex" xmlns:cx6="http://schemas.microsoft.com/office/drawing/2016/5/12/chartex" xmlns:cx7="http://schemas.microsoft.com/office/drawing/2016/5/13/chartex" xmlns:cx8="http://schemas.microsoft.com/office/drawing/2016/5/14/chartex" xmlns:mc="http://schemas.openxmlformats.org/markup-compatibility/2006" xmlns:m="http://schemas.openxmlformats.org/officeDocument/2006/math" xmlns:aink="http://schemas.microsoft.com/office/drawing/2016/ink" xmlns:am3d="http://schemas.microsoft.com/office/drawing/2017/model3d" xmlns:oel="http://schemas.microsoft.com/office/2019/extlst" xmlns:r="http://schemas.openxmlformats.org/officeDocument/2006/relationships" xmlns:wp14="http://schemas.microsoft.com/office/word/2010/wordprocessingDrawing" xmlns:wp="http://schemas.openxmlformats.org/drawingml/2006/wordprocessingDrawing" xmlns:wpg="http://schemas.microsoft.com/office/word/2010/wordprocessingGroup" xmlns:wpi="http://schemas.microsoft.com/office/word/2010/wordprocessingInk" xmlns:wps="http://schemas.microsoft.com/office/word/2010/wordprocessingShape" xmlns:o="urn:schemas-microsoft-com:office:office" xmlns:v="urn:schemas-microsoft-com:vml" xmlns:w10="urn:schemas-microsoft-com:office:word" xmlns:w="http://schemas.openxmlformats.org/wordprocessingml/2006/main" xmlns:w14="http://schemas.microsoft.com/office/word/2010/wordml" xmlns:w15="http://schemas.microsoft.com/office/word/2012/wordml" xmlns:w16cei="http://schemas.microsoft.com/office/word/2026/wordml/cei" xmlns:w16cex="http://schemas.microsoft.com/office/word/2018/wordml/cex" xmlns:w16cid="http://schemas.microsoft.com/office/word/2016/wordml/cid" xmlns:w16="http://schemas.microsoft.com/office/word/2018/wordml" xmlns:w16sdtdh="http://schemas.microsoft.com/office/word/2020/wordml/sdtdatahash" xmlns:w16sdtfl="http://schemas.microsoft.com/office/word/2024/wordml/sdtformatlock" xmlns:w16se="http://schemas.microsoft.com/office/word/2015/wordml/symex" xmlns:w16du="http://schemas.microsoft.com/office/word/2023/wordml/word16du" xmlns:wne="http://schemas.microsoft.com/office/word/2006/wordml" mc:Ignorable="w14 w15 w16se w16cid w16 w16cex w16sdtdh w16sdtfl w16du wp14">
+<w:numbering xmlns:wpc="http://schemas.microsoft.com/office/word/2010/wordprocessingCanvas" xmlns:cx="http://schemas.microsoft.com/office/drawing/2014/chartex" xmlns:cx1="http://schemas.microsoft.com/office/drawing/2015/9/8/chartex" xmlns:cx2="http://schemas.microsoft.com/office/drawing/2015/10/21/chartex" xmlns:cx3="http://schemas.microsoft.com/office/drawing/2016/5/9/chartex" xmlns:cx4="http://schemas.microsoft.com/office/drawing/2016/5/10/chartex" xmlns:cx5="http://schemas.microsoft.com/office/drawing/2016/5/11/chartex" xmlns:cx6="http://schemas.microsoft.com/office/drawing/2016/5/12/chartex" xmlns:cx7="http://schemas.microsoft.com/office/drawing/2016/5/13/chartex" xmlns:cx8="http://schemas.microsoft.com/office/drawing/2016/5/14/chartex" xmlns:mc="http://schemas.openxmlformats.org/markup-compatibility/2006" xmlns:aink="http://schemas.microsoft.com/office/drawing/2016/ink" xmlns:am3d="http://schemas.microsoft.com/office/drawing/2017/model3d" xmlns:o="urn:schemas-microsoft-com:office:office" xmlns:oel="http://schemas.microsoft.com/office/2019/extlst" xmlns:r="http://schemas.openxmlformats.org/officeDocument/2006/relationships" xmlns:m="http://schemas.openxmlformats.org/officeDocument/2006/math" xmlns:v="urn:schemas-microsoft-com:vml" xmlns:wp14="http://schemas.microsoft.com/office/word/2010/wordprocessingDrawing" xmlns:wp="http://schemas.openxmlformats.org/drawingml/2006/wordprocessingDrawing" xmlns:w10="urn:schemas-microsoft-com:office:word" xmlns:w="http://schemas.openxmlformats.org/wordprocessingml/2006/main" xmlns:w14="http://schemas.microsoft.com/office/word/2010/wordml" xmlns:w15="http://schemas.microsoft.com/office/word/2012/wordml" xmlns:w16cei="http://schemas.microsoft.com/office/word/2026/wordml/cei" xmlns:w16cex="http://schemas.microsoft.com/office/word/2018/wordml/cex" xmlns:w16cid="http://schemas.microsoft.com/office/word/2016/wordml/cid" xmlns:w16="http://schemas.microsoft.com/office/word/2018/wordml" xmlns:w16du="http://schemas.microsoft.com/office/word/2023/wordml/word16du" xmlns:w16sdtdh="http://schemas.microsoft.com/office/word/2020/wordml/sdtdatahash" xmlns:w16sdtfl="http://schemas.microsoft.com/office/word/2024/wordml/sdtformatlock" xmlns:w16se="http://schemas.microsoft.com/office/word/2015/wordml/symex" xmlns:wpg="http://schemas.microsoft.com/office/word/2010/wordprocessingGroup" xmlns:wpi="http://schemas.microsoft.com/office/word/2010/wordprocessingInk" xmlns:wne="http://schemas.microsoft.com/office/word/2006/wordml" xmlns:wps="http://schemas.microsoft.com/office/word/2010/wordprocessingShape" mc:Ignorable="w14 w15 w16se w16cid w16 w16cex w16sdtdh w16sdtfl w16du wp14">
   <w:abstractNum w:abstractNumId="0" w15:restartNumberingAfterBreak="0">
-    <w:nsid w:val="12FD228A"/>
+    <w:nsid w:val="46DC2BFE"/>
     <w:multiLevelType w:val="multilevel"/>
-    <w:tmpl w:val="823470F0"/>
+    <w:tmpl w:val="EFDC64B8"/>
     <w:lvl w:ilvl="0">
       <w:start w:val="1"/>
       <w:numFmt w:val="bullet"/>
@@ -3275,9 +2706,9 @@
     </w:lvl>
   </w:abstractNum>
   <w:abstractNum w:abstractNumId="1" w15:restartNumberingAfterBreak="0">
-    <w:nsid w:val="3D0659E9"/>
+    <w:nsid w:val="4E21020B"/>
     <w:multiLevelType w:val="multilevel"/>
-    <w:tmpl w:val="3654AAF0"/>
+    <w:tmpl w:val="CDFE1A5A"/>
     <w:lvl w:ilvl="0">
       <w:start w:val="1"/>
       <w:numFmt w:val="bullet"/>
@@ -3423,31 +2854,31 @@
       </w:rPr>
     </w:lvl>
   </w:abstractNum>
-  <w:num w:numId="1" w16cid:durableId="514030325">
+  <w:num w:numId="1" w16cid:durableId="518398521">
+    <w:abstractNumId w:val="1"/>
+  </w:num>
+  <w:num w:numId="2" w16cid:durableId="644896629">
     <w:abstractNumId w:val="0"/>
-  </w:num>
-  <w:num w:numId="2" w16cid:durableId="560753974">
-    <w:abstractNumId w:val="1"/>
   </w:num>
 </w:numbering>
 </file>
 
 <file path=word/styles.xml><?xml version="1.0" encoding="utf-8"?>
-<w:styles xmlns:mc="http://schemas.openxmlformats.org/markup-compatibility/2006" xmlns:r="http://schemas.openxmlformats.org/officeDocument/2006/relationships" xmlns:w="http://schemas.openxmlformats.org/wordprocessingml/2006/main" xmlns:w14="http://schemas.microsoft.com/office/word/2010/wordml" xmlns:w15="http://schemas.microsoft.com/office/word/2012/wordml" xmlns:w16cex="http://schemas.microsoft.com/office/word/2018/wordml/cex" xmlns:w16cid="http://schemas.microsoft.com/office/word/2016/wordml/cid" xmlns:w16="http://schemas.microsoft.com/office/word/2018/wordml" xmlns:w16sdtdh="http://schemas.microsoft.com/office/word/2020/wordml/sdtdatahash" xmlns:w16sdtfl="http://schemas.microsoft.com/office/word/2024/wordml/sdtformatlock" xmlns:w16se="http://schemas.microsoft.com/office/word/2015/wordml/symex" xmlns:w16du="http://schemas.microsoft.com/office/word/2023/wordml/word16du" mc:Ignorable="w14 w15 w16se w16cid w16 w16cex w16sdtdh w16sdtfl w16du">
+<w:styles xmlns:mc="http://schemas.openxmlformats.org/markup-compatibility/2006" xmlns:r="http://schemas.openxmlformats.org/officeDocument/2006/relationships" xmlns:w="http://schemas.openxmlformats.org/wordprocessingml/2006/main" xmlns:w14="http://schemas.microsoft.com/office/word/2010/wordml" xmlns:w15="http://schemas.microsoft.com/office/word/2012/wordml" xmlns:w16cex="http://schemas.microsoft.com/office/word/2018/wordml/cex" xmlns:w16cid="http://schemas.microsoft.com/office/word/2016/wordml/cid" xmlns:w16="http://schemas.microsoft.com/office/word/2018/wordml" xmlns:w16du="http://schemas.microsoft.com/office/word/2023/wordml/word16du" xmlns:w16sdtdh="http://schemas.microsoft.com/office/word/2020/wordml/sdtdatahash" xmlns:w16sdtfl="http://schemas.microsoft.com/office/word/2024/wordml/sdtformatlock" xmlns:w16se="http://schemas.microsoft.com/office/word/2015/wordml/symex" mc:Ignorable="w14 w15 w16se w16cid w16 w16cex w16sdtdh w16sdtfl w16du">
   <w:docDefaults>
     <w:rPrDefault>
       <w:rPr>
         <w:rFonts w:asciiTheme="minorHAnsi" w:eastAsiaTheme="minorHAnsi" w:hAnsiTheme="minorHAnsi" w:cstheme="minorBidi"/>
         <w:kern w:val="2"/>
-        <w:sz w:val="24"/>
-        <w:szCs w:val="24"/>
+        <w:sz w:val="22"/>
+        <w:szCs w:val="22"/>
         <w:lang w:val="en-AU" w:eastAsia="en-US" w:bidi="ar-SA"/>
         <w14:ligatures w14:val="standardContextual"/>
       </w:rPr>
     </w:rPrDefault>
     <w:pPrDefault>
       <w:pPr>
-        <w:spacing w:after="160" w:line="278" w:lineRule="auto"/>
+        <w:spacing w:after="160" w:line="259" w:lineRule="auto"/>
       </w:pPr>
     </w:pPrDefault>
   </w:docDefaults>
@@ -3840,7 +3271,7 @@
     <w:link w:val="Heading1Char"/>
     <w:uiPriority w:val="9"/>
     <w:qFormat/>
-    <w:rsid w:val="00877F53"/>
+    <w:rsid w:val="00226B81"/>
     <w:pPr>
       <w:keepNext/>
       <w:keepLines/>
@@ -3860,10 +3291,9 @@
     <w:next w:val="Normal"/>
     <w:link w:val="Heading2Char"/>
     <w:uiPriority w:val="9"/>
-    <w:semiHidden/>
     <w:unhideWhenUsed/>
     <w:qFormat/>
-    <w:rsid w:val="00877F53"/>
+    <w:rsid w:val="00226B81"/>
     <w:pPr>
       <w:keepNext/>
       <w:keepLines/>
@@ -3883,10 +3313,9 @@
     <w:next w:val="Normal"/>
     <w:link w:val="Heading3Char"/>
     <w:uiPriority w:val="9"/>
-    <w:semiHidden/>
     <w:unhideWhenUsed/>
     <w:qFormat/>
-    <w:rsid w:val="00877F53"/>
+    <w:rsid w:val="00226B81"/>
     <w:pPr>
       <w:keepNext/>
       <w:keepLines/>
@@ -3909,7 +3338,7 @@
     <w:semiHidden/>
     <w:unhideWhenUsed/>
     <w:qFormat/>
-    <w:rsid w:val="00877F53"/>
+    <w:rsid w:val="00226B81"/>
     <w:pPr>
       <w:keepNext/>
       <w:keepLines/>
@@ -3932,7 +3361,7 @@
     <w:semiHidden/>
     <w:unhideWhenUsed/>
     <w:qFormat/>
-    <w:rsid w:val="00877F53"/>
+    <w:rsid w:val="00226B81"/>
     <w:pPr>
       <w:keepNext/>
       <w:keepLines/>
@@ -3953,7 +3382,7 @@
     <w:semiHidden/>
     <w:unhideWhenUsed/>
     <w:qFormat/>
-    <w:rsid w:val="00877F53"/>
+    <w:rsid w:val="00226B81"/>
     <w:pPr>
       <w:keepNext/>
       <w:keepLines/>
@@ -3976,7 +3405,7 @@
     <w:semiHidden/>
     <w:unhideWhenUsed/>
     <w:qFormat/>
-    <w:rsid w:val="00877F53"/>
+    <w:rsid w:val="00226B81"/>
     <w:pPr>
       <w:keepNext/>
       <w:keepLines/>
@@ -3997,7 +3426,7 @@
     <w:semiHidden/>
     <w:unhideWhenUsed/>
     <w:qFormat/>
-    <w:rsid w:val="00877F53"/>
+    <w:rsid w:val="00226B81"/>
     <w:pPr>
       <w:keepNext/>
       <w:keepLines/>
@@ -4020,7 +3449,7 @@
     <w:semiHidden/>
     <w:unhideWhenUsed/>
     <w:qFormat/>
-    <w:rsid w:val="00877F53"/>
+    <w:rsid w:val="00226B81"/>
     <w:pPr>
       <w:keepNext/>
       <w:keepLines/>
@@ -4064,7 +3493,7 @@
     <w:basedOn w:val="DefaultParagraphFont"/>
     <w:link w:val="Heading1"/>
     <w:uiPriority w:val="9"/>
-    <w:rsid w:val="00877F53"/>
+    <w:rsid w:val="00226B81"/>
     <w:rPr>
       <w:rFonts w:asciiTheme="majorHAnsi" w:eastAsiaTheme="majorEastAsia" w:hAnsiTheme="majorHAnsi" w:cstheme="majorBidi"/>
       <w:color w:val="0F4761" w:themeColor="accent1" w:themeShade="BF"/>
@@ -4078,7 +3507,7 @@
     <w:link w:val="Heading2"/>
     <w:uiPriority w:val="9"/>
     <w:semiHidden/>
-    <w:rsid w:val="00877F53"/>
+    <w:rsid w:val="00226B81"/>
     <w:rPr>
       <w:rFonts w:asciiTheme="majorHAnsi" w:eastAsiaTheme="majorEastAsia" w:hAnsiTheme="majorHAnsi" w:cstheme="majorBidi"/>
       <w:color w:val="0F4761" w:themeColor="accent1" w:themeShade="BF"/>
@@ -4092,7 +3521,7 @@
     <w:link w:val="Heading3"/>
     <w:uiPriority w:val="9"/>
     <w:semiHidden/>
-    <w:rsid w:val="00877F53"/>
+    <w:rsid w:val="00226B81"/>
     <w:rPr>
       <w:rFonts w:eastAsiaTheme="majorEastAsia" w:cstheme="majorBidi"/>
       <w:color w:val="0F4761" w:themeColor="accent1" w:themeShade="BF"/>
@@ -4106,7 +3535,7 @@
     <w:link w:val="Heading4"/>
     <w:uiPriority w:val="9"/>
     <w:semiHidden/>
-    <w:rsid w:val="00877F53"/>
+    <w:rsid w:val="00226B81"/>
     <w:rPr>
       <w:rFonts w:eastAsiaTheme="majorEastAsia" w:cstheme="majorBidi"/>
       <w:i/>
@@ -4120,7 +3549,7 @@
     <w:link w:val="Heading5"/>
     <w:uiPriority w:val="9"/>
     <w:semiHidden/>
-    <w:rsid w:val="00877F53"/>
+    <w:rsid w:val="00226B81"/>
     <w:rPr>
       <w:rFonts w:eastAsiaTheme="majorEastAsia" w:cstheme="majorBidi"/>
       <w:color w:val="0F4761" w:themeColor="accent1" w:themeShade="BF"/>
@@ -4132,7 +3561,7 @@
     <w:link w:val="Heading6"/>
     <w:uiPriority w:val="9"/>
     <w:semiHidden/>
-    <w:rsid w:val="00877F53"/>
+    <w:rsid w:val="00226B81"/>
     <w:rPr>
       <w:rFonts w:eastAsiaTheme="majorEastAsia" w:cstheme="majorBidi"/>
       <w:i/>
@@ -4146,7 +3575,7 @@
     <w:link w:val="Heading7"/>
     <w:uiPriority w:val="9"/>
     <w:semiHidden/>
-    <w:rsid w:val="00877F53"/>
+    <w:rsid w:val="00226B81"/>
     <w:rPr>
       <w:rFonts w:eastAsiaTheme="majorEastAsia" w:cstheme="majorBidi"/>
       <w:color w:val="595959" w:themeColor="text1" w:themeTint="A6"/>
@@ -4158,7 +3587,7 @@
     <w:link w:val="Heading8"/>
     <w:uiPriority w:val="9"/>
     <w:semiHidden/>
-    <w:rsid w:val="00877F53"/>
+    <w:rsid w:val="00226B81"/>
     <w:rPr>
       <w:rFonts w:eastAsiaTheme="majorEastAsia" w:cstheme="majorBidi"/>
       <w:i/>
@@ -4172,7 +3601,7 @@
     <w:link w:val="Heading9"/>
     <w:uiPriority w:val="9"/>
     <w:semiHidden/>
-    <w:rsid w:val="00877F53"/>
+    <w:rsid w:val="00226B81"/>
     <w:rPr>
       <w:rFonts w:eastAsiaTheme="majorEastAsia" w:cstheme="majorBidi"/>
       <w:color w:val="272727" w:themeColor="text1" w:themeTint="D8"/>
@@ -4185,7 +3614,7 @@
     <w:link w:val="TitleChar"/>
     <w:uiPriority w:val="10"/>
     <w:qFormat/>
-    <w:rsid w:val="00877F53"/>
+    <w:rsid w:val="00226B81"/>
     <w:pPr>
       <w:spacing w:after="80" w:line="240" w:lineRule="auto"/>
       <w:contextualSpacing/>
@@ -4203,7 +3632,7 @@
     <w:basedOn w:val="DefaultParagraphFont"/>
     <w:link w:val="Title"/>
     <w:uiPriority w:val="10"/>
-    <w:rsid w:val="00877F53"/>
+    <w:rsid w:val="00226B81"/>
     <w:rPr>
       <w:rFonts w:asciiTheme="majorHAnsi" w:eastAsiaTheme="majorEastAsia" w:hAnsiTheme="majorHAnsi" w:cstheme="majorBidi"/>
       <w:spacing w:val="-10"/>
@@ -4219,7 +3648,7 @@
     <w:link w:val="SubtitleChar"/>
     <w:uiPriority w:val="11"/>
     <w:qFormat/>
-    <w:rsid w:val="00877F53"/>
+    <w:rsid w:val="00226B81"/>
     <w:pPr>
       <w:numPr>
         <w:ilvl w:val="1"/>
@@ -4238,7 +3667,7 @@
     <w:basedOn w:val="DefaultParagraphFont"/>
     <w:link w:val="Subtitle"/>
     <w:uiPriority w:val="11"/>
-    <w:rsid w:val="00877F53"/>
+    <w:rsid w:val="00226B81"/>
     <w:rPr>
       <w:rFonts w:eastAsiaTheme="majorEastAsia" w:cstheme="majorBidi"/>
       <w:color w:val="595959" w:themeColor="text1" w:themeTint="A6"/>
@@ -4254,7 +3683,7 @@
     <w:link w:val="QuoteChar"/>
     <w:uiPriority w:val="29"/>
     <w:qFormat/>
-    <w:rsid w:val="00877F53"/>
+    <w:rsid w:val="00226B81"/>
     <w:pPr>
       <w:spacing w:before="160"/>
       <w:jc w:val="center"/>
@@ -4270,7 +3699,7 @@
     <w:basedOn w:val="DefaultParagraphFont"/>
     <w:link w:val="Quote"/>
     <w:uiPriority w:val="29"/>
-    <w:rsid w:val="00877F53"/>
+    <w:rsid w:val="00226B81"/>
     <w:rPr>
       <w:i/>
       <w:iCs/>
@@ -4282,7 +3711,7 @@
     <w:basedOn w:val="Normal"/>
     <w:uiPriority w:val="34"/>
     <w:qFormat/>
-    <w:rsid w:val="00877F53"/>
+    <w:rsid w:val="00226B81"/>
     <w:pPr>
       <w:ind w:left="720"/>
       <w:contextualSpacing/>
@@ -4293,7 +3722,7 @@
     <w:basedOn w:val="DefaultParagraphFont"/>
     <w:uiPriority w:val="21"/>
     <w:qFormat/>
-    <w:rsid w:val="00877F53"/>
+    <w:rsid w:val="00226B81"/>
     <w:rPr>
       <w:i/>
       <w:iCs/>
@@ -4307,7 +3736,7 @@
     <w:link w:val="IntenseQuoteChar"/>
     <w:uiPriority w:val="30"/>
     <w:qFormat/>
-    <w:rsid w:val="00877F53"/>
+    <w:rsid w:val="00226B81"/>
     <w:pPr>
       <w:pBdr>
         <w:top w:val="single" w:sz="4" w:space="10" w:color="0F4761" w:themeColor="accent1" w:themeShade="BF"/>
@@ -4328,7 +3757,7 @@
     <w:basedOn w:val="DefaultParagraphFont"/>
     <w:link w:val="IntenseQuote"/>
     <w:uiPriority w:val="30"/>
-    <w:rsid w:val="00877F53"/>
+    <w:rsid w:val="00226B81"/>
     <w:rPr>
       <w:i/>
       <w:iCs/>
@@ -4340,7 +3769,7 @@
     <w:basedOn w:val="DefaultParagraphFont"/>
     <w:uiPriority w:val="32"/>
     <w:qFormat/>
-    <w:rsid w:val="00877F53"/>
+    <w:rsid w:val="00226B81"/>
     <w:rPr>
       <w:b/>
       <w:bCs/>
@@ -4354,7 +3783,7 @@
     <w:basedOn w:val="DefaultParagraphFont"/>
     <w:uiPriority w:val="33"/>
     <w:qFormat/>
-    <w:rsid w:val="00877F53"/>
+    <w:rsid w:val="00226B81"/>
     <w:rPr>
       <w:b/>
       <w:bCs/>
@@ -4371,7 +3800,7 @@
     <w:semiHidden/>
     <w:unhideWhenUsed/>
     <w:qFormat/>
-    <w:rsid w:val="00877F53"/>
+    <w:rsid w:val="00226B81"/>
     <w:pPr>
       <w:spacing w:after="200" w:line="240" w:lineRule="auto"/>
     </w:pPr>
@@ -4388,7 +3817,7 @@
     <w:basedOn w:val="DefaultParagraphFont"/>
     <w:uiPriority w:val="20"/>
     <w:qFormat/>
-    <w:rsid w:val="00877F53"/>
+    <w:rsid w:val="00226B81"/>
     <w:rPr>
       <w:i/>
       <w:iCs/>
@@ -4398,7 +3827,7 @@
     <w:name w:val="No Spacing"/>
     <w:uiPriority w:val="1"/>
     <w:qFormat/>
-    <w:rsid w:val="00877F53"/>
+    <w:rsid w:val="00226B81"/>
     <w:pPr>
       <w:spacing w:after="0" w:line="240" w:lineRule="auto"/>
     </w:pPr>
@@ -4408,7 +3837,7 @@
     <w:basedOn w:val="DefaultParagraphFont"/>
     <w:uiPriority w:val="22"/>
     <w:qFormat/>
-    <w:rsid w:val="00877F53"/>
+    <w:rsid w:val="00226B81"/>
     <w:rPr>
       <w:b/>
       <w:bCs/>
@@ -4419,7 +3848,7 @@
     <w:basedOn w:val="DefaultParagraphFont"/>
     <w:uiPriority w:val="19"/>
     <w:qFormat/>
-    <w:rsid w:val="00877F53"/>
+    <w:rsid w:val="00226B81"/>
     <w:rPr>
       <w:i/>
       <w:iCs/>
@@ -4431,7 +3860,7 @@
     <w:basedOn w:val="DefaultParagraphFont"/>
     <w:uiPriority w:val="31"/>
     <w:qFormat/>
-    <w:rsid w:val="00877F53"/>
+    <w:rsid w:val="00226B81"/>
     <w:rPr>
       <w:smallCaps/>
       <w:color w:val="5A5A5A" w:themeColor="text1" w:themeTint="A5"/>
@@ -4445,7 +3874,7 @@
     <w:semiHidden/>
     <w:unhideWhenUsed/>
     <w:qFormat/>
-    <w:rsid w:val="00877F53"/>
+    <w:rsid w:val="00226B81"/>
     <w:pPr>
       <w:spacing w:before="240" w:after="0"/>
       <w:outlineLvl w:val="9"/>
@@ -4461,22 +3890,22 @@
     <w:uiPriority w:val="99"/>
     <w:semiHidden/>
     <w:unhideWhenUsed/>
-    <w:rsid w:val="00877F53"/>
+    <w:rsid w:val="00226B81"/>
     <w:pPr>
       <w:spacing w:before="100" w:beforeAutospacing="1" w:after="100" w:afterAutospacing="1" w:line="240" w:lineRule="auto"/>
     </w:pPr>
     <w:rPr>
       <w:rFonts w:ascii="Times New Roman" w:hAnsi="Times New Roman" w:cs="Times New Roman"/>
-      <w:kern w:val="0"/>
-      <w:lang w:eastAsia="en-GB"/>
-      <w14:ligatures w14:val="none"/>
+      <w:sz w:val="24"/>
+      <w:szCs w:val="24"/>
+      <w:lang w:eastAsia="en-AU"/>
     </w:rPr>
   </w:style>
   <w:style w:type="table" w:styleId="GridTable4-Accent1">
     <w:name w:val="Grid Table 4 Accent 1"/>
     <w:basedOn w:val="TableNormal"/>
     <w:uiPriority w:val="49"/>
-    <w:rsid w:val="00243AFB"/>
+    <w:rsid w:val="009017D6"/>
     <w:pPr>
       <w:spacing w:after="0" w:line="240" w:lineRule="auto"/>
     </w:pPr>
@@ -4649,7 +4078,7 @@
         <a:latin typeface="Aptos" panose="02110004020202020204"/>
         <a:ea typeface=""/>
         <a:cs typeface=""/>
-        <a:font script="Jpan" typeface="游明朝"/>
+        <a:font script="Jpan" typeface="游ゴシック"/>
         <a:font script="Hang" typeface="맑은 고딕"/>
         <a:font script="Hans" typeface="等线"/>
         <a:font script="Hant" typeface="新細明體"/>
@@ -4757,6 +4186,13 @@
         </a:gradFill>
       </a:fillStyleLst>
       <a:lnStyleLst>
+        <a:ln w="6350" cap="flat" cmpd="sng" algn="ctr">
+          <a:solidFill>
+            <a:schemeClr val="phClr"/>
+          </a:solidFill>
+          <a:prstDash val="solid"/>
+          <a:miter lim="800000"/>
+        </a:ln>
         <a:ln w="12700" cap="flat" cmpd="sng" algn="ctr">
           <a:solidFill>
             <a:schemeClr val="phClr"/>
@@ -4765,13 +4201,6 @@
           <a:miter lim="800000"/>
         </a:ln>
         <a:ln w="19050" cap="flat" cmpd="sng" algn="ctr">
-          <a:solidFill>
-            <a:schemeClr val="phClr"/>
-          </a:solidFill>
-          <a:prstDash val="solid"/>
-          <a:miter lim="800000"/>
-        </a:ln>
-        <a:ln w="25400" cap="flat" cmpd="sng" algn="ctr">
           <a:solidFill>
             <a:schemeClr val="phClr"/>
           </a:solidFill>
@@ -4836,31 +4265,11 @@
       </a:bgFillStyleLst>
     </a:fmtScheme>
   </a:themeElements>
-  <a:objectDefaults>
-    <a:lnDef>
-      <a:spPr/>
-      <a:bodyPr/>
-      <a:lstStyle/>
-      <a:style>
-        <a:lnRef idx="2">
-          <a:schemeClr val="accent1"/>
-        </a:lnRef>
-        <a:fillRef idx="0">
-          <a:schemeClr val="accent1"/>
-        </a:fillRef>
-        <a:effectRef idx="1">
-          <a:schemeClr val="accent1"/>
-        </a:effectRef>
-        <a:fontRef idx="minor">
-          <a:schemeClr val="tx1"/>
-        </a:fontRef>
-      </a:style>
-    </a:lnDef>
-  </a:objectDefaults>
+  <a:objectDefaults/>
   <a:extraClrSchemeLst/>
   <a:extLst>
     <a:ext uri="{05A4C25C-085E-4340-85A3-A5531E510DB2}">
-      <thm15:themeFamily xmlns:thm15="http://schemas.microsoft.com/office/thememl/2012/main" name="Office Theme" id="{2E142A2C-CD16-42D6-873A-C26D2A0506FA}" vid="{1BDDFF52-6CD6-40A5-AB3C-68EB2F1E4D0A}"/>
+      <thm15:themeFamily xmlns:thm15="http://schemas.microsoft.com/office/thememl/2012/main" name="Office Theme" id="{62F939B6-93AF-4DB8-9C6B-D6C7DFDC589F}" vid="{4A3C46E8-61CC-4603-A589-7422A47A8E4A}"/>
     </a:ext>
   </a:extLst>
 </a:theme>

</xml_diff>